<commit_message>
M1.1: reconcile final report (M1.1 corrections, test status, git log)
</commit_message>
<xml_diff>
--- a/M1-FINAL-REPORT.docx
+++ b/M1-FINAL-REPORT.docx
@@ -32,7 +32,7 @@
           <w:color w:val="2B5C8F"/>
           <w:sz w:val="32"/>
         </w:rPr>
-        <w:t>Milestone M1 — Identity &amp; Family Profiles</w:t>
+        <w:t>Milestone M1 — Identity &amp; Family Profiles（含 M1.1 加固）</w:t>
       </w:r>
     </w:p>
     <w:p>
@@ -78,7 +78,7 @@
           <w:color w:val="1A3A6B"/>
           <w:sz w:val="24"/>
         </w:rPr>
-        <w:t>状态：✅ 完成（83/83 校验通过）</w:t>
+        <w:t>状态：✅ 完成（91/91 校验通过，含 M1.1 加固）</w:t>
       </w:r>
     </w:p>
     <w:p>
@@ -309,6 +309,34 @@
       </w:r>
     </w:p>
     <w:p>
+      <w:pPr>
+        <w:spacing w:after="80"/>
+      </w:pPr>
+      <w:r>
+        <w:rPr>
+          <w:rFonts w:ascii="宋体" w:hAnsi="宋体" w:eastAsia="宋体"/>
+          <w:b w:val="0"/>
+          <w:i w:val="0"/>
+          <w:sz w:val="24"/>
+        </w:rPr>
+        <w:t>16. M1.1 加固修正（合入 main 前）</w:t>
+      </w:r>
+    </w:p>
+    <w:p>
+      <w:pPr>
+        <w:spacing w:after="80"/>
+      </w:pPr>
+      <w:r>
+        <w:rPr>
+          <w:rFonts w:ascii="宋体" w:hAnsi="宋体" w:eastAsia="宋体"/>
+          <w:b w:val="0"/>
+          <w:i w:val="0"/>
+          <w:sz w:val="24"/>
+        </w:rPr>
+        <w:t>17. 测试状态（自动化 / DevTools 手动 / 真机）</w:t>
+      </w:r>
+    </w:p>
+    <w:p>
       <w:r>
         <w:br w:type="page"/>
       </w:r>
@@ -428,7 +456,7 @@
           <w:i w:val="0"/>
           <w:sz w:val="24"/>
         </w:rPr>
-        <w:t>自动化验收：npm run validate 共 83 项检查全部通过（M0 基线 67 + M1 新增 16）。其中「跨用户隔离（9–11）」「共享运行时打包（15a–d）」「默认档案持久化（13）」三项关键验收均通过。</w:t>
+        <w:t>自动化验收：npm run validate 共 91 项检查全部通过（M0 基线 67 + M1/M1.1 共 24）。其中「跨用户隔离」「共享运行时打包」「默认档案单一事实来源」「请求级幂等」四组关键验收均通过。</w:t>
       </w:r>
     </w:p>
     <w:p>
@@ -442,7 +470,21 @@
           <w:i w:val="0"/>
           <w:sz w:val="24"/>
         </w:rPr>
-        <w:t>结论：依据验收门槛（owner-isolation、shared-runtime packaging、default-profile persistence 必须全部通过），M1 可判定为【完成】。</w:t>
+        <w:t>M1.1 加固（合入 main 前的窄范围修正，详见第 16 节）：(1) 移除基于姓名的档案去重，改为客户端 requestId 的请求级幂等 + UI 防抖；(2) 默认档案单一事实来源——仅以 users.defaultFamilyProfileId 持久化，family_profiles 不存 isDefault，对外 isDefault 由 DTO 计算。</w:t>
+      </w:r>
+    </w:p>
+    <w:p>
+      <w:pPr>
+        <w:spacing w:after="120"/>
+      </w:pPr>
+      <w:r>
+        <w:rPr>
+          <w:rFonts w:ascii="宋体" w:hAnsi="宋体" w:eastAsia="宋体"/>
+          <w:b w:val="0"/>
+          <w:i w:val="0"/>
+          <w:sz w:val="24"/>
+        </w:rPr>
+        <w:t>结论：依据验收门槛（owner-isolation、shared-runtime packaging、default-profile single-source-of-truth、request-level idempotency 必须全部通过），M1 + M1.1 可判定为【完成】，分支具备合入 main 的条件（真机/DevTools 手动冒烟由产品负责人执行，见第 12、17 节）。</w:t>
       </w:r>
     </w:p>
     <w:p>
@@ -3942,7 +3984,7 @@
                 <w:i w:val="0"/>
                 <w:sz w:val="20"/>
               </w:rPr>
-              <w:t>姓名；trim 后非空、≤30 字符</w:t>
+              <w:t>姓名；trim 后非空、≤30 字符；不作唯一键（同一所有者可重名）</w:t>
             </w:r>
           </w:p>
         </w:tc>
@@ -4017,60 +4059,6 @@
                 <w:i w:val="0"/>
                 <w:sz w:val="20"/>
               </w:rPr>
-              <w:t>isDefault</w:t>
-            </w:r>
-          </w:p>
-        </w:tc>
-        <w:tc>
-          <w:tcPr>
-            <w:tcW w:type="dxa" w:w="3120"/>
-          </w:tcPr>
-          <w:p>
-            <w:r/>
-            <w:r>
-              <w:rPr>
-                <w:rFonts w:ascii="宋体" w:hAnsi="宋体" w:eastAsia="宋体"/>
-                <w:b w:val="0"/>
-                <w:i w:val="0"/>
-                <w:sz w:val="20"/>
-              </w:rPr>
-              <w:t>boolean?</w:t>
-            </w:r>
-          </w:p>
-        </w:tc>
-        <w:tc>
-          <w:tcPr>
-            <w:tcW w:type="dxa" w:w="3120"/>
-          </w:tcPr>
-          <w:p>
-            <w:r/>
-            <w:r>
-              <w:rPr>
-                <w:rFonts w:ascii="宋体" w:hAnsi="宋体" w:eastAsia="宋体"/>
-                <w:b w:val="0"/>
-                <w:i w:val="0"/>
-                <w:sz w:val="20"/>
-              </w:rPr>
-              <w:t>是否默认（与 users.defaultFamilyProfileId 协同维护）</w:t>
-            </w:r>
-          </w:p>
-        </w:tc>
-      </w:tr>
-      <w:tr>
-        <w:tc>
-          <w:tcPr>
-            <w:tcW w:type="dxa" w:w="3120"/>
-            <w:shd w:val="clear" w:color="auto" w:fill="EAF1F8"/>
-          </w:tcPr>
-          <w:p>
-            <w:r/>
-            <w:r>
-              <w:rPr>
-                <w:rFonts w:ascii="宋体" w:hAnsi="宋体" w:eastAsia="宋体"/>
-                <w:b w:val="0"/>
-                <w:i w:val="0"/>
-                <w:sz w:val="20"/>
-              </w:rPr>
               <w:t>createdAt / updatedAt</w:t>
             </w:r>
           </w:p>
@@ -4078,7 +4066,6 @@
         <w:tc>
           <w:tcPr>
             <w:tcW w:type="dxa" w:w="3120"/>
-            <w:shd w:val="clear" w:color="auto" w:fill="EAF1F8"/>
           </w:tcPr>
           <w:p>
             <w:r/>
@@ -4096,7 +4083,6 @@
         <w:tc>
           <w:tcPr>
             <w:tcW w:type="dxa" w:w="3120"/>
-            <w:shd w:val="clear" w:color="auto" w:fill="EAF1F8"/>
           </w:tcPr>
           <w:p>
             <w:r/>
@@ -4126,6 +4112,449 @@
           <w:sz w:val="24"/>
         </w:rPr>
         <w:t>校验规则（normalizeProfileInput）：姓名去除首尾空格、限长 30、非空；relation 必须为白名单枚举；除 name/relation 外的字段一律丢弃，ownerOpenid 由服务端写入。更新时仅 name/relation 可改，其余（尤其 ownerOpenid）不可变。档案删除不在 M1 范围，留待后续以归档/软删除实现。</w:t>
+      </w:r>
+    </w:p>
+    <w:p>
+      <w:pPr>
+        <w:spacing w:after="120"/>
+      </w:pPr>
+      <w:r>
+        <w:rPr>
+          <w:rFonts w:ascii="宋体" w:hAnsi="宋体" w:eastAsia="宋体"/>
+          <w:b w:val="0"/>
+          <w:i w:val="0"/>
+          <w:sz w:val="24"/>
+        </w:rPr>
+        <w:t>【M1.1】family_profiles 不再存储 isDefault 字段；对外 DTO 的 isDefault 由服务端按 profile.id === users.defaultFamilyProfileId 计算得出（详见第 16 节）。姓名不作唯一键，不做基于姓名的去重，同一所有者可创建重名档案。</w:t>
+      </w:r>
+    </w:p>
+    <w:p>
+      <w:pPr>
+        <w:spacing w:before="120" w:after="60"/>
+      </w:pPr>
+      <w:r>
+        <w:rPr>
+          <w:rFonts w:ascii="宋体" w:hAnsi="宋体" w:eastAsia="宋体"/>
+          <w:b/>
+          <w:i w:val="0"/>
+          <w:color w:val="2B5C8F"/>
+          <w:sz w:val="25"/>
+        </w:rPr>
+        <w:t>4.2b idempotency_keys 集合（M1.1）</w:t>
+      </w:r>
+    </w:p>
+    <w:tbl>
+      <w:tblPr>
+        <w:tblStyle w:val="TableGrid"/>
+        <w:tblW w:type="auto" w:w="0"/>
+        <w:jc w:val="center"/>
+        <w:tblLook w:firstColumn="1" w:firstRow="1" w:lastColumn="0" w:lastRow="0" w:noHBand="0" w:noVBand="1" w:val="04A0"/>
+      </w:tblPr>
+      <w:tblGrid>
+        <w:gridCol w:w="2880"/>
+        <w:gridCol w:w="2880"/>
+        <w:gridCol w:w="2880"/>
+      </w:tblGrid>
+      <w:tr>
+        <w:tc>
+          <w:tcPr>
+            <w:tcW w:type="dxa" w:w="3120"/>
+            <w:shd w:val="clear" w:color="auto" w:fill="2B5C8F"/>
+          </w:tcPr>
+          <w:p>
+            <w:r/>
+            <w:r>
+              <w:rPr>
+                <w:rFonts w:ascii="宋体" w:hAnsi="宋体" w:eastAsia="宋体"/>
+                <w:b/>
+                <w:i w:val="0"/>
+                <w:color w:val="FFFFFF"/>
+                <w:sz w:val="21"/>
+              </w:rPr>
+              <w:t>字段</w:t>
+            </w:r>
+          </w:p>
+        </w:tc>
+        <w:tc>
+          <w:tcPr>
+            <w:tcW w:type="dxa" w:w="3120"/>
+            <w:shd w:val="clear" w:color="auto" w:fill="2B5C8F"/>
+          </w:tcPr>
+          <w:p>
+            <w:r/>
+            <w:r>
+              <w:rPr>
+                <w:rFonts w:ascii="宋体" w:hAnsi="宋体" w:eastAsia="宋体"/>
+                <w:b/>
+                <w:i w:val="0"/>
+                <w:color w:val="FFFFFF"/>
+                <w:sz w:val="21"/>
+              </w:rPr>
+              <w:t>类型</w:t>
+            </w:r>
+          </w:p>
+        </w:tc>
+        <w:tc>
+          <w:tcPr>
+            <w:tcW w:type="dxa" w:w="3120"/>
+            <w:shd w:val="clear" w:color="auto" w:fill="2B5C8F"/>
+          </w:tcPr>
+          <w:p>
+            <w:r/>
+            <w:r>
+              <w:rPr>
+                <w:rFonts w:ascii="宋体" w:hAnsi="宋体" w:eastAsia="宋体"/>
+                <w:b/>
+                <w:i w:val="0"/>
+                <w:color w:val="FFFFFF"/>
+                <w:sz w:val="21"/>
+              </w:rPr>
+              <w:t>说明</w:t>
+            </w:r>
+          </w:p>
+        </w:tc>
+      </w:tr>
+      <w:tr>
+        <w:tc>
+          <w:tcPr>
+            <w:tcW w:type="dxa" w:w="3120"/>
+          </w:tcPr>
+          <w:p>
+            <w:r/>
+            <w:r>
+              <w:rPr>
+                <w:rFonts w:ascii="宋体" w:hAnsi="宋体" w:eastAsia="宋体"/>
+                <w:b w:val="0"/>
+                <w:i w:val="0"/>
+                <w:sz w:val="20"/>
+              </w:rPr>
+              <w:t>_id</w:t>
+            </w:r>
+          </w:p>
+        </w:tc>
+        <w:tc>
+          <w:tcPr>
+            <w:tcW w:type="dxa" w:w="3120"/>
+          </w:tcPr>
+          <w:p>
+            <w:r/>
+            <w:r>
+              <w:rPr>
+                <w:rFonts w:ascii="宋体" w:hAnsi="宋体" w:eastAsia="宋体"/>
+                <w:b w:val="0"/>
+                <w:i w:val="0"/>
+                <w:sz w:val="20"/>
+              </w:rPr>
+              <w:t>string</w:t>
+            </w:r>
+          </w:p>
+        </w:tc>
+        <w:tc>
+          <w:tcPr>
+            <w:tcW w:type="dxa" w:w="3120"/>
+          </w:tcPr>
+          <w:p>
+            <w:r/>
+            <w:r>
+              <w:rPr>
+                <w:rFonts w:ascii="宋体" w:hAnsi="宋体" w:eastAsia="宋体"/>
+                <w:b w:val="0"/>
+                <w:i w:val="0"/>
+                <w:sz w:val="20"/>
+              </w:rPr>
+              <w:t>记录文档 ID</w:t>
+            </w:r>
+          </w:p>
+        </w:tc>
+      </w:tr>
+      <w:tr>
+        <w:tc>
+          <w:tcPr>
+            <w:tcW w:type="dxa" w:w="3120"/>
+            <w:shd w:val="clear" w:color="auto" w:fill="EAF1F8"/>
+          </w:tcPr>
+          <w:p>
+            <w:r/>
+            <w:r>
+              <w:rPr>
+                <w:rFonts w:ascii="宋体" w:hAnsi="宋体" w:eastAsia="宋体"/>
+                <w:b w:val="0"/>
+                <w:i w:val="0"/>
+                <w:sz w:val="20"/>
+              </w:rPr>
+              <w:t>ownerOpenid</w:t>
+            </w:r>
+          </w:p>
+        </w:tc>
+        <w:tc>
+          <w:tcPr>
+            <w:tcW w:type="dxa" w:w="3120"/>
+            <w:shd w:val="clear" w:color="auto" w:fill="EAF1F8"/>
+          </w:tcPr>
+          <w:p>
+            <w:r/>
+            <w:r>
+              <w:rPr>
+                <w:rFonts w:ascii="宋体" w:hAnsi="宋体" w:eastAsia="宋体"/>
+                <w:b w:val="0"/>
+                <w:i w:val="0"/>
+                <w:sz w:val="20"/>
+              </w:rPr>
+              <w:t>string</w:t>
+            </w:r>
+          </w:p>
+        </w:tc>
+        <w:tc>
+          <w:tcPr>
+            <w:tcW w:type="dxa" w:w="3120"/>
+            <w:shd w:val="clear" w:color="auto" w:fill="EAF1F8"/>
+          </w:tcPr>
+          <w:p>
+            <w:r/>
+            <w:r>
+              <w:rPr>
+                <w:rFonts w:ascii="宋体" w:hAnsi="宋体" w:eastAsia="宋体"/>
+                <w:b w:val="0"/>
+                <w:i w:val="0"/>
+                <w:sz w:val="20"/>
+              </w:rPr>
+              <w:t>所有者 openid；仅服务端写入</w:t>
+            </w:r>
+          </w:p>
+        </w:tc>
+      </w:tr>
+      <w:tr>
+        <w:tc>
+          <w:tcPr>
+            <w:tcW w:type="dxa" w:w="3120"/>
+          </w:tcPr>
+          <w:p>
+            <w:r/>
+            <w:r>
+              <w:rPr>
+                <w:rFonts w:ascii="宋体" w:hAnsi="宋体" w:eastAsia="宋体"/>
+                <w:b w:val="0"/>
+                <w:i w:val="0"/>
+                <w:sz w:val="20"/>
+              </w:rPr>
+              <w:t>operation</w:t>
+            </w:r>
+          </w:p>
+        </w:tc>
+        <w:tc>
+          <w:tcPr>
+            <w:tcW w:type="dxa" w:w="3120"/>
+          </w:tcPr>
+          <w:p>
+            <w:r/>
+            <w:r>
+              <w:rPr>
+                <w:rFonts w:ascii="宋体" w:hAnsi="宋体" w:eastAsia="宋体"/>
+                <w:b w:val="0"/>
+                <w:i w:val="0"/>
+                <w:sz w:val="20"/>
+              </w:rPr>
+              <w:t>string</w:t>
+            </w:r>
+          </w:p>
+        </w:tc>
+        <w:tc>
+          <w:tcPr>
+            <w:tcW w:type="dxa" w:w="3120"/>
+          </w:tcPr>
+          <w:p>
+            <w:r/>
+            <w:r>
+              <w:rPr>
+                <w:rFonts w:ascii="宋体" w:hAnsi="宋体" w:eastAsia="宋体"/>
+                <w:b w:val="0"/>
+                <w:i w:val="0"/>
+                <w:sz w:val="20"/>
+              </w:rPr>
+              <w:t>逻辑操作，如 create（家庭档案）</w:t>
+            </w:r>
+          </w:p>
+        </w:tc>
+      </w:tr>
+      <w:tr>
+        <w:tc>
+          <w:tcPr>
+            <w:tcW w:type="dxa" w:w="3120"/>
+            <w:shd w:val="clear" w:color="auto" w:fill="EAF1F8"/>
+          </w:tcPr>
+          <w:p>
+            <w:r/>
+            <w:r>
+              <w:rPr>
+                <w:rFonts w:ascii="宋体" w:hAnsi="宋体" w:eastAsia="宋体"/>
+                <w:b w:val="0"/>
+                <w:i w:val="0"/>
+                <w:sz w:val="20"/>
+              </w:rPr>
+              <w:t>requestId</w:t>
+            </w:r>
+          </w:p>
+        </w:tc>
+        <w:tc>
+          <w:tcPr>
+            <w:tcW w:type="dxa" w:w="3120"/>
+            <w:shd w:val="clear" w:color="auto" w:fill="EAF1F8"/>
+          </w:tcPr>
+          <w:p>
+            <w:r/>
+            <w:r>
+              <w:rPr>
+                <w:rFonts w:ascii="宋体" w:hAnsi="宋体" w:eastAsia="宋体"/>
+                <w:b w:val="0"/>
+                <w:i w:val="0"/>
+                <w:sz w:val="20"/>
+              </w:rPr>
+              <w:t>string</w:t>
+            </w:r>
+          </w:p>
+        </w:tc>
+        <w:tc>
+          <w:tcPr>
+            <w:tcW w:type="dxa" w:w="3120"/>
+            <w:shd w:val="clear" w:color="auto" w:fill="EAF1F8"/>
+          </w:tcPr>
+          <w:p>
+            <w:r/>
+            <w:r>
+              <w:rPr>
+                <w:rFonts w:ascii="宋体" w:hAnsi="宋体" w:eastAsia="宋体"/>
+                <w:b w:val="0"/>
+                <w:i w:val="0"/>
+                <w:sz w:val="20"/>
+              </w:rPr>
+              <w:t>客户端生成的高熵 ID，一次编辑会话内稳定</w:t>
+            </w:r>
+          </w:p>
+        </w:tc>
+      </w:tr>
+      <w:tr>
+        <w:tc>
+          <w:tcPr>
+            <w:tcW w:type="dxa" w:w="3120"/>
+          </w:tcPr>
+          <w:p>
+            <w:r/>
+            <w:r>
+              <w:rPr>
+                <w:rFonts w:ascii="宋体" w:hAnsi="宋体" w:eastAsia="宋体"/>
+                <w:b w:val="0"/>
+                <w:i w:val="0"/>
+                <w:sz w:val="20"/>
+              </w:rPr>
+              <w:t>resultId</w:t>
+            </w:r>
+          </w:p>
+        </w:tc>
+        <w:tc>
+          <w:tcPr>
+            <w:tcW w:type="dxa" w:w="3120"/>
+          </w:tcPr>
+          <w:p>
+            <w:r/>
+            <w:r>
+              <w:rPr>
+                <w:rFonts w:ascii="宋体" w:hAnsi="宋体" w:eastAsia="宋体"/>
+                <w:b w:val="0"/>
+                <w:i w:val="0"/>
+                <w:sz w:val="20"/>
+              </w:rPr>
+              <w:t>string</w:t>
+            </w:r>
+          </w:p>
+        </w:tc>
+        <w:tc>
+          <w:tcPr>
+            <w:tcW w:type="dxa" w:w="3120"/>
+          </w:tcPr>
+          <w:p>
+            <w:r/>
+            <w:r>
+              <w:rPr>
+                <w:rFonts w:ascii="宋体" w:hAnsi="宋体" w:eastAsia="宋体"/>
+                <w:b w:val="0"/>
+                <w:i w:val="0"/>
+                <w:sz w:val="20"/>
+              </w:rPr>
+              <w:t>首个请求所创建实体的 _id</w:t>
+            </w:r>
+          </w:p>
+        </w:tc>
+      </w:tr>
+      <w:tr>
+        <w:tc>
+          <w:tcPr>
+            <w:tcW w:type="dxa" w:w="3120"/>
+            <w:shd w:val="clear" w:color="auto" w:fill="EAF1F8"/>
+          </w:tcPr>
+          <w:p>
+            <w:r/>
+            <w:r>
+              <w:rPr>
+                <w:rFonts w:ascii="宋体" w:hAnsi="宋体" w:eastAsia="宋体"/>
+                <w:b w:val="0"/>
+                <w:i w:val="0"/>
+                <w:sz w:val="20"/>
+              </w:rPr>
+              <w:t>createdAt</w:t>
+            </w:r>
+          </w:p>
+        </w:tc>
+        <w:tc>
+          <w:tcPr>
+            <w:tcW w:type="dxa" w:w="3120"/>
+            <w:shd w:val="clear" w:color="auto" w:fill="EAF1F8"/>
+          </w:tcPr>
+          <w:p>
+            <w:r/>
+            <w:r>
+              <w:rPr>
+                <w:rFonts w:ascii="宋体" w:hAnsi="宋体" w:eastAsia="宋体"/>
+                <w:b w:val="0"/>
+                <w:i w:val="0"/>
+                <w:sz w:val="20"/>
+              </w:rPr>
+              <w:t>number</w:t>
+            </w:r>
+          </w:p>
+        </w:tc>
+        <w:tc>
+          <w:tcPr>
+            <w:tcW w:type="dxa" w:w="3120"/>
+            <w:shd w:val="clear" w:color="auto" w:fill="EAF1F8"/>
+          </w:tcPr>
+          <w:p>
+            <w:r/>
+            <w:r>
+              <w:rPr>
+                <w:rFonts w:ascii="宋体" w:hAnsi="宋体" w:eastAsia="宋体"/>
+                <w:b w:val="0"/>
+                <w:i w:val="0"/>
+                <w:sz w:val="20"/>
+              </w:rPr>
+              <w:t>服务端时间戳</w:t>
+            </w:r>
+          </w:p>
+        </w:tc>
+      </w:tr>
+    </w:tbl>
+    <w:p/>
+    <w:p>
+      <w:pPr>
+        <w:spacing w:after="120"/>
+      </w:pPr>
+      <w:r>
+        <w:rPr>
+          <w:rFonts w:ascii="宋体" w:hAnsi="宋体" w:eastAsia="宋体"/>
+          <w:b w:val="0"/>
+          <w:i w:val="0"/>
+          <w:sz w:val="24"/>
+        </w:rPr>
+        <w:t>以三元组 (ownerOpenid, operation, requestId) 唯一标识一次逻辑意图：相同 requestId 的重复请求返回原档案（resultId），不新建；不同 requestId 视为新意图（即便姓名/关系相同）。requestId 以可信 ownerOpenid 作用域隔离，不同用户复用同一字符串不冲突。</w:t>
       </w:r>
     </w:p>
     <w:p>
@@ -4351,7 +4780,7 @@
                 <w:i w:val="0"/>
                 <w:sz w:val="20"/>
               </w:rPr>
-              <w:t>ownerOpenid</w:t>
+              <w:t>ownerOpenid + createdAt</w:t>
             </w:r>
           </w:p>
         </w:tc>
@@ -4387,7 +4816,77 @@
                 <w:i w:val="0"/>
                 <w:sz w:val="20"/>
               </w:rPr>
-              <w:t>按所有者列出/隔离档案</w:t>
+              <w:t>按所有者列出/隔离档案，确定性排序</w:t>
+            </w:r>
+          </w:p>
+        </w:tc>
+      </w:tr>
+      <w:tr>
+        <w:tc>
+          <w:tcPr>
+            <w:tcW w:type="dxa" w:w="2340"/>
+          </w:tcPr>
+          <w:p>
+            <w:r/>
+            <w:r>
+              <w:rPr>
+                <w:rFonts w:ascii="宋体" w:hAnsi="宋体" w:eastAsia="宋体"/>
+                <w:b w:val="0"/>
+                <w:i w:val="0"/>
+                <w:sz w:val="20"/>
+              </w:rPr>
+              <w:t>idempotency_keys</w:t>
+            </w:r>
+          </w:p>
+        </w:tc>
+        <w:tc>
+          <w:tcPr>
+            <w:tcW w:type="dxa" w:w="2340"/>
+          </w:tcPr>
+          <w:p>
+            <w:r/>
+            <w:r>
+              <w:rPr>
+                <w:rFonts w:ascii="宋体" w:hAnsi="宋体" w:eastAsia="宋体"/>
+                <w:b w:val="0"/>
+                <w:i w:val="0"/>
+                <w:sz w:val="20"/>
+              </w:rPr>
+              <w:t>ownerOpenid + operation + requestId</w:t>
+            </w:r>
+          </w:p>
+        </w:tc>
+        <w:tc>
+          <w:tcPr>
+            <w:tcW w:type="dxa" w:w="2340"/>
+          </w:tcPr>
+          <w:p>
+            <w:r/>
+            <w:r>
+              <w:rPr>
+                <w:rFonts w:ascii="宋体" w:hAnsi="宋体" w:eastAsia="宋体"/>
+                <w:b w:val="0"/>
+                <w:i w:val="0"/>
+                <w:sz w:val="20"/>
+              </w:rPr>
+              <w:t>复合（M3 建议改唯一）</w:t>
+            </w:r>
+          </w:p>
+        </w:tc>
+        <w:tc>
+          <w:tcPr>
+            <w:tcW w:type="dxa" w:w="2340"/>
+          </w:tcPr>
+          <w:p>
+            <w:r/>
+            <w:r>
+              <w:rPr>
+                <w:rFonts w:ascii="宋体" w:hAnsi="宋体" w:eastAsia="宋体"/>
+                <w:b w:val="0"/>
+                <w:i w:val="0"/>
+                <w:sz w:val="20"/>
+              </w:rPr>
+              <w:t>创建操作的请求级幂等</w:t>
             </w:r>
           </w:p>
         </w:tc>
@@ -4586,24 +5085,24 @@
                 <w:i w:val="0"/>
                 <w:sz w:val="20"/>
               </w:rPr>
-              <w:t>按 OPENID 列出本人档案，按 createdAt 升序</w:t>
-            </w:r>
-          </w:p>
-        </w:tc>
-        <w:tc>
-          <w:tcPr>
-            <w:tcW w:type="dxa" w:w="3120"/>
-          </w:tcPr>
-          <w:p>
-            <w:r/>
-            <w:r>
-              <w:rPr>
-                <w:rFonts w:ascii="宋体" w:hAnsi="宋体" w:eastAsia="宋体"/>
-                <w:b w:val="0"/>
-                <w:i w:val="0"/>
-                <w:sz w:val="20"/>
-              </w:rPr>
-              <w:t>id, name, relation, isDefault, createdAt</w:t>
+              <w:t>按 OPENID 列出本人档案，按 createdAt 升序；isDefault 由 DTO 计算</w:t>
+            </w:r>
+          </w:p>
+        </w:tc>
+        <w:tc>
+          <w:tcPr>
+            <w:tcW w:type="dxa" w:w="3120"/>
+          </w:tcPr>
+          <w:p>
+            <w:r/>
+            <w:r>
+              <w:rPr>
+                <w:rFonts w:ascii="宋体" w:hAnsi="宋体" w:eastAsia="宋体"/>
+                <w:b w:val="0"/>
+                <w:i w:val="0"/>
+                <w:sz w:val="20"/>
+              </w:rPr>
+              <w:t>id, name, relation, isDefault(计算), createdAt</w:t>
             </w:r>
           </w:p>
         </w:tc>
@@ -4641,7 +5140,7 @@
                 <w:i w:val="0"/>
                 <w:sz w:val="20"/>
               </w:rPr>
-              <w:t>取单条，校验归属</w:t>
+              <w:t>取单条，校验归属；isDefault 由 DTO 计算</w:t>
             </w:r>
           </w:p>
         </w:tc>
@@ -4695,24 +5194,24 @@
                 <w:i w:val="0"/>
                 <w:sz w:val="20"/>
               </w:rPr>
-              <w:t>规范化输入；服务端写 ownerOpenid；首个档案自动默认；按姓名去重</w:t>
-            </w:r>
-          </w:p>
-        </w:tc>
-        <w:tc>
-          <w:tcPr>
-            <w:tcW w:type="dxa" w:w="3120"/>
-          </w:tcPr>
-          <w:p>
-            <w:r/>
-            <w:r>
-              <w:rPr>
-                <w:rFonts w:ascii="宋体" w:hAnsi="宋体" w:eastAsia="宋体"/>
-                <w:b w:val="0"/>
-                <w:i w:val="0"/>
-                <w:sz w:val="20"/>
-              </w:rPr>
-              <w:t>返回新建档案</w:t>
+              <w:t>规范化输入；服务端写 ownerOpenid；首个档案自动默认；按 requestId 请求级幂等；不按姓名去重</w:t>
+            </w:r>
+          </w:p>
+        </w:tc>
+        <w:tc>
+          <w:tcPr>
+            <w:tcW w:type="dxa" w:w="3120"/>
+          </w:tcPr>
+          <w:p>
+            <w:r/>
+            <w:r>
+              <w:rPr>
+                <w:rFonts w:ascii="宋体" w:hAnsi="宋体" w:eastAsia="宋体"/>
+                <w:b w:val="0"/>
+                <w:i w:val="0"/>
+                <w:sz w:val="20"/>
+              </w:rPr>
+              <w:t>返回新建（或幂等命中的原）档案</w:t>
             </w:r>
           </w:p>
         </w:tc>
@@ -4804,30 +5303,44 @@
                 <w:i w:val="0"/>
                 <w:sz w:val="20"/>
               </w:rPr>
-              <w:t>校验归属；维护 user.defaultFamilyProfileId 与 profile.isDefault</w:t>
-            </w:r>
-          </w:p>
-        </w:tc>
-        <w:tc>
-          <w:tcPr>
-            <w:tcW w:type="dxa" w:w="3120"/>
-          </w:tcPr>
-          <w:p>
-            <w:r/>
-            <w:r>
-              <w:rPr>
-                <w:rFonts w:ascii="宋体" w:hAnsi="宋体" w:eastAsia="宋体"/>
-                <w:b w:val="0"/>
-                <w:i w:val="0"/>
-                <w:sz w:val="20"/>
-              </w:rPr>
-              <w:t>返回更新后档案</w:t>
+              <w:t>校验归属；仅更新 users.defaultFamilyProfileId，不改任何档案文档</w:t>
+            </w:r>
+          </w:p>
+        </w:tc>
+        <w:tc>
+          <w:tcPr>
+            <w:tcW w:type="dxa" w:w="3120"/>
+          </w:tcPr>
+          <w:p>
+            <w:r/>
+            <w:r>
+              <w:rPr>
+                <w:rFonts w:ascii="宋体" w:hAnsi="宋体" w:eastAsia="宋体"/>
+                <w:b w:val="0"/>
+                <w:i w:val="0"/>
+                <w:sz w:val="20"/>
+              </w:rPr>
+              <w:t>返回目标档案（isDefault 计算为 true）</w:t>
             </w:r>
           </w:p>
         </w:tc>
       </w:tr>
     </w:tbl>
     <w:p/>
+    <w:p>
+      <w:pPr>
+        <w:spacing w:after="120"/>
+      </w:pPr>
+      <w:r>
+        <w:rPr>
+          <w:rFonts w:ascii="宋体" w:hAnsi="宋体" w:eastAsia="宋体"/>
+          <w:b w:val="0"/>
+          <w:i w:val="0"/>
+          <w:sz w:val="24"/>
+        </w:rPr>
+        <w:t>【M1.1】create 携带 event.requestId，服务端以 (ownerOpenid, 'create', requestId) 查 idempotency_keys：命中则返回原档案，未命中则创建并记录键；不再进行基于姓名的去重。isDefault 一律由 DTO 计算（profile.id === user.defaultFamilyProfileId），服务端不持久化该字段。</w:t>
+      </w:r>
+    </w:p>
     <w:p>
       <w:pPr>
         <w:spacing w:after="120"/>
@@ -5533,7 +6046,7 @@
                 <w:i w:val="0"/>
                 <w:sz w:val="20"/>
               </w:rPr>
-              <w:t>客户端按钮防重（in-flight 标记）；服务端按姓名去重，保证幂等</w:t>
+              <w:t>客户端按钮防重（in-flight 标记）；服务端按 requestId 请求级幂等（不按姓名去重），保证同一意图不重复创建</w:t>
             </w:r>
           </w:p>
         </w:tc>
@@ -5553,7 +6066,7 @@
                 <w:i w:val="0"/>
                 <w:sz w:val="20"/>
               </w:rPr>
-              <w:t>姓名为空/纯空格</w:t>
+              <w:t>同名档案（不同意图）</w:t>
             </w:r>
           </w:p>
         </w:tc>
@@ -5571,7 +6084,7 @@
                 <w:i w:val="0"/>
                 <w:sz w:val="20"/>
               </w:rPr>
-              <w:t>客户端校验 + 服务端 rejection（validation）</w:t>
+              <w:t>允许创建（不同 requestId）；姓名非唯一键</w:t>
             </w:r>
           </w:p>
         </w:tc>
@@ -5590,7 +6103,7 @@
                 <w:i w:val="0"/>
                 <w:sz w:val="20"/>
               </w:rPr>
-              <w:t>关系非法</w:t>
+              <w:t>姓名为空/纯空格</w:t>
             </w:r>
           </w:p>
         </w:tc>
@@ -5607,7 +6120,7 @@
                 <w:i w:val="0"/>
                 <w:sz w:val="20"/>
               </w:rPr>
-              <w:t>选择器限定枚举；服务端拒绝</w:t>
+              <w:t>客户端校验 + 服务端 rejection（validation）</w:t>
             </w:r>
           </w:p>
         </w:tc>
@@ -5627,7 +6140,7 @@
                 <w:i w:val="0"/>
                 <w:sz w:val="20"/>
               </w:rPr>
-              <w:t>本地 ID 失效（档案已删）</w:t>
+              <w:t>关系非法</w:t>
             </w:r>
           </w:p>
         </w:tc>
@@ -5645,7 +6158,81 @@
                 <w:i w:val="0"/>
                 <w:sz w:val="20"/>
               </w:rPr>
+              <w:t>选择器限定枚举；服务端拒绝</w:t>
+            </w:r>
+          </w:p>
+        </w:tc>
+      </w:tr>
+      <w:tr>
+        <w:tc>
+          <w:tcPr>
+            <w:tcW w:type="dxa" w:w="4680"/>
+          </w:tcPr>
+          <w:p>
+            <w:r/>
+            <w:r>
+              <w:rPr>
+                <w:rFonts w:ascii="宋体" w:hAnsi="宋体" w:eastAsia="宋体"/>
+                <w:b w:val="0"/>
+                <w:i w:val="0"/>
+                <w:sz w:val="20"/>
+              </w:rPr>
+              <w:t>本地 ID 失效（档案已删）</w:t>
+            </w:r>
+          </w:p>
+        </w:tc>
+        <w:tc>
+          <w:tcPr>
+            <w:tcW w:type="dxa" w:w="4680"/>
+          </w:tcPr>
+          <w:p>
+            <w:r/>
+            <w:r>
+              <w:rPr>
+                <w:rFonts w:ascii="宋体" w:hAnsi="宋体" w:eastAsia="宋体"/>
+                <w:b w:val="0"/>
+                <w:i w:val="0"/>
+                <w:sz w:val="20"/>
+              </w:rPr>
               <w:t>resolveActiveProfile 回退至服务端默认 → 首个 → 引导</w:t>
+            </w:r>
+          </w:p>
+        </w:tc>
+      </w:tr>
+      <w:tr>
+        <w:tc>
+          <w:tcPr>
+            <w:tcW w:type="dxa" w:w="4680"/>
+            <w:shd w:val="clear" w:color="auto" w:fill="EAF1F8"/>
+          </w:tcPr>
+          <w:p>
+            <w:r/>
+            <w:r>
+              <w:rPr>
+                <w:rFonts w:ascii="宋体" w:hAnsi="宋体" w:eastAsia="宋体"/>
+                <w:b w:val="0"/>
+                <w:i w:val="0"/>
+                <w:sz w:val="20"/>
+              </w:rPr>
+              <w:t>默认 ID 失效/悬挂</w:t>
+            </w:r>
+          </w:p>
+        </w:tc>
+        <w:tc>
+          <w:tcPr>
+            <w:tcW w:type="dxa" w:w="4680"/>
+            <w:shd w:val="clear" w:color="auto" w:fill="EAF1F8"/>
+          </w:tcPr>
+          <w:p>
+            <w:r/>
+            <w:r>
+              <w:rPr>
+                <w:rFonts w:ascii="宋体" w:hAnsi="宋体" w:eastAsia="宋体"/>
+                <w:b w:val="0"/>
+                <w:i w:val="0"/>
+                <w:sz w:val="20"/>
+              </w:rPr>
+              <w:t>无档案被标记为默认（安全回退，无需数据修复）</w:t>
             </w:r>
           </w:p>
         </w:tc>
@@ -5752,7 +6339,7 @@
           <w:i w:val="0"/>
           <w:sz w:val="24"/>
         </w:rPr>
-        <w:t>npm run validate 串联 typecheck 与 83 项检查：M0 基线 67 + M1 新增 16，0 失败。M1 十六项分组如下：</w:t>
+        <w:t>npm run validate 串联 typecheck 与 91 项检查：M0 基线 67 + M1/M1.1 共 24，0 失败。已执行（本次 M1.1 提交前）实测通过。分组如下（14a–15f 为 M1.1 新增/调整）：</w:t>
       </w:r>
     </w:p>
     <w:tbl>
@@ -6184,7 +6771,7 @@
                 <w:i w:val="0"/>
                 <w:sz w:val="20"/>
               </w:rPr>
-              <w:t>未知字段不持久化（ownerOpenid 服务端写，额外字段丢弃）</w:t>
+              <w:t>未知字段不持久化</w:t>
             </w:r>
           </w:p>
         </w:tc>
@@ -6439,7 +7026,7 @@
                 <w:i w:val="0"/>
                 <w:sz w:val="20"/>
               </w:rPr>
-              <w:t>12a</w:t>
+              <w:t>12a–c</w:t>
             </w:r>
           </w:p>
         </w:tc>
@@ -6457,7 +7044,7 @@
                 <w:i w:val="0"/>
                 <w:sz w:val="20"/>
               </w:rPr>
-              <w:t>失效本地 ID → 服务端默认</w:t>
+              <w:t>活动档案回退（服务端默认 / 首个 / 引导）</w:t>
             </w:r>
           </w:p>
         </w:tc>
@@ -6475,7 +7062,7 @@
                 <w:i w:val="0"/>
                 <w:sz w:val="20"/>
               </w:rPr>
-              <w:t>活动档案回退</w:t>
+              <w:t>回退</w:t>
             </w:r>
           </w:p>
         </w:tc>
@@ -6494,41 +7081,41 @@
                 <w:i w:val="0"/>
                 <w:sz w:val="20"/>
               </w:rPr>
-              <w:t>12b</w:t>
-            </w:r>
-          </w:p>
-        </w:tc>
-        <w:tc>
-          <w:tcPr>
-            <w:tcW w:type="dxa" w:w="3120"/>
-          </w:tcPr>
-          <w:p>
-            <w:r/>
-            <w:r>
-              <w:rPr>
-                <w:rFonts w:ascii="宋体" w:hAnsi="宋体" w:eastAsia="宋体"/>
-                <w:b w:val="0"/>
-                <w:i w:val="0"/>
-                <w:sz w:val="20"/>
-              </w:rPr>
-              <w:t>失效本地 ID → 首个档案</w:t>
-            </w:r>
-          </w:p>
-        </w:tc>
-        <w:tc>
-          <w:tcPr>
-            <w:tcW w:type="dxa" w:w="3120"/>
-          </w:tcPr>
-          <w:p>
-            <w:r/>
-            <w:r>
-              <w:rPr>
-                <w:rFonts w:ascii="宋体" w:hAnsi="宋体" w:eastAsia="宋体"/>
-                <w:b w:val="0"/>
-                <w:i w:val="0"/>
-                <w:sz w:val="20"/>
-              </w:rPr>
-              <w:t>活动档案回退</w:t>
+              <w:t>13</w:t>
+            </w:r>
+          </w:p>
+        </w:tc>
+        <w:tc>
+          <w:tcPr>
+            <w:tcW w:type="dxa" w:w="3120"/>
+          </w:tcPr>
+          <w:p>
+            <w:r/>
+            <w:r>
+              <w:rPr>
+                <w:rFonts w:ascii="宋体" w:hAnsi="宋体" w:eastAsia="宋体"/>
+                <w:b w:val="0"/>
+                <w:i w:val="0"/>
+                <w:sz w:val="20"/>
+              </w:rPr>
+              <w:t>默认在重新登录后持久化</w:t>
+            </w:r>
+          </w:p>
+        </w:tc>
+        <w:tc>
+          <w:tcPr>
+            <w:tcW w:type="dxa" w:w="3120"/>
+          </w:tcPr>
+          <w:p>
+            <w:r/>
+            <w:r>
+              <w:rPr>
+                <w:rFonts w:ascii="宋体" w:hAnsi="宋体" w:eastAsia="宋体"/>
+                <w:b w:val="0"/>
+                <w:i w:val="0"/>
+                <w:sz w:val="20"/>
+              </w:rPr>
+              <w:t>持久化</w:t>
             </w:r>
           </w:p>
         </w:tc>
@@ -6548,7 +7135,7 @@
                 <w:i w:val="0"/>
                 <w:sz w:val="20"/>
               </w:rPr>
-              <w:t>12c</w:t>
+              <w:t>14a</w:t>
             </w:r>
           </w:p>
         </w:tc>
@@ -6566,7 +7153,7 @@
                 <w:i w:val="0"/>
                 <w:sz w:val="20"/>
               </w:rPr>
-              <w:t>无档案 → 引导（undefined）</w:t>
+              <w:t>同名 + 不同 requestId → 两条不同档案</w:t>
             </w:r>
           </w:p>
         </w:tc>
@@ -6584,7 +7171,7 @@
                 <w:i w:val="0"/>
                 <w:sz w:val="20"/>
               </w:rPr>
-              <w:t>活动档案回退</w:t>
+              <w:t>幂等(M1.1)</w:t>
             </w:r>
           </w:p>
         </w:tc>
@@ -6603,41 +7190,41 @@
                 <w:i w:val="0"/>
                 <w:sz w:val="20"/>
               </w:rPr>
-              <w:t>13</w:t>
-            </w:r>
-          </w:p>
-        </w:tc>
-        <w:tc>
-          <w:tcPr>
-            <w:tcW w:type="dxa" w:w="3120"/>
-          </w:tcPr>
-          <w:p>
-            <w:r/>
-            <w:r>
-              <w:rPr>
-                <w:rFonts w:ascii="宋体" w:hAnsi="宋体" w:eastAsia="宋体"/>
-                <w:b w:val="0"/>
-                <w:i w:val="0"/>
-                <w:sz w:val="20"/>
-              </w:rPr>
-              <w:t>默认在重新登录后持久化</w:t>
-            </w:r>
-          </w:p>
-        </w:tc>
-        <w:tc>
-          <w:tcPr>
-            <w:tcW w:type="dxa" w:w="3120"/>
-          </w:tcPr>
-          <w:p>
-            <w:r/>
-            <w:r>
-              <w:rPr>
-                <w:rFonts w:ascii="宋体" w:hAnsi="宋体" w:eastAsia="宋体"/>
-                <w:b w:val="0"/>
-                <w:i w:val="0"/>
-                <w:sz w:val="20"/>
-              </w:rPr>
-              <w:t>持久化</w:t>
+              <w:t>14b</w:t>
+            </w:r>
+          </w:p>
+        </w:tc>
+        <w:tc>
+          <w:tcPr>
+            <w:tcW w:type="dxa" w:w="3120"/>
+          </w:tcPr>
+          <w:p>
+            <w:r/>
+            <w:r>
+              <w:rPr>
+                <w:rFonts w:ascii="宋体" w:hAnsi="宋体" w:eastAsia="宋体"/>
+                <w:b w:val="0"/>
+                <w:i w:val="0"/>
+                <w:sz w:val="20"/>
+              </w:rPr>
+              <w:t>相同 requestId → 返回同一档案（不重复）</w:t>
+            </w:r>
+          </w:p>
+        </w:tc>
+        <w:tc>
+          <w:tcPr>
+            <w:tcW w:type="dxa" w:w="3120"/>
+          </w:tcPr>
+          <w:p>
+            <w:r/>
+            <w:r>
+              <w:rPr>
+                <w:rFonts w:ascii="宋体" w:hAnsi="宋体" w:eastAsia="宋体"/>
+                <w:b w:val="0"/>
+                <w:i w:val="0"/>
+                <w:sz w:val="20"/>
+              </w:rPr>
+              <w:t>幂等(M1.1)</w:t>
             </w:r>
           </w:p>
         </w:tc>
@@ -6657,7 +7244,7 @@
                 <w:i w:val="0"/>
                 <w:sz w:val="20"/>
               </w:rPr>
-              <w:t>14</w:t>
+              <w:t>14c</w:t>
             </w:r>
           </w:p>
         </w:tc>
@@ -6675,7 +7262,7 @@
                 <w:i w:val="0"/>
                 <w:sz w:val="20"/>
               </w:rPr>
-              <w:t>重复提交返回同一档案（不重复）</w:t>
+              <w:t>不同用户复用同一 requestId 不冲突</w:t>
             </w:r>
           </w:p>
         </w:tc>
@@ -6693,7 +7280,7 @@
                 <w:i w:val="0"/>
                 <w:sz w:val="20"/>
               </w:rPr>
-              <w:t>幂等</w:t>
+              <w:t>幂等(M1.1)</w:t>
             </w:r>
           </w:p>
         </w:tc>
@@ -6712,41 +7299,41 @@
                 <w:i w:val="0"/>
                 <w:sz w:val="20"/>
               </w:rPr>
-              <w:t>15a–d</w:t>
-            </w:r>
-          </w:p>
-        </w:tc>
-        <w:tc>
-          <w:tcPr>
-            <w:tcW w:type="dxa" w:w="3120"/>
-          </w:tcPr>
-          <w:p>
-            <w:r/>
-            <w:r>
-              <w:rPr>
-                <w:rFonts w:ascii="宋体" w:hAnsi="宋体" w:eastAsia="宋体"/>
-                <w:b w:val="0"/>
-                <w:i w:val="0"/>
-                <w:sz w:val="20"/>
-              </w:rPr>
-              <w:t>共享运行时已打包进 login/profileApi 且被引用</w:t>
-            </w:r>
-          </w:p>
-        </w:tc>
-        <w:tc>
-          <w:tcPr>
-            <w:tcW w:type="dxa" w:w="3120"/>
-          </w:tcPr>
-          <w:p>
-            <w:r/>
-            <w:r>
-              <w:rPr>
-                <w:rFonts w:ascii="宋体" w:hAnsi="宋体" w:eastAsia="宋体"/>
-                <w:b w:val="0"/>
-                <w:i w:val="0"/>
-                <w:sz w:val="20"/>
-              </w:rPr>
-              <w:t>打包</w:t>
+              <w:t>15a</w:t>
+            </w:r>
+          </w:p>
+        </w:tc>
+        <w:tc>
+          <w:tcPr>
+            <w:tcW w:type="dxa" w:w="3120"/>
+          </w:tcPr>
+          <w:p>
+            <w:r/>
+            <w:r>
+              <w:rPr>
+                <w:rFonts w:ascii="宋体" w:hAnsi="宋体" w:eastAsia="宋体"/>
+                <w:b w:val="0"/>
+                <w:i w:val="0"/>
+                <w:sz w:val="20"/>
+              </w:rPr>
+              <w:t>family_profiles 不持久化 isDefault</w:t>
+            </w:r>
+          </w:p>
+        </w:tc>
+        <w:tc>
+          <w:tcPr>
+            <w:tcW w:type="dxa" w:w="3120"/>
+          </w:tcPr>
+          <w:p>
+            <w:r/>
+            <w:r>
+              <w:rPr>
+                <w:rFonts w:ascii="宋体" w:hAnsi="宋体" w:eastAsia="宋体"/>
+                <w:b w:val="0"/>
+                <w:i w:val="0"/>
+                <w:sz w:val="20"/>
+              </w:rPr>
+              <w:t>默认SSoT(M1.1)</w:t>
             </w:r>
           </w:p>
         </w:tc>
@@ -6766,7 +7353,7 @@
                 <w:i w:val="0"/>
                 <w:sz w:val="20"/>
               </w:rPr>
-              <w:t>—</w:t>
+              <w:t>15b</w:t>
             </w:r>
           </w:p>
         </w:tc>
@@ -6784,7 +7371,7 @@
                 <w:i w:val="0"/>
                 <w:sz w:val="20"/>
               </w:rPr>
-              <w:t>gitignore 忽略生成运行时；生成物确被忽略</w:t>
+              <w:t>DTO 由 users.defaultFamilyProfileId 计算 isDefault</w:t>
             </w:r>
           </w:p>
         </w:tc>
@@ -6802,7 +7389,7 @@
                 <w:i w:val="0"/>
                 <w:sz w:val="20"/>
               </w:rPr>
-              <w:t>打包</w:t>
+              <w:t>默认SSoT(M1.1)</w:t>
             </w:r>
           </w:p>
         </w:tc>
@@ -6821,7 +7408,334 @@
                 <w:i w:val="0"/>
                 <w:sz w:val="20"/>
               </w:rPr>
+              <w:t>15c</w:t>
+            </w:r>
+          </w:p>
+        </w:tc>
+        <w:tc>
+          <w:tcPr>
+            <w:tcW w:type="dxa" w:w="3120"/>
+          </w:tcPr>
+          <w:p>
+            <w:r/>
+            <w:r>
+              <w:rPr>
+                <w:rFonts w:ascii="宋体" w:hAnsi="宋体" w:eastAsia="宋体"/>
+                <w:b w:val="0"/>
+                <w:i w:val="0"/>
+                <w:sz w:val="20"/>
+              </w:rPr>
+              <w:t>返回列表中恰有一个默认</w:t>
+            </w:r>
+          </w:p>
+        </w:tc>
+        <w:tc>
+          <w:tcPr>
+            <w:tcW w:type="dxa" w:w="3120"/>
+          </w:tcPr>
+          <w:p>
+            <w:r/>
+            <w:r>
+              <w:rPr>
+                <w:rFonts w:ascii="宋体" w:hAnsi="宋体" w:eastAsia="宋体"/>
+                <w:b w:val="0"/>
+                <w:i w:val="0"/>
+                <w:sz w:val="20"/>
+              </w:rPr>
+              <w:t>默认SSoT(M1.1)</w:t>
+            </w:r>
+          </w:p>
+        </w:tc>
+      </w:tr>
+      <w:tr>
+        <w:tc>
+          <w:tcPr>
+            <w:tcW w:type="dxa" w:w="3120"/>
+            <w:shd w:val="clear" w:color="auto" w:fill="EAF1F8"/>
+          </w:tcPr>
+          <w:p>
+            <w:r/>
+            <w:r>
+              <w:rPr>
+                <w:rFonts w:ascii="宋体" w:hAnsi="宋体" w:eastAsia="宋体"/>
+                <w:b w:val="0"/>
+                <w:i w:val="0"/>
+                <w:sz w:val="20"/>
+              </w:rPr>
+              <w:t>15d</w:t>
+            </w:r>
+          </w:p>
+        </w:tc>
+        <w:tc>
+          <w:tcPr>
+            <w:tcW w:type="dxa" w:w="3120"/>
+            <w:shd w:val="clear" w:color="auto" w:fill="EAF1F8"/>
+          </w:tcPr>
+          <w:p>
+            <w:r/>
+            <w:r>
+              <w:rPr>
+                <w:rFonts w:ascii="宋体" w:hAnsi="宋体" w:eastAsia="宋体"/>
+                <w:b w:val="0"/>
+                <w:i w:val="0"/>
+                <w:sz w:val="20"/>
+              </w:rPr>
+              <w:t>切换默认不改写任何档案文档</w:t>
+            </w:r>
+          </w:p>
+        </w:tc>
+        <w:tc>
+          <w:tcPr>
+            <w:tcW w:type="dxa" w:w="3120"/>
+            <w:shd w:val="clear" w:color="auto" w:fill="EAF1F8"/>
+          </w:tcPr>
+          <w:p>
+            <w:r/>
+            <w:r>
+              <w:rPr>
+                <w:rFonts w:ascii="宋体" w:hAnsi="宋体" w:eastAsia="宋体"/>
+                <w:b w:val="0"/>
+                <w:i w:val="0"/>
+                <w:sz w:val="20"/>
+              </w:rPr>
+              <w:t>默认SSoT(M1.1)</w:t>
+            </w:r>
+          </w:p>
+        </w:tc>
+      </w:tr>
+      <w:tr>
+        <w:tc>
+          <w:tcPr>
+            <w:tcW w:type="dxa" w:w="3120"/>
+          </w:tcPr>
+          <w:p>
+            <w:r/>
+            <w:r>
+              <w:rPr>
+                <w:rFonts w:ascii="宋体" w:hAnsi="宋体" w:eastAsia="宋体"/>
+                <w:b w:val="0"/>
+                <w:i w:val="0"/>
+                <w:sz w:val="20"/>
+              </w:rPr>
+              <w:t>15e</w:t>
+            </w:r>
+          </w:p>
+        </w:tc>
+        <w:tc>
+          <w:tcPr>
+            <w:tcW w:type="dxa" w:w="3120"/>
+          </w:tcPr>
+          <w:p>
+            <w:r/>
+            <w:r>
+              <w:rPr>
+                <w:rFonts w:ascii="宋体" w:hAnsi="宋体" w:eastAsia="宋体"/>
+                <w:b w:val="0"/>
+                <w:i w:val="0"/>
+                <w:sz w:val="20"/>
+              </w:rPr>
+              <w:t>设新默认改变计算出的 isDefault</w:t>
+            </w:r>
+          </w:p>
+        </w:tc>
+        <w:tc>
+          <w:tcPr>
+            <w:tcW w:type="dxa" w:w="3120"/>
+          </w:tcPr>
+          <w:p>
+            <w:r/>
+            <w:r>
+              <w:rPr>
+                <w:rFonts w:ascii="宋体" w:hAnsi="宋体" w:eastAsia="宋体"/>
+                <w:b w:val="0"/>
+                <w:i w:val="0"/>
+                <w:sz w:val="20"/>
+              </w:rPr>
+              <w:t>默认SSoT(M1.1)</w:t>
+            </w:r>
+          </w:p>
+        </w:tc>
+      </w:tr>
+      <w:tr>
+        <w:tc>
+          <w:tcPr>
+            <w:tcW w:type="dxa" w:w="3120"/>
+            <w:shd w:val="clear" w:color="auto" w:fill="EAF1F8"/>
+          </w:tcPr>
+          <w:p>
+            <w:r/>
+            <w:r>
+              <w:rPr>
+                <w:rFonts w:ascii="宋体" w:hAnsi="宋体" w:eastAsia="宋体"/>
+                <w:b w:val="0"/>
+                <w:i w:val="0"/>
+                <w:sz w:val="20"/>
+              </w:rPr>
+              <w:t>15f</w:t>
+            </w:r>
+          </w:p>
+        </w:tc>
+        <w:tc>
+          <w:tcPr>
+            <w:tcW w:type="dxa" w:w="3120"/>
+            <w:shd w:val="clear" w:color="auto" w:fill="EAF1F8"/>
+          </w:tcPr>
+          <w:p>
+            <w:r/>
+            <w:r>
+              <w:rPr>
+                <w:rFonts w:ascii="宋体" w:hAnsi="宋体" w:eastAsia="宋体"/>
+                <w:b w:val="0"/>
+                <w:i w:val="0"/>
+                <w:sz w:val="20"/>
+              </w:rPr>
+              <w:t>悬挂/缺失默认 ID → 无档案标记默认（安全回退）</w:t>
+            </w:r>
+          </w:p>
+        </w:tc>
+        <w:tc>
+          <w:tcPr>
+            <w:tcW w:type="dxa" w:w="3120"/>
+            <w:shd w:val="clear" w:color="auto" w:fill="EAF1F8"/>
+          </w:tcPr>
+          <w:p>
+            <w:r/>
+            <w:r>
+              <w:rPr>
+                <w:rFonts w:ascii="宋体" w:hAnsi="宋体" w:eastAsia="宋体"/>
+                <w:b w:val="0"/>
+                <w:i w:val="0"/>
+                <w:sz w:val="20"/>
+              </w:rPr>
+              <w:t>默认SSoT(M1.1)</w:t>
+            </w:r>
+          </w:p>
+        </w:tc>
+      </w:tr>
+      <w:tr>
+        <w:tc>
+          <w:tcPr>
+            <w:tcW w:type="dxa" w:w="3120"/>
+          </w:tcPr>
+          <w:p>
+            <w:r/>
+            <w:r>
+              <w:rPr>
+                <w:rFonts w:ascii="宋体" w:hAnsi="宋体" w:eastAsia="宋体"/>
+                <w:b w:val="0"/>
+                <w:i w:val="0"/>
+                <w:sz w:val="20"/>
+              </w:rPr>
+              <w:t>16a–d</w:t>
+            </w:r>
+          </w:p>
+        </w:tc>
+        <w:tc>
+          <w:tcPr>
+            <w:tcW w:type="dxa" w:w="3120"/>
+          </w:tcPr>
+          <w:p>
+            <w:r/>
+            <w:r>
+              <w:rPr>
+                <w:rFonts w:ascii="宋体" w:hAnsi="宋体" w:eastAsia="宋体"/>
+                <w:b w:val="0"/>
+                <w:i w:val="0"/>
+                <w:sz w:val="20"/>
+              </w:rPr>
+              <w:t>共享运行时已打包进 login/profileApi 且被引用</w:t>
+            </w:r>
+          </w:p>
+        </w:tc>
+        <w:tc>
+          <w:tcPr>
+            <w:tcW w:type="dxa" w:w="3120"/>
+          </w:tcPr>
+          <w:p>
+            <w:r/>
+            <w:r>
+              <w:rPr>
+                <w:rFonts w:ascii="宋体" w:hAnsi="宋体" w:eastAsia="宋体"/>
+                <w:b w:val="0"/>
+                <w:i w:val="0"/>
+                <w:sz w:val="20"/>
+              </w:rPr>
+              <w:t>打包</w:t>
+            </w:r>
+          </w:p>
+        </w:tc>
+      </w:tr>
+      <w:tr>
+        <w:tc>
+          <w:tcPr>
+            <w:tcW w:type="dxa" w:w="3120"/>
+            <w:shd w:val="clear" w:color="auto" w:fill="EAF1F8"/>
+          </w:tcPr>
+          <w:p>
+            <w:r/>
+            <w:r>
+              <w:rPr>
+                <w:rFonts w:ascii="宋体" w:hAnsi="宋体" w:eastAsia="宋体"/>
+                <w:b w:val="0"/>
+                <w:i w:val="0"/>
+                <w:sz w:val="20"/>
+              </w:rPr>
               <w:t>—</w:t>
+            </w:r>
+          </w:p>
+        </w:tc>
+        <w:tc>
+          <w:tcPr>
+            <w:tcW w:type="dxa" w:w="3120"/>
+            <w:shd w:val="clear" w:color="auto" w:fill="EAF1F8"/>
+          </w:tcPr>
+          <w:p>
+            <w:r/>
+            <w:r>
+              <w:rPr>
+                <w:rFonts w:ascii="宋体" w:hAnsi="宋体" w:eastAsia="宋体"/>
+                <w:b w:val="0"/>
+                <w:i w:val="0"/>
+                <w:sz w:val="20"/>
+              </w:rPr>
+              <w:t>gitignore 忽略生成运行时；生成物确被忽略</w:t>
+            </w:r>
+          </w:p>
+        </w:tc>
+        <w:tc>
+          <w:tcPr>
+            <w:tcW w:type="dxa" w:w="3120"/>
+            <w:shd w:val="clear" w:color="auto" w:fill="EAF1F8"/>
+          </w:tcPr>
+          <w:p>
+            <w:r/>
+            <w:r>
+              <w:rPr>
+                <w:rFonts w:ascii="宋体" w:hAnsi="宋体" w:eastAsia="宋体"/>
+                <w:b w:val="0"/>
+                <w:i w:val="0"/>
+                <w:sz w:val="20"/>
+              </w:rPr>
+              <w:t>打包</w:t>
+            </w:r>
+          </w:p>
+        </w:tc>
+      </w:tr>
+      <w:tr>
+        <w:tc>
+          <w:tcPr>
+            <w:tcW w:type="dxa" w:w="3120"/>
+          </w:tcPr>
+          <w:p>
+            <w:r/>
+            <w:r>
+              <w:rPr>
+                <w:rFonts w:ascii="宋体" w:hAnsi="宋体" w:eastAsia="宋体"/>
+                <w:b w:val="0"/>
+                <w:i w:val="0"/>
+                <w:sz w:val="20"/>
+              </w:rPr>
+              <w:t>17</w:t>
             </w:r>
           </w:p>
         </w:tc>
@@ -6873,7 +7787,7 @@
           <w:i w:val="0"/>
           <w:sz w:val="24"/>
         </w:rPr>
-        <w:t>结论：跨用户隔离（9–11）、共享运行时打包（15a–d）、默认档案持久化（13）三项关键验收全部通过，故 M1 可判定完成。</w:t>
+        <w:t>结论：跨用户隔离（9–11）、请求级幂等（14a–c）、默认档案单一事实来源（15a–f）、共享运行时打包（16a–d）全部通过，M1 + M1.1 关键验收达成。</w:t>
       </w:r>
     </w:p>
     <w:p>
@@ -6902,7 +7816,7 @@
           <w:i w:val="0"/>
           <w:sz w:val="24"/>
         </w:rPr>
-        <w:t>详见 docs/MANUAL_TEST_CHECKLIST.md。要点：</w:t>
+        <w:t>详见 docs/MANUAL_TEST_CHECKLIST.md。测试状态严格区分「自动化 / DevTools 手动 / 真机」，详见第 17 节。要点：</w:t>
       </w:r>
     </w:p>
     <w:p>
@@ -6917,7 +7831,7 @@
           <w:i w:val="0"/>
           <w:sz w:val="24"/>
         </w:rPr>
-        <w:t>A. DevTools：首次运行进入引导；创建一个档案后自动默认；再建第二个；切换默认；编辑；选择活动档案；重新编译后默认仍生效；提交空姓名/非法关系被拒；连续点击提交不重复创建。</w:t>
+        <w:t>A. DevTools（状态：待产品负责人执行）：首次运行进入引导；创建档案后自动默认；再建第二个；切换默认；编辑；选择活动档案；重新编译后默认仍生效；提交空姓名/非法关系被拒；连续点击提交不重复创建；【M1.1】故意创建两条重名档案应均成功。</w:t>
       </w:r>
     </w:p>
     <w:p>
@@ -6932,7 +7846,7 @@
           <w:i w:val="0"/>
           <w:sz w:val="24"/>
         </w:rPr>
-        <w:t>B. 真机：上述流程在手机端复现；离线时首页横幅正确；本地 ID 失效回退正确。</w:t>
+        <w:t>B. 真机（状态：待产品负责人执行）：上述流程在手机端复现；离线时首页横幅正确；本地 ID 失效回退正确。</w:t>
       </w:r>
     </w:p>
     <w:p>
@@ -6946,7 +7860,7 @@
           <w:i w:val="0"/>
           <w:sz w:val="24"/>
         </w:rPr>
-        <w:t>注：单设备上难以实测「跨账户隔离」，该路径由自动化测试（9–11）覆盖，真机仅做冒烟。</w:t>
+        <w:t>注：单设备上难以实测「跨账户隔离」，该路径由自动化测试（9–11）覆盖，真机仅做冒烟。DevTools 与真机测试需在装有微信开发者工具/真机的环境中由人工执行，当前自动化环境无法代为运行（见第 17 节步骤）。</w:t>
       </w:r>
     </w:p>
     <w:p>
@@ -7116,6 +8030,21 @@
     </w:p>
     <w:p>
       <w:pPr>
+        <w:pStyle w:val="ListBullet"/>
+        <w:spacing w:after="60"/>
+      </w:pPr>
+      <w:r>
+        <w:rPr>
+          <w:rFonts w:ascii="宋体" w:hAnsi="宋体" w:eastAsia="宋体"/>
+          <w:b w:val="0"/>
+          <w:i w:val="0"/>
+          <w:sz w:val="24"/>
+        </w:rPr>
+        <w:t>【M1.1】DATA_MODEL / ARCHITECTURE / USER_FLOWS / SECURITY：新增 idempotency_keys 集合与索引、requestId 幂等契约与残留竞态说明及 M3 通用设计、默认档案单一事实来源（isDefault 由 DTO 计算、不持久化）、移除姓名去重（允许重名）。</w:t>
+      </w:r>
+    </w:p>
+    <w:p>
+      <w:pPr>
         <w:spacing w:before="120" w:after="60"/>
       </w:pPr>
       <w:r>
@@ -7230,7 +8159,742 @@
           <w:i w:val="0"/>
           <w:sz w:val="24"/>
         </w:rPr>
-        <w:t>分支：feature/m1-identity-family-profiles，自干净的 M0 基线（cc698c2）切出。</w:t>
+        <w:t>分支：feature/m1-identity-family-profiles，自干净的 M0 基线（cc698c2）切出。以下为 git log --oneline cc698c2..HEAD 的实际记录（与仓库一致，未编造/未 squash）：</w:t>
+      </w:r>
+    </w:p>
+    <w:p>
+      <w:pPr>
+        <w:spacing w:before="120" w:after="60"/>
+      </w:pPr>
+      <w:r>
+        <w:rPr>
+          <w:rFonts w:ascii="宋体" w:hAnsi="宋体" w:eastAsia="宋体"/>
+          <w:b/>
+          <w:i w:val="0"/>
+          <w:color w:val="2B5C8F"/>
+          <w:sz w:val="25"/>
+        </w:rPr>
+        <w:t>14.1 M1 提交（6 个）</w:t>
+      </w:r>
+    </w:p>
+    <w:tbl>
+      <w:tblPr>
+        <w:tblStyle w:val="TableGrid"/>
+        <w:tblW w:type="auto" w:w="0"/>
+        <w:jc w:val="center"/>
+        <w:tblLook w:firstColumn="1" w:firstRow="1" w:lastColumn="0" w:lastRow="0" w:noHBand="0" w:noVBand="1" w:val="04A0"/>
+      </w:tblPr>
+      <w:tblGrid>
+        <w:gridCol w:w="2880"/>
+        <w:gridCol w:w="2880"/>
+        <w:gridCol w:w="2880"/>
+      </w:tblGrid>
+      <w:tr>
+        <w:tc>
+          <w:tcPr>
+            <w:tcW w:type="dxa" w:w="3120"/>
+            <w:shd w:val="clear" w:color="auto" w:fill="2B5C8F"/>
+          </w:tcPr>
+          <w:p>
+            <w:r/>
+            <w:r>
+              <w:rPr>
+                <w:rFonts w:ascii="宋体" w:hAnsi="宋体" w:eastAsia="宋体"/>
+                <w:b/>
+                <w:i w:val="0"/>
+                <w:color w:val="FFFFFF"/>
+                <w:sz w:val="21"/>
+              </w:rPr>
+              <w:t>#</w:t>
+            </w:r>
+          </w:p>
+        </w:tc>
+        <w:tc>
+          <w:tcPr>
+            <w:tcW w:type="dxa" w:w="3120"/>
+            <w:shd w:val="clear" w:color="auto" w:fill="2B5C8F"/>
+          </w:tcPr>
+          <w:p>
+            <w:r/>
+            <w:r>
+              <w:rPr>
+                <w:rFonts w:ascii="宋体" w:hAnsi="宋体" w:eastAsia="宋体"/>
+                <w:b/>
+                <w:i w:val="0"/>
+                <w:color w:val="FFFFFF"/>
+                <w:sz w:val="21"/>
+              </w:rPr>
+              <w:t>Hash</w:t>
+            </w:r>
+          </w:p>
+        </w:tc>
+        <w:tc>
+          <w:tcPr>
+            <w:tcW w:type="dxa" w:w="3120"/>
+            <w:shd w:val="clear" w:color="auto" w:fill="2B5C8F"/>
+          </w:tcPr>
+          <w:p>
+            <w:r/>
+            <w:r>
+              <w:rPr>
+                <w:rFonts w:ascii="宋体" w:hAnsi="宋体" w:eastAsia="宋体"/>
+                <w:b/>
+                <w:i w:val="0"/>
+                <w:color w:val="FFFFFF"/>
+                <w:sz w:val="21"/>
+              </w:rPr>
+              <w:t>提交信息</w:t>
+            </w:r>
+          </w:p>
+        </w:tc>
+      </w:tr>
+      <w:tr>
+        <w:tc>
+          <w:tcPr>
+            <w:tcW w:type="dxa" w:w="3120"/>
+          </w:tcPr>
+          <w:p>
+            <w:r/>
+            <w:r>
+              <w:rPr>
+                <w:rFonts w:ascii="宋体" w:hAnsi="宋体" w:eastAsia="宋体"/>
+                <w:b w:val="0"/>
+                <w:i w:val="0"/>
+                <w:sz w:val="20"/>
+              </w:rPr>
+              <w:t>1</w:t>
+            </w:r>
+          </w:p>
+        </w:tc>
+        <w:tc>
+          <w:tcPr>
+            <w:tcW w:type="dxa" w:w="3120"/>
+          </w:tcPr>
+          <w:p>
+            <w:r/>
+            <w:r>
+              <w:rPr>
+                <w:rFonts w:ascii="宋体" w:hAnsi="宋体" w:eastAsia="宋体"/>
+                <w:b w:val="0"/>
+                <w:i w:val="0"/>
+                <w:sz w:val="20"/>
+              </w:rPr>
+              <w:t>3f323f5</w:t>
+            </w:r>
+          </w:p>
+        </w:tc>
+        <w:tc>
+          <w:tcPr>
+            <w:tcW w:type="dxa" w:w="3120"/>
+          </w:tcPr>
+          <w:p>
+            <w:r/>
+            <w:r>
+              <w:rPr>
+                <w:rFonts w:ascii="宋体" w:hAnsi="宋体" w:eastAsia="宋体"/>
+                <w:b w:val="0"/>
+                <w:i w:val="0"/>
+                <w:sz w:val="20"/>
+              </w:rPr>
+              <w:t>M1: shared runtime (repository, user/profile services, session) + build packaging</w:t>
+            </w:r>
+          </w:p>
+        </w:tc>
+      </w:tr>
+      <w:tr>
+        <w:tc>
+          <w:tcPr>
+            <w:tcW w:type="dxa" w:w="3120"/>
+            <w:shd w:val="clear" w:color="auto" w:fill="EAF1F8"/>
+          </w:tcPr>
+          <w:p>
+            <w:r/>
+            <w:r>
+              <w:rPr>
+                <w:rFonts w:ascii="宋体" w:hAnsi="宋体" w:eastAsia="宋体"/>
+                <w:b w:val="0"/>
+                <w:i w:val="0"/>
+                <w:sz w:val="20"/>
+              </w:rPr>
+              <w:t>2</w:t>
+            </w:r>
+          </w:p>
+        </w:tc>
+        <w:tc>
+          <w:tcPr>
+            <w:tcW w:type="dxa" w:w="3120"/>
+            <w:shd w:val="clear" w:color="auto" w:fill="EAF1F8"/>
+          </w:tcPr>
+          <w:p>
+            <w:r/>
+            <w:r>
+              <w:rPr>
+                <w:rFonts w:ascii="宋体" w:hAnsi="宋体" w:eastAsia="宋体"/>
+                <w:b w:val="0"/>
+                <w:i w:val="0"/>
+                <w:sz w:val="20"/>
+              </w:rPr>
+              <w:t>82c8c41</w:t>
+            </w:r>
+          </w:p>
+        </w:tc>
+        <w:tc>
+          <w:tcPr>
+            <w:tcW w:type="dxa" w:w="3120"/>
+            <w:shd w:val="clear" w:color="auto" w:fill="EAF1F8"/>
+          </w:tcPr>
+          <w:p>
+            <w:r/>
+            <w:r>
+              <w:rPr>
+                <w:rFonts w:ascii="宋体" w:hAnsi="宋体" w:eastAsia="宋体"/>
+                <w:b w:val="0"/>
+                <w:i w:val="0"/>
+                <w:sz w:val="20"/>
+              </w:rPr>
+              <w:t>M1: profileApi cloud function + login uses shared runtime; drop openid from client responses</w:t>
+            </w:r>
+          </w:p>
+        </w:tc>
+      </w:tr>
+      <w:tr>
+        <w:tc>
+          <w:tcPr>
+            <w:tcW w:type="dxa" w:w="3120"/>
+          </w:tcPr>
+          <w:p>
+            <w:r/>
+            <w:r>
+              <w:rPr>
+                <w:rFonts w:ascii="宋体" w:hAnsi="宋体" w:eastAsia="宋体"/>
+                <w:b w:val="0"/>
+                <w:i w:val="0"/>
+                <w:sz w:val="20"/>
+              </w:rPr>
+              <w:t>3</w:t>
+            </w:r>
+          </w:p>
+        </w:tc>
+        <w:tc>
+          <w:tcPr>
+            <w:tcW w:type="dxa" w:w="3120"/>
+          </w:tcPr>
+          <w:p>
+            <w:r/>
+            <w:r>
+              <w:rPr>
+                <w:rFonts w:ascii="宋体" w:hAnsi="宋体" w:eastAsia="宋体"/>
+                <w:b w:val="0"/>
+                <w:i w:val="0"/>
+                <w:sz w:val="20"/>
+              </w:rPr>
+              <w:t>465c868</w:t>
+            </w:r>
+          </w:p>
+        </w:tc>
+        <w:tc>
+          <w:tcPr>
+            <w:tcW w:type="dxa" w:w="3120"/>
+          </w:tcPr>
+          <w:p>
+            <w:r/>
+            <w:r>
+              <w:rPr>
+                <w:rFonts w:ascii="宋体" w:hAnsi="宋体" w:eastAsia="宋体"/>
+                <w:b w:val="0"/>
+                <w:i w:val="0"/>
+                <w:sz w:val="20"/>
+              </w:rPr>
+              <w:t>M1: client identity/profile UI + auth/profile/session services</w:t>
+            </w:r>
+          </w:p>
+        </w:tc>
+      </w:tr>
+      <w:tr>
+        <w:tc>
+          <w:tcPr>
+            <w:tcW w:type="dxa" w:w="3120"/>
+            <w:shd w:val="clear" w:color="auto" w:fill="EAF1F8"/>
+          </w:tcPr>
+          <w:p>
+            <w:r/>
+            <w:r>
+              <w:rPr>
+                <w:rFonts w:ascii="宋体" w:hAnsi="宋体" w:eastAsia="宋体"/>
+                <w:b w:val="0"/>
+                <w:i w:val="0"/>
+                <w:sz w:val="20"/>
+              </w:rPr>
+              <w:t>4</w:t>
+            </w:r>
+          </w:p>
+        </w:tc>
+        <w:tc>
+          <w:tcPr>
+            <w:tcW w:type="dxa" w:w="3120"/>
+            <w:shd w:val="clear" w:color="auto" w:fill="EAF1F8"/>
+          </w:tcPr>
+          <w:p>
+            <w:r/>
+            <w:r>
+              <w:rPr>
+                <w:rFonts w:ascii="宋体" w:hAnsi="宋体" w:eastAsia="宋体"/>
+                <w:b w:val="0"/>
+                <w:i w:val="0"/>
+                <w:sz w:val="20"/>
+              </w:rPr>
+              <w:t>b79def5</w:t>
+            </w:r>
+          </w:p>
+        </w:tc>
+        <w:tc>
+          <w:tcPr>
+            <w:tcW w:type="dxa" w:w="3120"/>
+            <w:shd w:val="clear" w:color="auto" w:fill="EAF1F8"/>
+          </w:tcPr>
+          <w:p>
+            <w:r/>
+            <w:r>
+              <w:rPr>
+                <w:rFonts w:ascii="宋体" w:hAnsi="宋体" w:eastAsia="宋体"/>
+                <w:b w:val="0"/>
+                <w:i w:val="0"/>
+                <w:sz w:val="20"/>
+              </w:rPr>
+              <w:t>M1: documentation (architecture, data model, flows, plan, security, manual tests) + ignore .workbuddy</w:t>
+            </w:r>
+          </w:p>
+        </w:tc>
+      </w:tr>
+      <w:tr>
+        <w:tc>
+          <w:tcPr>
+            <w:tcW w:type="dxa" w:w="3120"/>
+          </w:tcPr>
+          <w:p>
+            <w:r/>
+            <w:r>
+              <w:rPr>
+                <w:rFonts w:ascii="宋体" w:hAnsi="宋体" w:eastAsia="宋体"/>
+                <w:b w:val="0"/>
+                <w:i w:val="0"/>
+                <w:sz w:val="20"/>
+              </w:rPr>
+              <w:t>5</w:t>
+            </w:r>
+          </w:p>
+        </w:tc>
+        <w:tc>
+          <w:tcPr>
+            <w:tcW w:type="dxa" w:w="3120"/>
+          </w:tcPr>
+          <w:p>
+            <w:r/>
+            <w:r>
+              <w:rPr>
+                <w:rFonts w:ascii="宋体" w:hAnsi="宋体" w:eastAsia="宋体"/>
+                <w:b w:val="0"/>
+                <w:i w:val="0"/>
+                <w:sz w:val="20"/>
+              </w:rPr>
+              <w:t>d5b1134</w:t>
+            </w:r>
+          </w:p>
+        </w:tc>
+        <w:tc>
+          <w:tcPr>
+            <w:tcW w:type="dxa" w:w="3120"/>
+          </w:tcPr>
+          <w:p>
+            <w:r/>
+            <w:r>
+              <w:rPr>
+                <w:rFonts w:ascii="宋体" w:hAnsi="宋体" w:eastAsia="宋体"/>
+                <w:b w:val="0"/>
+                <w:i w:val="0"/>
+                <w:sz w:val="20"/>
+              </w:rPr>
+              <w:t>M1: extend validation with 16 M1 acceptance tests</w:t>
+            </w:r>
+          </w:p>
+        </w:tc>
+      </w:tr>
+      <w:tr>
+        <w:tc>
+          <w:tcPr>
+            <w:tcW w:type="dxa" w:w="3120"/>
+            <w:shd w:val="clear" w:color="auto" w:fill="EAF1F8"/>
+          </w:tcPr>
+          <w:p>
+            <w:r/>
+            <w:r>
+              <w:rPr>
+                <w:rFonts w:ascii="宋体" w:hAnsi="宋体" w:eastAsia="宋体"/>
+                <w:b w:val="0"/>
+                <w:i w:val="0"/>
+                <w:sz w:val="20"/>
+              </w:rPr>
+              <w:t>6</w:t>
+            </w:r>
+          </w:p>
+        </w:tc>
+        <w:tc>
+          <w:tcPr>
+            <w:tcW w:type="dxa" w:w="3120"/>
+            <w:shd w:val="clear" w:color="auto" w:fill="EAF1F8"/>
+          </w:tcPr>
+          <w:p>
+            <w:r/>
+            <w:r>
+              <w:rPr>
+                <w:rFonts w:ascii="宋体" w:hAnsi="宋体" w:eastAsia="宋体"/>
+                <w:b w:val="0"/>
+                <w:i w:val="0"/>
+                <w:sz w:val="20"/>
+              </w:rPr>
+              <w:t>acbf11d</w:t>
+            </w:r>
+          </w:p>
+        </w:tc>
+        <w:tc>
+          <w:tcPr>
+            <w:tcW w:type="dxa" w:w="3120"/>
+            <w:shd w:val="clear" w:color="auto" w:fill="EAF1F8"/>
+          </w:tcPr>
+          <w:p>
+            <w:r/>
+            <w:r>
+              <w:rPr>
+                <w:rFonts w:ascii="宋体" w:hAnsi="宋体" w:eastAsia="宋体"/>
+                <w:b w:val="0"/>
+                <w:i w:val="0"/>
+                <w:sz w:val="20"/>
+              </w:rPr>
+              <w:t>M1: final report (Markdown draft + Word .docx, blue theme)</w:t>
+            </w:r>
+          </w:p>
+        </w:tc>
+      </w:tr>
+    </w:tbl>
+    <w:p/>
+    <w:p>
+      <w:pPr>
+        <w:spacing w:before="120" w:after="60"/>
+      </w:pPr>
+      <w:r>
+        <w:rPr>
+          <w:rFonts w:ascii="宋体" w:hAnsi="宋体" w:eastAsia="宋体"/>
+          <w:b/>
+          <w:i w:val="0"/>
+          <w:color w:val="2B5C8F"/>
+          <w:sz w:val="25"/>
+        </w:rPr>
+        <w:t>14.2 M1.1 加固提交（3 个 + 本报告提交）</w:t>
+      </w:r>
+    </w:p>
+    <w:tbl>
+      <w:tblPr>
+        <w:tblStyle w:val="TableGrid"/>
+        <w:tblW w:type="auto" w:w="0"/>
+        <w:jc w:val="center"/>
+        <w:tblLook w:firstColumn="1" w:firstRow="1" w:lastColumn="0" w:lastRow="0" w:noHBand="0" w:noVBand="1" w:val="04A0"/>
+      </w:tblPr>
+      <w:tblGrid>
+        <w:gridCol w:w="2880"/>
+        <w:gridCol w:w="2880"/>
+        <w:gridCol w:w="2880"/>
+      </w:tblGrid>
+      <w:tr>
+        <w:tc>
+          <w:tcPr>
+            <w:tcW w:type="dxa" w:w="3120"/>
+            <w:shd w:val="clear" w:color="auto" w:fill="2B5C8F"/>
+          </w:tcPr>
+          <w:p>
+            <w:r/>
+            <w:r>
+              <w:rPr>
+                <w:rFonts w:ascii="宋体" w:hAnsi="宋体" w:eastAsia="宋体"/>
+                <w:b/>
+                <w:i w:val="0"/>
+                <w:color w:val="FFFFFF"/>
+                <w:sz w:val="21"/>
+              </w:rPr>
+              <w:t>#</w:t>
+            </w:r>
+          </w:p>
+        </w:tc>
+        <w:tc>
+          <w:tcPr>
+            <w:tcW w:type="dxa" w:w="3120"/>
+            <w:shd w:val="clear" w:color="auto" w:fill="2B5C8F"/>
+          </w:tcPr>
+          <w:p>
+            <w:r/>
+            <w:r>
+              <w:rPr>
+                <w:rFonts w:ascii="宋体" w:hAnsi="宋体" w:eastAsia="宋体"/>
+                <w:b/>
+                <w:i w:val="0"/>
+                <w:color w:val="FFFFFF"/>
+                <w:sz w:val="21"/>
+              </w:rPr>
+              <w:t>Hash</w:t>
+            </w:r>
+          </w:p>
+        </w:tc>
+        <w:tc>
+          <w:tcPr>
+            <w:tcW w:type="dxa" w:w="3120"/>
+            <w:shd w:val="clear" w:color="auto" w:fill="2B5C8F"/>
+          </w:tcPr>
+          <w:p>
+            <w:r/>
+            <w:r>
+              <w:rPr>
+                <w:rFonts w:ascii="宋体" w:hAnsi="宋体" w:eastAsia="宋体"/>
+                <w:b/>
+                <w:i w:val="0"/>
+                <w:color w:val="FFFFFF"/>
+                <w:sz w:val="21"/>
+              </w:rPr>
+              <w:t>提交信息</w:t>
+            </w:r>
+          </w:p>
+        </w:tc>
+      </w:tr>
+      <w:tr>
+        <w:tc>
+          <w:tcPr>
+            <w:tcW w:type="dxa" w:w="3120"/>
+          </w:tcPr>
+          <w:p>
+            <w:r/>
+            <w:r>
+              <w:rPr>
+                <w:rFonts w:ascii="宋体" w:hAnsi="宋体" w:eastAsia="宋体"/>
+                <w:b w:val="0"/>
+                <w:i w:val="0"/>
+                <w:sz w:val="20"/>
+              </w:rPr>
+              <w:t>7</w:t>
+            </w:r>
+          </w:p>
+        </w:tc>
+        <w:tc>
+          <w:tcPr>
+            <w:tcW w:type="dxa" w:w="3120"/>
+          </w:tcPr>
+          <w:p>
+            <w:r/>
+            <w:r>
+              <w:rPr>
+                <w:rFonts w:ascii="宋体" w:hAnsi="宋体" w:eastAsia="宋体"/>
+                <w:b w:val="0"/>
+                <w:i w:val="0"/>
+                <w:sz w:val="20"/>
+              </w:rPr>
+              <w:t>a729826</w:t>
+            </w:r>
+          </w:p>
+        </w:tc>
+        <w:tc>
+          <w:tcPr>
+            <w:tcW w:type="dxa" w:w="3120"/>
+          </w:tcPr>
+          <w:p>
+            <w:r/>
+            <w:r>
+              <w:rPr>
+                <w:rFonts w:ascii="宋体" w:hAnsi="宋体" w:eastAsia="宋体"/>
+                <w:b w:val="0"/>
+                <w:i w:val="0"/>
+                <w:sz w:val="20"/>
+              </w:rPr>
+              <w:t>M1.1: remove name-based dedup (requestId idempotency) + default single source of truth</w:t>
+            </w:r>
+          </w:p>
+        </w:tc>
+      </w:tr>
+      <w:tr>
+        <w:tc>
+          <w:tcPr>
+            <w:tcW w:type="dxa" w:w="3120"/>
+            <w:shd w:val="clear" w:color="auto" w:fill="EAF1F8"/>
+          </w:tcPr>
+          <w:p>
+            <w:r/>
+            <w:r>
+              <w:rPr>
+                <w:rFonts w:ascii="宋体" w:hAnsi="宋体" w:eastAsia="宋体"/>
+                <w:b w:val="0"/>
+                <w:i w:val="0"/>
+                <w:sz w:val="20"/>
+              </w:rPr>
+              <w:t>8</w:t>
+            </w:r>
+          </w:p>
+        </w:tc>
+        <w:tc>
+          <w:tcPr>
+            <w:tcW w:type="dxa" w:w="3120"/>
+            <w:shd w:val="clear" w:color="auto" w:fill="EAF1F8"/>
+          </w:tcPr>
+          <w:p>
+            <w:r/>
+            <w:r>
+              <w:rPr>
+                <w:rFonts w:ascii="宋体" w:hAnsi="宋体" w:eastAsia="宋体"/>
+                <w:b w:val="0"/>
+                <w:i w:val="0"/>
+                <w:sz w:val="20"/>
+              </w:rPr>
+              <w:t>b6aefc6</w:t>
+            </w:r>
+          </w:p>
+        </w:tc>
+        <w:tc>
+          <w:tcPr>
+            <w:tcW w:type="dxa" w:w="3120"/>
+            <w:shd w:val="clear" w:color="auto" w:fill="EAF1F8"/>
+          </w:tcPr>
+          <w:p>
+            <w:r/>
+            <w:r>
+              <w:rPr>
+                <w:rFonts w:ascii="宋体" w:hAnsi="宋体" w:eastAsia="宋体"/>
+                <w:b w:val="0"/>
+                <w:i w:val="0"/>
+                <w:sz w:val="20"/>
+              </w:rPr>
+              <w:t>M1.1: validation tests for requestId idempotency &amp; default single source of truth</w:t>
+            </w:r>
+          </w:p>
+        </w:tc>
+      </w:tr>
+      <w:tr>
+        <w:tc>
+          <w:tcPr>
+            <w:tcW w:type="dxa" w:w="3120"/>
+          </w:tcPr>
+          <w:p>
+            <w:r/>
+            <w:r>
+              <w:rPr>
+                <w:rFonts w:ascii="宋体" w:hAnsi="宋体" w:eastAsia="宋体"/>
+                <w:b w:val="0"/>
+                <w:i w:val="0"/>
+                <w:sz w:val="20"/>
+              </w:rPr>
+              <w:t>9</w:t>
+            </w:r>
+          </w:p>
+        </w:tc>
+        <w:tc>
+          <w:tcPr>
+            <w:tcW w:type="dxa" w:w="3120"/>
+          </w:tcPr>
+          <w:p>
+            <w:r/>
+            <w:r>
+              <w:rPr>
+                <w:rFonts w:ascii="宋体" w:hAnsi="宋体" w:eastAsia="宋体"/>
+                <w:b w:val="0"/>
+                <w:i w:val="0"/>
+                <w:sz w:val="20"/>
+              </w:rPr>
+              <w:t>1c9243c</w:t>
+            </w:r>
+          </w:p>
+        </w:tc>
+        <w:tc>
+          <w:tcPr>
+            <w:tcW w:type="dxa" w:w="3120"/>
+          </w:tcPr>
+          <w:p>
+            <w:r/>
+            <w:r>
+              <w:rPr>
+                <w:rFonts w:ascii="宋体" w:hAnsi="宋体" w:eastAsia="宋体"/>
+                <w:b w:val="0"/>
+                <w:i w:val="0"/>
+                <w:sz w:val="20"/>
+              </w:rPr>
+              <w:t>M1.1: docs (data model, architecture, flows, security) reflect idempotency + default SSoT</w:t>
+            </w:r>
+          </w:p>
+        </w:tc>
+      </w:tr>
+      <w:tr>
+        <w:tc>
+          <w:tcPr>
+            <w:tcW w:type="dxa" w:w="3120"/>
+            <w:shd w:val="clear" w:color="auto" w:fill="EAF1F8"/>
+          </w:tcPr>
+          <w:p>
+            <w:r/>
+            <w:r>
+              <w:rPr>
+                <w:rFonts w:ascii="宋体" w:hAnsi="宋体" w:eastAsia="宋体"/>
+                <w:b w:val="0"/>
+                <w:i w:val="0"/>
+                <w:sz w:val="20"/>
+              </w:rPr>
+              <w:t>10</w:t>
+            </w:r>
+          </w:p>
+        </w:tc>
+        <w:tc>
+          <w:tcPr>
+            <w:tcW w:type="dxa" w:w="3120"/>
+            <w:shd w:val="clear" w:color="auto" w:fill="EAF1F8"/>
+          </w:tcPr>
+          <w:p>
+            <w:r/>
+            <w:r>
+              <w:rPr>
+                <w:rFonts w:ascii="宋体" w:hAnsi="宋体" w:eastAsia="宋体"/>
+                <w:b w:val="0"/>
+                <w:i w:val="0"/>
+                <w:sz w:val="20"/>
+              </w:rPr>
+              <w:t>(本次)</w:t>
+            </w:r>
+          </w:p>
+        </w:tc>
+        <w:tc>
+          <w:tcPr>
+            <w:tcW w:type="dxa" w:w="3120"/>
+            <w:shd w:val="clear" w:color="auto" w:fill="EAF1F8"/>
+          </w:tcPr>
+          <w:p>
+            <w:r/>
+            <w:r>
+              <w:rPr>
+                <w:rFonts w:ascii="宋体" w:hAnsi="宋体" w:eastAsia="宋体"/>
+                <w:b w:val="0"/>
+                <w:i w:val="0"/>
+                <w:sz w:val="20"/>
+              </w:rPr>
+              <w:t>M1.1: reconcile final report (M1.1 corrections, test status, git log)</w:t>
+            </w:r>
+          </w:p>
+        </w:tc>
+      </w:tr>
+    </w:tbl>
+    <w:p/>
+    <w:p>
+      <w:pPr>
+        <w:spacing w:after="120"/>
+      </w:pPr>
+      <w:r>
+        <w:rPr>
+          <w:rFonts w:ascii="宋体" w:hAnsi="宋体" w:eastAsia="宋体"/>
+          <w:b w:val="0"/>
+          <w:i w:val="0"/>
+          <w:sz w:val="24"/>
+        </w:rPr>
+        <w:t>说明：第 10 条为本报告自身的提交，在本文件生成时其 hash 尚未产生，故以「(本次)」标注；提交后即为分支 HEAD。合计自 M0 以来 M1 6 个 + M1.1 4 个。</w:t>
       </w:r>
     </w:p>
     <w:p>
@@ -7244,96 +8908,7 @@
           <w:i w:val="0"/>
           <w:sz w:val="24"/>
         </w:rPr>
-        <w:t>聚焦提交（5 个）：</w:t>
-      </w:r>
-    </w:p>
-    <w:p>
-      <w:pPr>
-        <w:pStyle w:val="ListBullet"/>
-        <w:spacing w:after="60"/>
-      </w:pPr>
-      <w:r>
-        <w:rPr>
-          <w:rFonts w:ascii="宋体" w:hAnsi="宋体" w:eastAsia="宋体"/>
-          <w:b w:val="0"/>
-          <w:i w:val="0"/>
-          <w:sz w:val="24"/>
-        </w:rPr>
-        <w:t>M1: shared runtime (repository, user/profile services, session) + build packaging</w:t>
-      </w:r>
-    </w:p>
-    <w:p>
-      <w:pPr>
-        <w:pStyle w:val="ListBullet"/>
-        <w:spacing w:after="60"/>
-      </w:pPr>
-      <w:r>
-        <w:rPr>
-          <w:rFonts w:ascii="宋体" w:hAnsi="宋体" w:eastAsia="宋体"/>
-          <w:b w:val="0"/>
-          <w:i w:val="0"/>
-          <w:sz w:val="24"/>
-        </w:rPr>
-        <w:t>M1: profileApi cloud function + login uses shared runtime; drop openid from client responses</w:t>
-      </w:r>
-    </w:p>
-    <w:p>
-      <w:pPr>
-        <w:pStyle w:val="ListBullet"/>
-        <w:spacing w:after="60"/>
-      </w:pPr>
-      <w:r>
-        <w:rPr>
-          <w:rFonts w:ascii="宋体" w:hAnsi="宋体" w:eastAsia="宋体"/>
-          <w:b w:val="0"/>
-          <w:i w:val="0"/>
-          <w:sz w:val="24"/>
-        </w:rPr>
-        <w:t>M1: client identity/profile UI + auth/profile/session services</w:t>
-      </w:r>
-    </w:p>
-    <w:p>
-      <w:pPr>
-        <w:pStyle w:val="ListBullet"/>
-        <w:spacing w:after="60"/>
-      </w:pPr>
-      <w:r>
-        <w:rPr>
-          <w:rFonts w:ascii="宋体" w:hAnsi="宋体" w:eastAsia="宋体"/>
-          <w:b w:val="0"/>
-          <w:i w:val="0"/>
-          <w:sz w:val="24"/>
-        </w:rPr>
-        <w:t>M1: documentation (...) + ignore .workbuddy</w:t>
-      </w:r>
-    </w:p>
-    <w:p>
-      <w:pPr>
-        <w:pStyle w:val="ListBullet"/>
-        <w:spacing w:after="60"/>
-      </w:pPr>
-      <w:r>
-        <w:rPr>
-          <w:rFonts w:ascii="宋体" w:hAnsi="宋体" w:eastAsia="宋体"/>
-          <w:b w:val="0"/>
-          <w:i w:val="0"/>
-          <w:sz w:val="24"/>
-        </w:rPr>
-        <w:t>M1: extend validation with 16 M1 acceptance tests</w:t>
-      </w:r>
-    </w:p>
-    <w:p>
-      <w:pPr>
-        <w:spacing w:after="120"/>
-      </w:pPr>
-      <w:r>
-        <w:rPr>
-          <w:rFonts w:ascii="宋体" w:hAnsi="宋体" w:eastAsia="宋体"/>
-          <w:b w:val="0"/>
-          <w:i w:val="0"/>
-          <w:sz w:val="24"/>
-        </w:rPr>
-        <w:t>范围控制：未包含任何 M2+ 代码。附带修正：M0 的 cloudfunctions/**/*.js 误忽略导致云函数源码从未入库；M1 修正 .gitignore 改为仅忽略 lib/shared/，使 login/mealApi/aiAnalyze 源码得以纳入版本控制。</w:t>
+        <w:t>范围控制：未包含任何 M2+ 代码（无 food/portion/meal/recipe/photo/AI 实现），未实现档案删除、营养目标或医疗字段，未重构 UI。M1 附带修正：M0 的 cloudfunctions/**/*.js 误忽略导致云函数源码从未入库；M1 将 .gitignore 改为仅忽略 lib/shared/，使 login/mealApi/aiAnalyze 源码得以纳入版本控制。</w:t>
       </w:r>
     </w:p>
     <w:p>
@@ -7452,6 +9027,1662 @@
           <w:sz w:val="24"/>
         </w:rPr>
         <w:t>注意：M2 仍保持单一所有者模型，不引入多人共享；openid 继续仅服务端可见。</w:t>
+      </w:r>
+    </w:p>
+    <w:p>
+      <w:pPr>
+        <w:spacing w:before="200" w:after="120"/>
+      </w:pPr>
+      <w:r>
+        <w:rPr>
+          <w:rFonts w:ascii="宋体" w:hAnsi="宋体" w:eastAsia="宋体"/>
+          <w:b/>
+          <w:i w:val="0"/>
+          <w:color w:val="1A3A6B"/>
+          <w:sz w:val="30"/>
+        </w:rPr>
+        <w:t>16. M1.1 加固修正（合入 main 前）</w:t>
+      </w:r>
+    </w:p>
+    <w:p>
+      <w:pPr>
+        <w:spacing w:after="120"/>
+      </w:pPr>
+      <w:r>
+        <w:rPr>
+          <w:rFonts w:ascii="宋体" w:hAnsi="宋体" w:eastAsia="宋体"/>
+          <w:b w:val="0"/>
+          <w:i w:val="0"/>
+          <w:sz w:val="24"/>
+        </w:rPr>
+        <w:t>在将 M1 合入 main 前执行的窄范围加固，仅含两处设计修正与配套测试/文档，不引入 M2、不实现档案删除/营养目标/医疗字段、不重构 UI、不接真实 AI。</w:t>
+      </w:r>
+    </w:p>
+    <w:p>
+      <w:pPr>
+        <w:spacing w:before="120" w:after="60"/>
+      </w:pPr>
+      <w:r>
+        <w:rPr>
+          <w:rFonts w:ascii="宋体" w:hAnsi="宋体" w:eastAsia="宋体"/>
+          <w:b/>
+          <w:i w:val="0"/>
+          <w:color w:val="2B5C8F"/>
+          <w:sz w:val="25"/>
+        </w:rPr>
+        <w:t>16.1 修正一：移除基于姓名的档案去重</w:t>
+      </w:r>
+    </w:p>
+    <w:p>
+      <w:pPr>
+        <w:pStyle w:val="ListBullet"/>
+        <w:spacing w:after="60"/>
+      </w:pPr>
+      <w:r>
+        <w:rPr>
+          <w:rFonts w:ascii="宋体" w:hAnsi="宋体" w:eastAsia="宋体"/>
+          <w:b w:val="0"/>
+          <w:i w:val="0"/>
+          <w:sz w:val="24"/>
+        </w:rPr>
+        <w:t>问题：早期 M1 可能以 name（或 name + relation）作为唯一/幂等键，导致同一所有者无法创建重名档案（如两个都叫「宝宝」的孩子）。</w:t>
+      </w:r>
+    </w:p>
+    <w:p>
+      <w:pPr>
+        <w:pStyle w:val="ListBullet"/>
+        <w:spacing w:after="60"/>
+      </w:pPr>
+      <w:r>
+        <w:rPr>
+          <w:rFonts w:ascii="宋体" w:hAnsi="宋体" w:eastAsia="宋体"/>
+          <w:b w:val="0"/>
+          <w:i w:val="0"/>
+          <w:sz w:val="24"/>
+        </w:rPr>
+        <w:t>修正：createProfile 不再按姓名去重；姓名不作唯一键。防止误重复改由两层实现——(a) 客户端提交 in-flight 防抖；(b) 客户端生成 requestId 的请求级幂等，作用域为 (ownerOpenid, operation, requestId)。</w:t>
+      </w:r>
+    </w:p>
+    <w:p>
+      <w:pPr>
+        <w:pStyle w:val="ListBullet"/>
+        <w:spacing w:after="60"/>
+      </w:pPr>
+      <w:r>
+        <w:rPr>
+          <w:rFonts w:ascii="宋体" w:hAnsi="宋体" w:eastAsia="宋体"/>
+          <w:b w:val="0"/>
+          <w:i w:val="0"/>
+          <w:sz w:val="24"/>
+        </w:rPr>
+        <w:t>客户端契约：{ action:'create', requestId:'req_&lt;time36&gt;_&lt;random&gt;', profile:{ name, relation } }。相同 requestId 返回原档案；不同 requestId 即便姓名/关系相同也创建新档案。</w:t>
+      </w:r>
+    </w:p>
+    <w:p>
+      <w:pPr>
+        <w:pStyle w:val="ListBullet"/>
+        <w:spacing w:after="60"/>
+      </w:pPr>
+      <w:r>
+        <w:rPr>
+          <w:rFonts w:ascii="宋体" w:hAnsi="宋体" w:eastAsia="宋体"/>
+          <w:b w:val="0"/>
+          <w:i w:val="0"/>
+          <w:sz w:val="24"/>
+        </w:rPr>
+        <w:t>落地：新增 idempotency_keys 集合与 IdempotencyKey 类型；Repository 增加 findIdempotencyKey / saveIdempotencyKey；内存实现与 CloudBase 实现均补齐；profileApi.index.js 透传 event.requestId。</w:t>
+      </w:r>
+    </w:p>
+    <w:p>
+      <w:pPr>
+        <w:pStyle w:val="ListBullet"/>
+        <w:spacing w:after="60"/>
+      </w:pPr>
+      <w:r>
+        <w:rPr>
+          <w:rFonts w:ascii="宋体" w:hAnsi="宋体" w:eastAsia="宋体"/>
+          <w:b w:val="0"/>
+          <w:i w:val="0"/>
+          <w:sz w:val="24"/>
+        </w:rPr>
+        <w:t>残留风险（已记录）：read→create→write-key 非原子，理论上两条并发同 requestId 可能各自创建；已由 UI 防抖 + 单用户点击并发缓解。M3 通用方案：将复合索引升级为唯一索引，以「写键」作为原子闸（重复键报错即视为已处理并返回 resultId）。</w:t>
+      </w:r>
+    </w:p>
+    <w:p>
+      <w:pPr>
+        <w:spacing w:before="120" w:after="60"/>
+      </w:pPr>
+      <w:r>
+        <w:rPr>
+          <w:rFonts w:ascii="宋体" w:hAnsi="宋体" w:eastAsia="宋体"/>
+          <w:b/>
+          <w:i w:val="0"/>
+          <w:color w:val="2B5C8F"/>
+          <w:sz w:val="25"/>
+        </w:rPr>
+        <w:t>16.2 修正二：默认档案单一事实来源</w:t>
+      </w:r>
+    </w:p>
+    <w:p>
+      <w:pPr>
+        <w:pStyle w:val="ListBullet"/>
+        <w:spacing w:after="60"/>
+      </w:pPr>
+      <w:r>
+        <w:rPr>
+          <w:rFonts w:ascii="宋体" w:hAnsi="宋体" w:eastAsia="宋体"/>
+          <w:b w:val="0"/>
+          <w:i w:val="0"/>
+          <w:sz w:val="24"/>
+        </w:rPr>
+        <w:t>仅以 users.defaultFamilyProfileId 作为默认状态的唯一持久化来源；family_profiles 不存储 isDefault。</w:t>
+      </w:r>
+    </w:p>
+    <w:p>
+      <w:pPr>
+        <w:pStyle w:val="ListBullet"/>
+        <w:spacing w:after="60"/>
+      </w:pPr>
+      <w:r>
+        <w:rPr>
+          <w:rFonts w:ascii="宋体" w:hAnsi="宋体" w:eastAsia="宋体"/>
+          <w:b w:val="0"/>
+          <w:i w:val="0"/>
+          <w:sz w:val="24"/>
+        </w:rPr>
+        <w:t>setDefault 仅更新用户文档，不改写任何档案文档（切换默认无需多文档写入）。</w:t>
+      </w:r>
+    </w:p>
+    <w:p>
+      <w:pPr>
+        <w:pStyle w:val="ListBullet"/>
+        <w:spacing w:after="60"/>
+      </w:pPr>
+      <w:r>
+        <w:rPr>
+          <w:rFonts w:ascii="宋体" w:hAnsi="宋体" w:eastAsia="宋体"/>
+          <w:b w:val="0"/>
+          <w:i w:val="0"/>
+          <w:sz w:val="24"/>
+        </w:rPr>
+        <w:t>对外 isDefault 一律在 DTO 计算：toClientProfile(p, defaultProfileId) 以 p.id === defaultProfileId 得出。</w:t>
+      </w:r>
+    </w:p>
+    <w:p>
+      <w:pPr>
+        <w:pStyle w:val="ListBullet"/>
+        <w:spacing w:after="60"/>
+      </w:pPr>
+      <w:r>
+        <w:rPr>
+          <w:rFonts w:ascii="宋体" w:hAnsi="宋体" w:eastAsia="宋体"/>
+          <w:b w:val="0"/>
+          <w:i w:val="0"/>
+          <w:sz w:val="24"/>
+        </w:rPr>
+        <w:t>悬挂/缺失默认 ID → 无档案被标记默认（安全回退，无需数据修复）。</w:t>
+      </w:r>
+    </w:p>
+    <w:p>
+      <w:pPr>
+        <w:spacing w:before="120" w:after="60"/>
+      </w:pPr>
+      <w:r>
+        <w:rPr>
+          <w:rFonts w:ascii="宋体" w:hAnsi="宋体" w:eastAsia="宋体"/>
+          <w:b/>
+          <w:i w:val="0"/>
+          <w:color w:val="2B5C8F"/>
+          <w:sz w:val="25"/>
+        </w:rPr>
+        <w:t>16.3 变更文件清单（M1.1）</w:t>
+      </w:r>
+    </w:p>
+    <w:tbl>
+      <w:tblPr>
+        <w:tblStyle w:val="TableGrid"/>
+        <w:tblW w:type="auto" w:w="0"/>
+        <w:jc w:val="center"/>
+        <w:tblLook w:firstColumn="1" w:firstRow="1" w:lastColumn="0" w:lastRow="0" w:noHBand="0" w:noVBand="1" w:val="04A0"/>
+      </w:tblPr>
+      <w:tblGrid>
+        <w:gridCol w:w="2880"/>
+        <w:gridCol w:w="2880"/>
+        <w:gridCol w:w="2880"/>
+      </w:tblGrid>
+      <w:tr>
+        <w:tc>
+          <w:tcPr>
+            <w:tcW w:type="dxa" w:w="3120"/>
+            <w:shd w:val="clear" w:color="auto" w:fill="2B5C8F"/>
+          </w:tcPr>
+          <w:p>
+            <w:r/>
+            <w:r>
+              <w:rPr>
+                <w:rFonts w:ascii="宋体" w:hAnsi="宋体" w:eastAsia="宋体"/>
+                <w:b/>
+                <w:i w:val="0"/>
+                <w:color w:val="FFFFFF"/>
+                <w:sz w:val="21"/>
+              </w:rPr>
+              <w:t>文件</w:t>
+            </w:r>
+          </w:p>
+        </w:tc>
+        <w:tc>
+          <w:tcPr>
+            <w:tcW w:type="dxa" w:w="3120"/>
+            <w:shd w:val="clear" w:color="auto" w:fill="2B5C8F"/>
+          </w:tcPr>
+          <w:p>
+            <w:r/>
+            <w:r>
+              <w:rPr>
+                <w:rFonts w:ascii="宋体" w:hAnsi="宋体" w:eastAsia="宋体"/>
+                <w:b/>
+                <w:i w:val="0"/>
+                <w:color w:val="FFFFFF"/>
+                <w:sz w:val="21"/>
+              </w:rPr>
+              <w:t>状态</w:t>
+            </w:r>
+          </w:p>
+        </w:tc>
+        <w:tc>
+          <w:tcPr>
+            <w:tcW w:type="dxa" w:w="3120"/>
+            <w:shd w:val="clear" w:color="auto" w:fill="2B5C8F"/>
+          </w:tcPr>
+          <w:p>
+            <w:r/>
+            <w:r>
+              <w:rPr>
+                <w:rFonts w:ascii="宋体" w:hAnsi="宋体" w:eastAsia="宋体"/>
+                <w:b/>
+                <w:i w:val="0"/>
+                <w:color w:val="FFFFFF"/>
+                <w:sz w:val="21"/>
+              </w:rPr>
+              <w:t>M1.1 变更</w:t>
+            </w:r>
+          </w:p>
+        </w:tc>
+      </w:tr>
+      <w:tr>
+        <w:tc>
+          <w:tcPr>
+            <w:tcW w:type="dxa" w:w="3120"/>
+          </w:tcPr>
+          <w:p>
+            <w:r/>
+            <w:r>
+              <w:rPr>
+                <w:rFonts w:ascii="宋体" w:hAnsi="宋体" w:eastAsia="宋体"/>
+                <w:b w:val="0"/>
+                <w:i w:val="0"/>
+                <w:sz w:val="20"/>
+              </w:rPr>
+              <w:t>shared/types.ts</w:t>
+            </w:r>
+          </w:p>
+        </w:tc>
+        <w:tc>
+          <w:tcPr>
+            <w:tcW w:type="dxa" w:w="3120"/>
+          </w:tcPr>
+          <w:p>
+            <w:r/>
+            <w:r>
+              <w:rPr>
+                <w:rFonts w:ascii="宋体" w:hAnsi="宋体" w:eastAsia="宋体"/>
+                <w:b w:val="0"/>
+                <w:i w:val="0"/>
+                <w:sz w:val="20"/>
+              </w:rPr>
+              <w:t>修改</w:t>
+            </w:r>
+          </w:p>
+        </w:tc>
+        <w:tc>
+          <w:tcPr>
+            <w:tcW w:type="dxa" w:w="3120"/>
+          </w:tcPr>
+          <w:p>
+            <w:r/>
+            <w:r>
+              <w:rPr>
+                <w:rFonts w:ascii="宋体" w:hAnsi="宋体" w:eastAsia="宋体"/>
+                <w:b w:val="0"/>
+                <w:i w:val="0"/>
+                <w:sz w:val="20"/>
+              </w:rPr>
+              <w:t>新增 IdempotencyKey 接口；注明 FamilyProfile 不存 isDefault</w:t>
+            </w:r>
+          </w:p>
+        </w:tc>
+      </w:tr>
+      <w:tr>
+        <w:tc>
+          <w:tcPr>
+            <w:tcW w:type="dxa" w:w="3120"/>
+            <w:shd w:val="clear" w:color="auto" w:fill="EAF1F8"/>
+          </w:tcPr>
+          <w:p>
+            <w:r/>
+            <w:r>
+              <w:rPr>
+                <w:rFonts w:ascii="宋体" w:hAnsi="宋体" w:eastAsia="宋体"/>
+                <w:b w:val="0"/>
+                <w:i w:val="0"/>
+                <w:sz w:val="20"/>
+              </w:rPr>
+              <w:t>shared/repository.ts</w:t>
+            </w:r>
+          </w:p>
+        </w:tc>
+        <w:tc>
+          <w:tcPr>
+            <w:tcW w:type="dxa" w:w="3120"/>
+            <w:shd w:val="clear" w:color="auto" w:fill="EAF1F8"/>
+          </w:tcPr>
+          <w:p>
+            <w:r/>
+            <w:r>
+              <w:rPr>
+                <w:rFonts w:ascii="宋体" w:hAnsi="宋体" w:eastAsia="宋体"/>
+                <w:b w:val="0"/>
+                <w:i w:val="0"/>
+                <w:sz w:val="20"/>
+              </w:rPr>
+              <w:t>修改</w:t>
+            </w:r>
+          </w:p>
+        </w:tc>
+        <w:tc>
+          <w:tcPr>
+            <w:tcW w:type="dxa" w:w="3120"/>
+            <w:shd w:val="clear" w:color="auto" w:fill="EAF1F8"/>
+          </w:tcPr>
+          <w:p>
+            <w:r/>
+            <w:r>
+              <w:rPr>
+                <w:rFonts w:ascii="宋体" w:hAnsi="宋体" w:eastAsia="宋体"/>
+                <w:b w:val="0"/>
+                <w:i w:val="0"/>
+                <w:sz w:val="20"/>
+              </w:rPr>
+              <w:t>Repository 增加 findIdempotencyKey / saveIdempotencyKey</w:t>
+            </w:r>
+          </w:p>
+        </w:tc>
+      </w:tr>
+      <w:tr>
+        <w:tc>
+          <w:tcPr>
+            <w:tcW w:type="dxa" w:w="3120"/>
+          </w:tcPr>
+          <w:p>
+            <w:r/>
+            <w:r>
+              <w:rPr>
+                <w:rFonts w:ascii="宋体" w:hAnsi="宋体" w:eastAsia="宋体"/>
+                <w:b w:val="0"/>
+                <w:i w:val="0"/>
+                <w:sz w:val="20"/>
+              </w:rPr>
+              <w:t>shared/repository-memory.ts</w:t>
+            </w:r>
+          </w:p>
+        </w:tc>
+        <w:tc>
+          <w:tcPr>
+            <w:tcW w:type="dxa" w:w="3120"/>
+          </w:tcPr>
+          <w:p>
+            <w:r/>
+            <w:r>
+              <w:rPr>
+                <w:rFonts w:ascii="宋体" w:hAnsi="宋体" w:eastAsia="宋体"/>
+                <w:b w:val="0"/>
+                <w:i w:val="0"/>
+                <w:sz w:val="20"/>
+              </w:rPr>
+              <w:t>修改</w:t>
+            </w:r>
+          </w:p>
+        </w:tc>
+        <w:tc>
+          <w:tcPr>
+            <w:tcW w:type="dxa" w:w="3120"/>
+          </w:tcPr>
+          <w:p>
+            <w:r/>
+            <w:r>
+              <w:rPr>
+                <w:rFonts w:ascii="宋体" w:hAnsi="宋体" w:eastAsia="宋体"/>
+                <w:b w:val="0"/>
+                <w:i w:val="0"/>
+                <w:sz w:val="20"/>
+              </w:rPr>
+              <w:t>内存实现幂等键存取</w:t>
+            </w:r>
+          </w:p>
+        </w:tc>
+      </w:tr>
+      <w:tr>
+        <w:tc>
+          <w:tcPr>
+            <w:tcW w:type="dxa" w:w="3120"/>
+            <w:shd w:val="clear" w:color="auto" w:fill="EAF1F8"/>
+          </w:tcPr>
+          <w:p>
+            <w:r/>
+            <w:r>
+              <w:rPr>
+                <w:rFonts w:ascii="宋体" w:hAnsi="宋体" w:eastAsia="宋体"/>
+                <w:b w:val="0"/>
+                <w:i w:val="0"/>
+                <w:sz w:val="20"/>
+              </w:rPr>
+              <w:t>shared/services/profile-service.ts</w:t>
+            </w:r>
+          </w:p>
+        </w:tc>
+        <w:tc>
+          <w:tcPr>
+            <w:tcW w:type="dxa" w:w="3120"/>
+            <w:shd w:val="clear" w:color="auto" w:fill="EAF1F8"/>
+          </w:tcPr>
+          <w:p>
+            <w:r/>
+            <w:r>
+              <w:rPr>
+                <w:rFonts w:ascii="宋体" w:hAnsi="宋体" w:eastAsia="宋体"/>
+                <w:b w:val="0"/>
+                <w:i w:val="0"/>
+                <w:sz w:val="20"/>
+              </w:rPr>
+              <w:t>修改</w:t>
+            </w:r>
+          </w:p>
+        </w:tc>
+        <w:tc>
+          <w:tcPr>
+            <w:tcW w:type="dxa" w:w="3120"/>
+            <w:shd w:val="clear" w:color="auto" w:fill="EAF1F8"/>
+          </w:tcPr>
+          <w:p>
+            <w:r/>
+            <w:r>
+              <w:rPr>
+                <w:rFonts w:ascii="宋体" w:hAnsi="宋体" w:eastAsia="宋体"/>
+                <w:b w:val="0"/>
+                <w:i w:val="0"/>
+                <w:sz w:val="20"/>
+              </w:rPr>
+              <w:t>移除姓名去重；createProfile 支持 requestId 幂等；ClientProfile 增 isDefault；toClientProfile 计算 isDefault</w:t>
+            </w:r>
+          </w:p>
+        </w:tc>
+      </w:tr>
+      <w:tr>
+        <w:tc>
+          <w:tcPr>
+            <w:tcW w:type="dxa" w:w="3120"/>
+          </w:tcPr>
+          <w:p>
+            <w:r/>
+            <w:r>
+              <w:rPr>
+                <w:rFonts w:ascii="宋体" w:hAnsi="宋体" w:eastAsia="宋体"/>
+                <w:b w:val="0"/>
+                <w:i w:val="0"/>
+                <w:sz w:val="20"/>
+              </w:rPr>
+              <w:t>cloudfunctions/profileApi/cloudbase-repository.js</w:t>
+            </w:r>
+          </w:p>
+        </w:tc>
+        <w:tc>
+          <w:tcPr>
+            <w:tcW w:type="dxa" w:w="3120"/>
+          </w:tcPr>
+          <w:p>
+            <w:r/>
+            <w:r>
+              <w:rPr>
+                <w:rFonts w:ascii="宋体" w:hAnsi="宋体" w:eastAsia="宋体"/>
+                <w:b w:val="0"/>
+                <w:i w:val="0"/>
+                <w:sz w:val="20"/>
+              </w:rPr>
+              <w:t>修改</w:t>
+            </w:r>
+          </w:p>
+        </w:tc>
+        <w:tc>
+          <w:tcPr>
+            <w:tcW w:type="dxa" w:w="3120"/>
+          </w:tcPr>
+          <w:p>
+            <w:r/>
+            <w:r>
+              <w:rPr>
+                <w:rFonts w:ascii="宋体" w:hAnsi="宋体" w:eastAsia="宋体"/>
+                <w:b w:val="0"/>
+                <w:i w:val="0"/>
+                <w:sz w:val="20"/>
+              </w:rPr>
+              <w:t>idempotency_keys 集合的查/写实现</w:t>
+            </w:r>
+          </w:p>
+        </w:tc>
+      </w:tr>
+      <w:tr>
+        <w:tc>
+          <w:tcPr>
+            <w:tcW w:type="dxa" w:w="3120"/>
+            <w:shd w:val="clear" w:color="auto" w:fill="EAF1F8"/>
+          </w:tcPr>
+          <w:p>
+            <w:r/>
+            <w:r>
+              <w:rPr>
+                <w:rFonts w:ascii="宋体" w:hAnsi="宋体" w:eastAsia="宋体"/>
+                <w:b w:val="0"/>
+                <w:i w:val="0"/>
+                <w:sz w:val="20"/>
+              </w:rPr>
+              <w:t>cloudfunctions/profileApi/index.js</w:t>
+            </w:r>
+          </w:p>
+        </w:tc>
+        <w:tc>
+          <w:tcPr>
+            <w:tcW w:type="dxa" w:w="3120"/>
+            <w:shd w:val="clear" w:color="auto" w:fill="EAF1F8"/>
+          </w:tcPr>
+          <w:p>
+            <w:r/>
+            <w:r>
+              <w:rPr>
+                <w:rFonts w:ascii="宋体" w:hAnsi="宋体" w:eastAsia="宋体"/>
+                <w:b w:val="0"/>
+                <w:i w:val="0"/>
+                <w:sz w:val="20"/>
+              </w:rPr>
+              <w:t>修改</w:t>
+            </w:r>
+          </w:p>
+        </w:tc>
+        <w:tc>
+          <w:tcPr>
+            <w:tcW w:type="dxa" w:w="3120"/>
+            <w:shd w:val="clear" w:color="auto" w:fill="EAF1F8"/>
+          </w:tcPr>
+          <w:p>
+            <w:r/>
+            <w:r>
+              <w:rPr>
+                <w:rFonts w:ascii="宋体" w:hAnsi="宋体" w:eastAsia="宋体"/>
+                <w:b w:val="0"/>
+                <w:i w:val="0"/>
+                <w:sz w:val="20"/>
+              </w:rPr>
+              <w:t>currentDefaultId 助手；各分支传入 defaultId；create 透传 requestId</w:t>
+            </w:r>
+          </w:p>
+        </w:tc>
+      </w:tr>
+      <w:tr>
+        <w:tc>
+          <w:tcPr>
+            <w:tcW w:type="dxa" w:w="3120"/>
+          </w:tcPr>
+          <w:p>
+            <w:r/>
+            <w:r>
+              <w:rPr>
+                <w:rFonts w:ascii="宋体" w:hAnsi="宋体" w:eastAsia="宋体"/>
+                <w:b w:val="0"/>
+                <w:i w:val="0"/>
+                <w:sz w:val="20"/>
+              </w:rPr>
+              <w:t>cloudfunctions/login/cloudbase-repository.js</w:t>
+            </w:r>
+          </w:p>
+        </w:tc>
+        <w:tc>
+          <w:tcPr>
+            <w:tcW w:type="dxa" w:w="3120"/>
+          </w:tcPr>
+          <w:p>
+            <w:r/>
+            <w:r>
+              <w:rPr>
+                <w:rFonts w:ascii="宋体" w:hAnsi="宋体" w:eastAsia="宋体"/>
+                <w:b w:val="0"/>
+                <w:i w:val="0"/>
+                <w:sz w:val="20"/>
+              </w:rPr>
+              <w:t>修改</w:t>
+            </w:r>
+          </w:p>
+        </w:tc>
+        <w:tc>
+          <w:tcPr>
+            <w:tcW w:type="dxa" w:w="3120"/>
+          </w:tcPr>
+          <w:p>
+            <w:r/>
+            <w:r>
+              <w:rPr>
+                <w:rFonts w:ascii="宋体" w:hAnsi="宋体" w:eastAsia="宋体"/>
+                <w:b w:val="0"/>
+                <w:i w:val="0"/>
+                <w:sz w:val="20"/>
+              </w:rPr>
+              <w:t>接口对齐补齐幂等键方法</w:t>
+            </w:r>
+          </w:p>
+        </w:tc>
+      </w:tr>
+      <w:tr>
+        <w:tc>
+          <w:tcPr>
+            <w:tcW w:type="dxa" w:w="3120"/>
+            <w:shd w:val="clear" w:color="auto" w:fill="EAF1F8"/>
+          </w:tcPr>
+          <w:p>
+            <w:r/>
+            <w:r>
+              <w:rPr>
+                <w:rFonts w:ascii="宋体" w:hAnsi="宋体" w:eastAsia="宋体"/>
+                <w:b w:val="0"/>
+                <w:i w:val="0"/>
+                <w:sz w:val="20"/>
+              </w:rPr>
+              <w:t>typings/index.d.ts</w:t>
+            </w:r>
+          </w:p>
+        </w:tc>
+        <w:tc>
+          <w:tcPr>
+            <w:tcW w:type="dxa" w:w="3120"/>
+            <w:shd w:val="clear" w:color="auto" w:fill="EAF1F8"/>
+          </w:tcPr>
+          <w:p>
+            <w:r/>
+            <w:r>
+              <w:rPr>
+                <w:rFonts w:ascii="宋体" w:hAnsi="宋体" w:eastAsia="宋体"/>
+                <w:b w:val="0"/>
+                <w:i w:val="0"/>
+                <w:sz w:val="20"/>
+              </w:rPr>
+              <w:t>修改</w:t>
+            </w:r>
+          </w:p>
+        </w:tc>
+        <w:tc>
+          <w:tcPr>
+            <w:tcW w:type="dxa" w:w="3120"/>
+            <w:shd w:val="clear" w:color="auto" w:fill="EAF1F8"/>
+          </w:tcPr>
+          <w:p>
+            <w:r/>
+            <w:r>
+              <w:rPr>
+                <w:rFonts w:ascii="宋体" w:hAnsi="宋体" w:eastAsia="宋体"/>
+                <w:b w:val="0"/>
+                <w:i w:val="0"/>
+                <w:sz w:val="20"/>
+              </w:rPr>
+              <w:t>ClientFamilyProfile 增 isDefault（服务端计算）</w:t>
+            </w:r>
+          </w:p>
+        </w:tc>
+      </w:tr>
+      <w:tr>
+        <w:tc>
+          <w:tcPr>
+            <w:tcW w:type="dxa" w:w="3120"/>
+          </w:tcPr>
+          <w:p>
+            <w:r/>
+            <w:r>
+              <w:rPr>
+                <w:rFonts w:ascii="宋体" w:hAnsi="宋体" w:eastAsia="宋体"/>
+                <w:b w:val="0"/>
+                <w:i w:val="0"/>
+                <w:sz w:val="20"/>
+              </w:rPr>
+              <w:t>miniprogram/services/profile.ts</w:t>
+            </w:r>
+          </w:p>
+        </w:tc>
+        <w:tc>
+          <w:tcPr>
+            <w:tcW w:type="dxa" w:w="3120"/>
+          </w:tcPr>
+          <w:p>
+            <w:r/>
+            <w:r>
+              <w:rPr>
+                <w:rFonts w:ascii="宋体" w:hAnsi="宋体" w:eastAsia="宋体"/>
+                <w:b w:val="0"/>
+                <w:i w:val="0"/>
+                <w:sz w:val="20"/>
+              </w:rPr>
+              <w:t>修改</w:t>
+            </w:r>
+          </w:p>
+        </w:tc>
+        <w:tc>
+          <w:tcPr>
+            <w:tcW w:type="dxa" w:w="3120"/>
+          </w:tcPr>
+          <w:p>
+            <w:r/>
+            <w:r>
+              <w:rPr>
+                <w:rFonts w:ascii="宋体" w:hAnsi="宋体" w:eastAsia="宋体"/>
+                <w:b w:val="0"/>
+                <w:i w:val="0"/>
+                <w:sz w:val="20"/>
+              </w:rPr>
+              <w:t>newRequestId()；createProfile 传 requestId</w:t>
+            </w:r>
+          </w:p>
+        </w:tc>
+      </w:tr>
+      <w:tr>
+        <w:tc>
+          <w:tcPr>
+            <w:tcW w:type="dxa" w:w="3120"/>
+            <w:shd w:val="clear" w:color="auto" w:fill="EAF1F8"/>
+          </w:tcPr>
+          <w:p>
+            <w:r/>
+            <w:r>
+              <w:rPr>
+                <w:rFonts w:ascii="宋体" w:hAnsi="宋体" w:eastAsia="宋体"/>
+                <w:b w:val="0"/>
+                <w:i w:val="0"/>
+                <w:sz w:val="20"/>
+              </w:rPr>
+              <w:t>miniprogram/pages/profile-edit/profile-edit.ts</w:t>
+            </w:r>
+          </w:p>
+        </w:tc>
+        <w:tc>
+          <w:tcPr>
+            <w:tcW w:type="dxa" w:w="3120"/>
+            <w:shd w:val="clear" w:color="auto" w:fill="EAF1F8"/>
+          </w:tcPr>
+          <w:p>
+            <w:r/>
+            <w:r>
+              <w:rPr>
+                <w:rFonts w:ascii="宋体" w:hAnsi="宋体" w:eastAsia="宋体"/>
+                <w:b w:val="0"/>
+                <w:i w:val="0"/>
+                <w:sz w:val="20"/>
+              </w:rPr>
+              <w:t>修改</w:t>
+            </w:r>
+          </w:p>
+        </w:tc>
+        <w:tc>
+          <w:tcPr>
+            <w:tcW w:type="dxa" w:w="3120"/>
+            <w:shd w:val="clear" w:color="auto" w:fill="EAF1F8"/>
+          </w:tcPr>
+          <w:p>
+            <w:r/>
+            <w:r>
+              <w:rPr>
+                <w:rFonts w:ascii="宋体" w:hAnsi="宋体" w:eastAsia="宋体"/>
+                <w:b w:val="0"/>
+                <w:i w:val="0"/>
+                <w:sz w:val="20"/>
+              </w:rPr>
+              <w:t>onLoad 生成 createRequestId；onSubmit 透传</w:t>
+            </w:r>
+          </w:p>
+        </w:tc>
+      </w:tr>
+      <w:tr>
+        <w:tc>
+          <w:tcPr>
+            <w:tcW w:type="dxa" w:w="3120"/>
+          </w:tcPr>
+          <w:p>
+            <w:r/>
+            <w:r>
+              <w:rPr>
+                <w:rFonts w:ascii="宋体" w:hAnsi="宋体" w:eastAsia="宋体"/>
+                <w:b w:val="0"/>
+                <w:i w:val="0"/>
+                <w:sz w:val="20"/>
+              </w:rPr>
+              <w:t>scripts/validate.mjs</w:t>
+            </w:r>
+          </w:p>
+        </w:tc>
+        <w:tc>
+          <w:tcPr>
+            <w:tcW w:type="dxa" w:w="3120"/>
+          </w:tcPr>
+          <w:p>
+            <w:r/>
+            <w:r>
+              <w:rPr>
+                <w:rFonts w:ascii="宋体" w:hAnsi="宋体" w:eastAsia="宋体"/>
+                <w:b w:val="0"/>
+                <w:i w:val="0"/>
+                <w:sz w:val="20"/>
+              </w:rPr>
+              <w:t>修改</w:t>
+            </w:r>
+          </w:p>
+        </w:tc>
+        <w:tc>
+          <w:tcPr>
+            <w:tcW w:type="dxa" w:w="3120"/>
+          </w:tcPr>
+          <w:p>
+            <w:r/>
+            <w:r>
+              <w:rPr>
+                <w:rFonts w:ascii="宋体" w:hAnsi="宋体" w:eastAsia="宋体"/>
+                <w:b w:val="0"/>
+                <w:i w:val="0"/>
+                <w:sz w:val="20"/>
+              </w:rPr>
+              <w:t>以 14a/14b/14c + 15a–15f 替换原姓名去重测试；打包/卫生测试重编号 16a–d / 17</w:t>
+            </w:r>
+          </w:p>
+        </w:tc>
+      </w:tr>
+      <w:tr>
+        <w:tc>
+          <w:tcPr>
+            <w:tcW w:type="dxa" w:w="3120"/>
+            <w:shd w:val="clear" w:color="auto" w:fill="EAF1F8"/>
+          </w:tcPr>
+          <w:p>
+            <w:r/>
+            <w:r>
+              <w:rPr>
+                <w:rFonts w:ascii="宋体" w:hAnsi="宋体" w:eastAsia="宋体"/>
+                <w:b w:val="0"/>
+                <w:i w:val="0"/>
+                <w:sz w:val="20"/>
+              </w:rPr>
+              <w:t>docs/DATA_MODEL.md</w:t>
+            </w:r>
+          </w:p>
+        </w:tc>
+        <w:tc>
+          <w:tcPr>
+            <w:tcW w:type="dxa" w:w="3120"/>
+            <w:shd w:val="clear" w:color="auto" w:fill="EAF1F8"/>
+          </w:tcPr>
+          <w:p>
+            <w:r/>
+            <w:r>
+              <w:rPr>
+                <w:rFonts w:ascii="宋体" w:hAnsi="宋体" w:eastAsia="宋体"/>
+                <w:b w:val="0"/>
+                <w:i w:val="0"/>
+                <w:sz w:val="20"/>
+              </w:rPr>
+              <w:t>修改</w:t>
+            </w:r>
+          </w:p>
+        </w:tc>
+        <w:tc>
+          <w:tcPr>
+            <w:tcW w:type="dxa" w:w="3120"/>
+            <w:shd w:val="clear" w:color="auto" w:fill="EAF1F8"/>
+          </w:tcPr>
+          <w:p>
+            <w:r/>
+            <w:r>
+              <w:rPr>
+                <w:rFonts w:ascii="宋体" w:hAnsi="宋体" w:eastAsia="宋体"/>
+                <w:b w:val="0"/>
+                <w:i w:val="0"/>
+                <w:sz w:val="20"/>
+              </w:rPr>
+              <w:t>idempotency_keys、默认 SSoT、移除姓名去重</w:t>
+            </w:r>
+          </w:p>
+        </w:tc>
+      </w:tr>
+      <w:tr>
+        <w:tc>
+          <w:tcPr>
+            <w:tcW w:type="dxa" w:w="3120"/>
+          </w:tcPr>
+          <w:p>
+            <w:r/>
+            <w:r>
+              <w:rPr>
+                <w:rFonts w:ascii="宋体" w:hAnsi="宋体" w:eastAsia="宋体"/>
+                <w:b w:val="0"/>
+                <w:i w:val="0"/>
+                <w:sz w:val="20"/>
+              </w:rPr>
+              <w:t>docs/ARCHITECTURE.md</w:t>
+            </w:r>
+          </w:p>
+        </w:tc>
+        <w:tc>
+          <w:tcPr>
+            <w:tcW w:type="dxa" w:w="3120"/>
+          </w:tcPr>
+          <w:p>
+            <w:r/>
+            <w:r>
+              <w:rPr>
+                <w:rFonts w:ascii="宋体" w:hAnsi="宋体" w:eastAsia="宋体"/>
+                <w:b w:val="0"/>
+                <w:i w:val="0"/>
+                <w:sz w:val="20"/>
+              </w:rPr>
+              <w:t>修改</w:t>
+            </w:r>
+          </w:p>
+        </w:tc>
+        <w:tc>
+          <w:tcPr>
+            <w:tcW w:type="dxa" w:w="3120"/>
+          </w:tcPr>
+          <w:p>
+            <w:r/>
+            <w:r>
+              <w:rPr>
+                <w:rFonts w:ascii="宋体" w:hAnsi="宋体" w:eastAsia="宋体"/>
+                <w:b w:val="0"/>
+                <w:i w:val="0"/>
+                <w:sz w:val="20"/>
+              </w:rPr>
+              <w:t>§5b 幂等与默认 SSoT、§12 M1.1 决策、集合/索引表</w:t>
+            </w:r>
+          </w:p>
+        </w:tc>
+      </w:tr>
+      <w:tr>
+        <w:tc>
+          <w:tcPr>
+            <w:tcW w:type="dxa" w:w="3120"/>
+            <w:shd w:val="clear" w:color="auto" w:fill="EAF1F8"/>
+          </w:tcPr>
+          <w:p>
+            <w:r/>
+            <w:r>
+              <w:rPr>
+                <w:rFonts w:ascii="宋体" w:hAnsi="宋体" w:eastAsia="宋体"/>
+                <w:b w:val="0"/>
+                <w:i w:val="0"/>
+                <w:sz w:val="20"/>
+              </w:rPr>
+              <w:t>docs/USER_FLOWS.md</w:t>
+            </w:r>
+          </w:p>
+        </w:tc>
+        <w:tc>
+          <w:tcPr>
+            <w:tcW w:type="dxa" w:w="3120"/>
+            <w:shd w:val="clear" w:color="auto" w:fill="EAF1F8"/>
+          </w:tcPr>
+          <w:p>
+            <w:r/>
+            <w:r>
+              <w:rPr>
+                <w:rFonts w:ascii="宋体" w:hAnsi="宋体" w:eastAsia="宋体"/>
+                <w:b w:val="0"/>
+                <w:i w:val="0"/>
+                <w:sz w:val="20"/>
+              </w:rPr>
+              <w:t>修改</w:t>
+            </w:r>
+          </w:p>
+        </w:tc>
+        <w:tc>
+          <w:tcPr>
+            <w:tcW w:type="dxa" w:w="3120"/>
+            <w:shd w:val="clear" w:color="auto" w:fill="EAF1F8"/>
+          </w:tcPr>
+          <w:p>
+            <w:r/>
+            <w:r>
+              <w:rPr>
+                <w:rFonts w:ascii="宋体" w:hAnsi="宋体" w:eastAsia="宋体"/>
+                <w:b w:val="0"/>
+                <w:i w:val="0"/>
+                <w:sz w:val="20"/>
+              </w:rPr>
+              <w:t>创建流程 requestId、允许重名、默认计算与回退</w:t>
+            </w:r>
+          </w:p>
+        </w:tc>
+      </w:tr>
+      <w:tr>
+        <w:tc>
+          <w:tcPr>
+            <w:tcW w:type="dxa" w:w="3120"/>
+          </w:tcPr>
+          <w:p>
+            <w:r/>
+            <w:r>
+              <w:rPr>
+                <w:rFonts w:ascii="宋体" w:hAnsi="宋体" w:eastAsia="宋体"/>
+                <w:b w:val="0"/>
+                <w:i w:val="0"/>
+                <w:sz w:val="20"/>
+              </w:rPr>
+              <w:t>docs/SECURITY.md</w:t>
+            </w:r>
+          </w:p>
+        </w:tc>
+        <w:tc>
+          <w:tcPr>
+            <w:tcW w:type="dxa" w:w="3120"/>
+          </w:tcPr>
+          <w:p>
+            <w:r/>
+            <w:r>
+              <w:rPr>
+                <w:rFonts w:ascii="宋体" w:hAnsi="宋体" w:eastAsia="宋体"/>
+                <w:b w:val="0"/>
+                <w:i w:val="0"/>
+                <w:sz w:val="20"/>
+              </w:rPr>
+              <w:t>修改</w:t>
+            </w:r>
+          </w:p>
+        </w:tc>
+        <w:tc>
+          <w:tcPr>
+            <w:tcW w:type="dxa" w:w="3120"/>
+          </w:tcPr>
+          <w:p>
+            <w:r/>
+            <w:r>
+              <w:rPr>
+                <w:rFonts w:ascii="宋体" w:hAnsi="宋体" w:eastAsia="宋体"/>
+                <w:b w:val="0"/>
+                <w:i w:val="0"/>
+                <w:sz w:val="20"/>
+              </w:rPr>
+              <w:t>集合/索引、创建幂等与默认 SSoT 说明</w:t>
+            </w:r>
+          </w:p>
+        </w:tc>
+      </w:tr>
+      <w:tr>
+        <w:tc>
+          <w:tcPr>
+            <w:tcW w:type="dxa" w:w="3120"/>
+            <w:shd w:val="clear" w:color="auto" w:fill="EAF1F8"/>
+          </w:tcPr>
+          <w:p>
+            <w:r/>
+            <w:r>
+              <w:rPr>
+                <w:rFonts w:ascii="宋体" w:hAnsi="宋体" w:eastAsia="宋体"/>
+                <w:b w:val="0"/>
+                <w:i w:val="0"/>
+                <w:sz w:val="20"/>
+              </w:rPr>
+              <w:t>build_m1_report.py / 报告</w:t>
+            </w:r>
+          </w:p>
+        </w:tc>
+        <w:tc>
+          <w:tcPr>
+            <w:tcW w:type="dxa" w:w="3120"/>
+            <w:shd w:val="clear" w:color="auto" w:fill="EAF1F8"/>
+          </w:tcPr>
+          <w:p>
+            <w:r/>
+            <w:r>
+              <w:rPr>
+                <w:rFonts w:ascii="宋体" w:hAnsi="宋体" w:eastAsia="宋体"/>
+                <w:b w:val="0"/>
+                <w:i w:val="0"/>
+                <w:sz w:val="20"/>
+              </w:rPr>
+              <w:t>修改</w:t>
+            </w:r>
+          </w:p>
+        </w:tc>
+        <w:tc>
+          <w:tcPr>
+            <w:tcW w:type="dxa" w:w="3120"/>
+            <w:shd w:val="clear" w:color="auto" w:fill="EAF1F8"/>
+          </w:tcPr>
+          <w:p>
+            <w:r/>
+            <w:r>
+              <w:rPr>
+                <w:rFonts w:ascii="宋体" w:hAnsi="宋体" w:eastAsia="宋体"/>
+                <w:b w:val="0"/>
+                <w:i w:val="0"/>
+                <w:sz w:val="20"/>
+              </w:rPr>
+              <w:t>并入 M1.1 修正、测试状态与 git 复核</w:t>
+            </w:r>
+          </w:p>
+        </w:tc>
+      </w:tr>
+    </w:tbl>
+    <w:p/>
+    <w:p>
+      <w:pPr>
+        <w:spacing w:before="120" w:after="60"/>
+      </w:pPr>
+      <w:r>
+        <w:rPr>
+          <w:rFonts w:ascii="宋体" w:hAnsi="宋体" w:eastAsia="宋体"/>
+          <w:b/>
+          <w:i w:val="0"/>
+          <w:color w:val="2B5C8F"/>
+          <w:sz w:val="25"/>
+        </w:rPr>
+        <w:t>16.4 合并就绪结论</w:t>
+      </w:r>
+    </w:p>
+    <w:p>
+      <w:pPr>
+        <w:spacing w:after="120"/>
+      </w:pPr>
+      <w:r>
+        <w:rPr>
+          <w:rFonts w:ascii="宋体" w:hAnsi="宋体" w:eastAsia="宋体"/>
+          <w:b w:val="0"/>
+          <w:i w:val="0"/>
+          <w:sz w:val="24"/>
+        </w:rPr>
+        <w:t>两处设计修正均已完成并通过自动化验收（91/91）。分支 feature/m1-identity-family-profiles 具备合入 main 的条件；唯一待办为产品负责人在 DevTools / 真机环境执行手动冒烟（见第 17 节，含精确步骤）——该项无法在当前自动化环境代为执行，故以「待执行」明确标注，不影响代码层面的合并就绪判定。</w:t>
+      </w:r>
+    </w:p>
+    <w:p>
+      <w:pPr>
+        <w:spacing w:before="200" w:after="120"/>
+      </w:pPr>
+      <w:r>
+        <w:rPr>
+          <w:rFonts w:ascii="宋体" w:hAnsi="宋体" w:eastAsia="宋体"/>
+          <w:b/>
+          <w:i w:val="0"/>
+          <w:color w:val="1A3A6B"/>
+          <w:sz w:val="30"/>
+        </w:rPr>
+        <w:t>17. 测试状态（自动化 / DevTools 手动 / 真机）</w:t>
+      </w:r>
+    </w:p>
+    <w:p>
+      <w:pPr>
+        <w:spacing w:after="120"/>
+      </w:pPr>
+      <w:r>
+        <w:rPr>
+          <w:rFonts w:ascii="宋体" w:hAnsi="宋体" w:eastAsia="宋体"/>
+          <w:b w:val="0"/>
+          <w:i w:val="0"/>
+          <w:sz w:val="24"/>
+        </w:rPr>
+        <w:t>按要求严格区分三类测试的执行状态，避免将未执行项报告为已通过：</w:t>
+      </w:r>
+    </w:p>
+    <w:tbl>
+      <w:tblPr>
+        <w:tblStyle w:val="TableGrid"/>
+        <w:tblW w:type="auto" w:w="0"/>
+        <w:jc w:val="center"/>
+        <w:tblLook w:firstColumn="1" w:firstRow="1" w:lastColumn="0" w:lastRow="0" w:noHBand="0" w:noVBand="1" w:val="04A0"/>
+      </w:tblPr>
+      <w:tblGrid>
+        <w:gridCol w:w="2880"/>
+        <w:gridCol w:w="2880"/>
+        <w:gridCol w:w="2880"/>
+      </w:tblGrid>
+      <w:tr>
+        <w:tc>
+          <w:tcPr>
+            <w:tcW w:type="dxa" w:w="3120"/>
+            <w:shd w:val="clear" w:color="auto" w:fill="2B5C8F"/>
+          </w:tcPr>
+          <w:p>
+            <w:r/>
+            <w:r>
+              <w:rPr>
+                <w:rFonts w:ascii="宋体" w:hAnsi="宋体" w:eastAsia="宋体"/>
+                <w:b/>
+                <w:i w:val="0"/>
+                <w:color w:val="FFFFFF"/>
+                <w:sz w:val="21"/>
+              </w:rPr>
+              <w:t>类别</w:t>
+            </w:r>
+          </w:p>
+        </w:tc>
+        <w:tc>
+          <w:tcPr>
+            <w:tcW w:type="dxa" w:w="3120"/>
+            <w:shd w:val="clear" w:color="auto" w:fill="2B5C8F"/>
+          </w:tcPr>
+          <w:p>
+            <w:r/>
+            <w:r>
+              <w:rPr>
+                <w:rFonts w:ascii="宋体" w:hAnsi="宋体" w:eastAsia="宋体"/>
+                <w:b/>
+                <w:i w:val="0"/>
+                <w:color w:val="FFFFFF"/>
+                <w:sz w:val="21"/>
+              </w:rPr>
+              <w:t>状态</w:t>
+            </w:r>
+          </w:p>
+        </w:tc>
+        <w:tc>
+          <w:tcPr>
+            <w:tcW w:type="dxa" w:w="3120"/>
+            <w:shd w:val="clear" w:color="auto" w:fill="2B5C8F"/>
+          </w:tcPr>
+          <w:p>
+            <w:r/>
+            <w:r>
+              <w:rPr>
+                <w:rFonts w:ascii="宋体" w:hAnsi="宋体" w:eastAsia="宋体"/>
+                <w:b/>
+                <w:i w:val="0"/>
+                <w:color w:val="FFFFFF"/>
+                <w:sz w:val="21"/>
+              </w:rPr>
+              <w:t>说明</w:t>
+            </w:r>
+          </w:p>
+        </w:tc>
+      </w:tr>
+      <w:tr>
+        <w:tc>
+          <w:tcPr>
+            <w:tcW w:type="dxa" w:w="3120"/>
+          </w:tcPr>
+          <w:p>
+            <w:r/>
+            <w:r>
+              <w:rPr>
+                <w:rFonts w:ascii="宋体" w:hAnsi="宋体" w:eastAsia="宋体"/>
+                <w:b w:val="0"/>
+                <w:i w:val="0"/>
+                <w:sz w:val="20"/>
+              </w:rPr>
+              <w:t>自动化测试（npm run validate）</w:t>
+            </w:r>
+          </w:p>
+        </w:tc>
+        <w:tc>
+          <w:tcPr>
+            <w:tcW w:type="dxa" w:w="3120"/>
+          </w:tcPr>
+          <w:p>
+            <w:r/>
+            <w:r>
+              <w:rPr>
+                <w:rFonts w:ascii="宋体" w:hAnsi="宋体" w:eastAsia="宋体"/>
+                <w:b w:val="0"/>
+                <w:i w:val="0"/>
+                <w:sz w:val="20"/>
+              </w:rPr>
+              <w:t>✅ 已执行并通过</w:t>
+            </w:r>
+          </w:p>
+        </w:tc>
+        <w:tc>
+          <w:tcPr>
+            <w:tcW w:type="dxa" w:w="3120"/>
+          </w:tcPr>
+          <w:p>
+            <w:r/>
+            <w:r>
+              <w:rPr>
+                <w:rFonts w:ascii="宋体" w:hAnsi="宋体" w:eastAsia="宋体"/>
+                <w:b w:val="0"/>
+                <w:i w:val="0"/>
+                <w:sz w:val="20"/>
+              </w:rPr>
+              <w:t>91/91；含 M1.1 的 14a–c、15a–f</w:t>
+            </w:r>
+          </w:p>
+        </w:tc>
+      </w:tr>
+      <w:tr>
+        <w:tc>
+          <w:tcPr>
+            <w:tcW w:type="dxa" w:w="3120"/>
+            <w:shd w:val="clear" w:color="auto" w:fill="EAF1F8"/>
+          </w:tcPr>
+          <w:p>
+            <w:r/>
+            <w:r>
+              <w:rPr>
+                <w:rFonts w:ascii="宋体" w:hAnsi="宋体" w:eastAsia="宋体"/>
+                <w:b w:val="0"/>
+                <w:i w:val="0"/>
+                <w:sz w:val="20"/>
+              </w:rPr>
+              <w:t>DevTools 手动测试</w:t>
+            </w:r>
+          </w:p>
+        </w:tc>
+        <w:tc>
+          <w:tcPr>
+            <w:tcW w:type="dxa" w:w="3120"/>
+            <w:shd w:val="clear" w:color="auto" w:fill="EAF1F8"/>
+          </w:tcPr>
+          <w:p>
+            <w:r/>
+            <w:r>
+              <w:rPr>
+                <w:rFonts w:ascii="宋体" w:hAnsi="宋体" w:eastAsia="宋体"/>
+                <w:b w:val="0"/>
+                <w:i w:val="0"/>
+                <w:sz w:val="20"/>
+              </w:rPr>
+              <w:t>⏳ 待执行（产品负责人）</w:t>
+            </w:r>
+          </w:p>
+        </w:tc>
+        <w:tc>
+          <w:tcPr>
+            <w:tcW w:type="dxa" w:w="3120"/>
+            <w:shd w:val="clear" w:color="auto" w:fill="EAF1F8"/>
+          </w:tcPr>
+          <w:p>
+            <w:r/>
+            <w:r>
+              <w:rPr>
+                <w:rFonts w:ascii="宋体" w:hAnsi="宋体" w:eastAsia="宋体"/>
+                <w:b w:val="0"/>
+                <w:i w:val="0"/>
+                <w:sz w:val="20"/>
+              </w:rPr>
+              <w:t>需微信开发者工具环境，自动化环境无法代跑</w:t>
+            </w:r>
+          </w:p>
+        </w:tc>
+      </w:tr>
+      <w:tr>
+        <w:tc>
+          <w:tcPr>
+            <w:tcW w:type="dxa" w:w="3120"/>
+          </w:tcPr>
+          <w:p>
+            <w:r/>
+            <w:r>
+              <w:rPr>
+                <w:rFonts w:ascii="宋体" w:hAnsi="宋体" w:eastAsia="宋体"/>
+                <w:b w:val="0"/>
+                <w:i w:val="0"/>
+                <w:sz w:val="20"/>
+              </w:rPr>
+              <w:t>真机测试</w:t>
+            </w:r>
+          </w:p>
+        </w:tc>
+        <w:tc>
+          <w:tcPr>
+            <w:tcW w:type="dxa" w:w="3120"/>
+          </w:tcPr>
+          <w:p>
+            <w:r/>
+            <w:r>
+              <w:rPr>
+                <w:rFonts w:ascii="宋体" w:hAnsi="宋体" w:eastAsia="宋体"/>
+                <w:b w:val="0"/>
+                <w:i w:val="0"/>
+                <w:sz w:val="20"/>
+              </w:rPr>
+              <w:t>⏳ 待执行（产品负责人）</w:t>
+            </w:r>
+          </w:p>
+        </w:tc>
+        <w:tc>
+          <w:tcPr>
+            <w:tcW w:type="dxa" w:w="3120"/>
+          </w:tcPr>
+          <w:p>
+            <w:r/>
+            <w:r>
+              <w:rPr>
+                <w:rFonts w:ascii="宋体" w:hAnsi="宋体" w:eastAsia="宋体"/>
+                <w:b w:val="0"/>
+                <w:i w:val="0"/>
+                <w:sz w:val="20"/>
+              </w:rPr>
+              <w:t>需真机 + 已配置的 CloudBase dev 环境</w:t>
+            </w:r>
+          </w:p>
+        </w:tc>
+      </w:tr>
+    </w:tbl>
+    <w:p/>
+    <w:p>
+      <w:pPr>
+        <w:spacing w:before="120" w:after="60"/>
+      </w:pPr>
+      <w:r>
+        <w:rPr>
+          <w:rFonts w:ascii="宋体" w:hAnsi="宋体" w:eastAsia="宋体"/>
+          <w:b/>
+          <w:i w:val="0"/>
+          <w:color w:val="2B5C8F"/>
+          <w:sz w:val="25"/>
+        </w:rPr>
+        <w:t>17.1 DevTools 手动测试步骤（待执行）</w:t>
+      </w:r>
+    </w:p>
+    <w:p>
+      <w:pPr>
+        <w:pStyle w:val="ListBullet"/>
+        <w:spacing w:after="60"/>
+      </w:pPr>
+      <w:r>
+        <w:rPr>
+          <w:rFonts w:ascii="宋体" w:hAnsi="宋体" w:eastAsia="宋体"/>
+          <w:b w:val="0"/>
+          <w:i w:val="0"/>
+          <w:sz w:val="24"/>
+        </w:rPr>
+        <w:t>1) 在 miniprogram/config/env.local.ts 填入 dev CloudBase 环境 ID；运行 npm run build:shared 生成各云函数 lib/shared/。</w:t>
+      </w:r>
+    </w:p>
+    <w:p>
+      <w:pPr>
+        <w:pStyle w:val="ListBullet"/>
+        <w:spacing w:after="60"/>
+      </w:pPr>
+      <w:r>
+        <w:rPr>
+          <w:rFonts w:ascii="宋体" w:hAnsi="宋体" w:eastAsia="宋体"/>
+          <w:b w:val="0"/>
+          <w:i w:val="0"/>
+          <w:sz w:val="24"/>
+        </w:rPr>
+        <w:t>2) 用微信开发者工具打开项目，上传并部署 login、profileApi 两个云函数。</w:t>
+      </w:r>
+    </w:p>
+    <w:p>
+      <w:pPr>
+        <w:pStyle w:val="ListBullet"/>
+        <w:spacing w:after="60"/>
+      </w:pPr>
+      <w:r>
+        <w:rPr>
+          <w:rFonts w:ascii="宋体" w:hAnsi="宋体" w:eastAsia="宋体"/>
+          <w:b w:val="0"/>
+          <w:i w:val="0"/>
+          <w:sz w:val="24"/>
+        </w:rPr>
+        <w:t>3) 首次运行：应进入引导；创建首个档案 → 自动成为默认。</w:t>
+      </w:r>
+    </w:p>
+    <w:p>
+      <w:pPr>
+        <w:pStyle w:val="ListBullet"/>
+        <w:spacing w:after="60"/>
+      </w:pPr>
+      <w:r>
+        <w:rPr>
+          <w:rFonts w:ascii="宋体" w:hAnsi="宋体" w:eastAsia="宋体"/>
+          <w:b w:val="0"/>
+          <w:i w:val="0"/>
+          <w:sz w:val="24"/>
+        </w:rPr>
+        <w:t>4) 再创建第二个档案；在列表切换默认 → 仅一个显示为默认。</w:t>
+      </w:r>
+    </w:p>
+    <w:p>
+      <w:pPr>
+        <w:pStyle w:val="ListBullet"/>
+        <w:spacing w:after="60"/>
+      </w:pPr>
+      <w:r>
+        <w:rPr>
+          <w:rFonts w:ascii="宋体" w:hAnsi="宋体" w:eastAsia="宋体"/>
+          <w:b w:val="0"/>
+          <w:i w:val="0"/>
+          <w:sz w:val="24"/>
+        </w:rPr>
+        <w:t>5) 编辑档案姓名/关系并保存；选择活动档案；重新编译，确认默认仍生效。</w:t>
+      </w:r>
+    </w:p>
+    <w:p>
+      <w:pPr>
+        <w:pStyle w:val="ListBullet"/>
+        <w:spacing w:after="60"/>
+      </w:pPr>
+      <w:r>
+        <w:rPr>
+          <w:rFonts w:ascii="宋体" w:hAnsi="宋体" w:eastAsia="宋体"/>
+          <w:b w:val="0"/>
+          <w:i w:val="0"/>
+          <w:sz w:val="24"/>
+        </w:rPr>
+        <w:t>6) 提交空姓名/非法关系 → 被拒。</w:t>
+      </w:r>
+    </w:p>
+    <w:p>
+      <w:pPr>
+        <w:pStyle w:val="ListBullet"/>
+        <w:spacing w:after="60"/>
+      </w:pPr>
+      <w:r>
+        <w:rPr>
+          <w:rFonts w:ascii="宋体" w:hAnsi="宋体" w:eastAsia="宋体"/>
+          <w:b w:val="0"/>
+          <w:i w:val="0"/>
+          <w:sz w:val="24"/>
+        </w:rPr>
+        <w:t>7) 【M1.1】连续快速点击提交 → 仅创建一条（requestId 幂等 + 防抖）。</w:t>
+      </w:r>
+    </w:p>
+    <w:p>
+      <w:pPr>
+        <w:pStyle w:val="ListBullet"/>
+        <w:spacing w:after="60"/>
+      </w:pPr>
+      <w:r>
+        <w:rPr>
+          <w:rFonts w:ascii="宋体" w:hAnsi="宋体" w:eastAsia="宋体"/>
+          <w:b w:val="0"/>
+          <w:i w:val="0"/>
+          <w:sz w:val="24"/>
+        </w:rPr>
+        <w:t>8) 【M1.1】故意创建两条重名档案（各自独立提交）→ 均应成功、并列存在。</w:t>
+      </w:r>
+    </w:p>
+    <w:p>
+      <w:pPr>
+        <w:spacing w:before="120" w:after="60"/>
+      </w:pPr>
+      <w:r>
+        <w:rPr>
+          <w:rFonts w:ascii="宋体" w:hAnsi="宋体" w:eastAsia="宋体"/>
+          <w:b/>
+          <w:i w:val="0"/>
+          <w:color w:val="2B5C8F"/>
+          <w:sz w:val="25"/>
+        </w:rPr>
+        <w:t>17.2 真机测试步骤（待执行）</w:t>
+      </w:r>
+    </w:p>
+    <w:p>
+      <w:pPr>
+        <w:pStyle w:val="ListBullet"/>
+        <w:spacing w:after="60"/>
+      </w:pPr>
+      <w:r>
+        <w:rPr>
+          <w:rFonts w:ascii="宋体" w:hAnsi="宋体" w:eastAsia="宋体"/>
+          <w:b w:val="0"/>
+          <w:i w:val="0"/>
+          <w:sz w:val="24"/>
+        </w:rPr>
+        <w:t>1) 在真机预览/体验版中复现 17.1 的 3–8。</w:t>
+      </w:r>
+    </w:p>
+    <w:p>
+      <w:pPr>
+        <w:pStyle w:val="ListBullet"/>
+        <w:spacing w:after="60"/>
+      </w:pPr>
+      <w:r>
+        <w:rPr>
+          <w:rFonts w:ascii="宋体" w:hAnsi="宋体" w:eastAsia="宋体"/>
+          <w:b w:val="0"/>
+          <w:i w:val="0"/>
+          <w:sz w:val="24"/>
+        </w:rPr>
+        <w:t>2) 断网/未配置云环境时，首页应显示离线横幅且不崩溃。</w:t>
+      </w:r>
+    </w:p>
+    <w:p>
+      <w:pPr>
+        <w:pStyle w:val="ListBullet"/>
+        <w:spacing w:after="60"/>
+      </w:pPr>
+      <w:r>
+        <w:rPr>
+          <w:rFonts w:ascii="宋体" w:hAnsi="宋体" w:eastAsia="宋体"/>
+          <w:b w:val="0"/>
+          <w:i w:val="0"/>
+          <w:sz w:val="24"/>
+        </w:rPr>
+        <w:t>3) 清除本地存储后重启，确认活动档案回退（服务端默认 → 首个 → 引导）正确。</w:t>
+      </w:r>
+    </w:p>
+    <w:p>
+      <w:pPr>
+        <w:spacing w:after="120"/>
+      </w:pPr>
+      <w:r>
+        <w:rPr>
+          <w:rFonts w:ascii="宋体" w:hAnsi="宋体" w:eastAsia="宋体"/>
+          <w:b w:val="0"/>
+          <w:i w:val="0"/>
+          <w:sz w:val="24"/>
+        </w:rPr>
+        <w:t>以上步骤执行后，请将结果回填至 docs/MANUAL_TEST_CHECKLIST.md 并在本节标注实际状态。</w:t>
       </w:r>
     </w:p>
     <w:sectPr>

</xml_diff>

<commit_message>
M1 closeout: regenerate report (best-effort idempotency, real git log, roadmap, file counts)
</commit_message>
<xml_diff>
--- a/M1-FINAL-REPORT.docx
+++ b/M1-FINAL-REPORT.docx
@@ -78,7 +78,7 @@
           <w:color w:val="1A3A6B"/>
           <w:sz w:val="24"/>
         </w:rPr>
-        <w:t>状态：✅ 完成（91/91 校验通过，含 M1.1 加固）</w:t>
+        <w:t>状态：✅ 代码与文档完成（91/91 自动化校验通过；DevTools/真机手动验收待产品负责人）</w:t>
       </w:r>
     </w:p>
     <w:p>
@@ -305,7 +305,7 @@
           <w:i w:val="0"/>
           <w:sz w:val="24"/>
         </w:rPr>
-        <w:t>15. M2 建议（不实现）</w:t>
+        <w:t>15. 里程碑路线图（仅规划，不实现）</w:t>
       </w:r>
     </w:p>
     <w:p>
@@ -334,6 +334,20 @@
           <w:sz w:val="24"/>
         </w:rPr>
         <w:t>17. 测试状态（自动化 / DevTools 手动 / 真机）</w:t>
+      </w:r>
+    </w:p>
+    <w:p>
+      <w:pPr>
+        <w:spacing w:after="80"/>
+      </w:pPr>
+      <w:r>
+        <w:rPr>
+          <w:rFonts w:ascii="宋体" w:hAnsi="宋体" w:eastAsia="宋体"/>
+          <w:b w:val="0"/>
+          <w:i w:val="0"/>
+          <w:sz w:val="24"/>
+        </w:rPr>
+        <w:t>18. M1 最终 closeout（本交付修正）</w:t>
       </w:r>
     </w:p>
     <w:p>
@@ -456,7 +470,7 @@
           <w:i w:val="0"/>
           <w:sz w:val="24"/>
         </w:rPr>
-        <w:t>自动化验收：npm run validate 共 91 项检查全部通过（M0 基线 67 + M1/M1.1 共 24）。其中「跨用户隔离」「共享运行时打包」「默认档案单一事实来源」「请求级幂等」四组关键验收均通过。</w:t>
+        <w:t>自动化验收：npm run validate 共 91 项检查全部通过（M0 基线 67 + M1/M1.1 共 24）。其中「跨用户隔离」「共享运行时打包」「默认档案单一事实来源」「best-effort 请求幂等（尽力式请求幂等）」四组关键验收均通过。</w:t>
       </w:r>
     </w:p>
     <w:p>
@@ -470,7 +484,7 @@
           <w:i w:val="0"/>
           <w:sz w:val="24"/>
         </w:rPr>
-        <w:t>M1.1 加固（合入 main 前的窄范围修正，详见第 16 节）：(1) 移除基于姓名的档案去重，改为客户端 requestId 的请求级幂等 + UI 防抖；(2) 默认档案单一事实来源——仅以 users.defaultFamilyProfileId 持久化，family_profiles 不存 isDefault，对外 isDefault 由 DTO 计算。</w:t>
+        <w:t>M1.1 加固（合入 main 前的窄范围修正，详见第 16 节）：(1) 移除基于姓名的档案去重，改为客户端 requestId 的 best-effort 请求幂等（尽力式请求幂等：客户端 in-flight 防护 + 服务端请求重放处理）+ UI 防抖；(2) 默认档案单一事实来源——仅以 users.defaultFamilyProfileId 持久化，family_profiles 不存 isDefault，对外 isDefault 由 DTO 计算。</w:t>
       </w:r>
     </w:p>
     <w:p>
@@ -484,7 +498,7 @@
           <w:i w:val="0"/>
           <w:sz w:val="24"/>
         </w:rPr>
-        <w:t>结论：依据验收门槛（owner-isolation、shared-runtime packaging、default-profile single-source-of-truth、request-level idempotency 必须全部通过），M1 + M1.1 可判定为【完成】，分支具备合入 main 的条件（真机/DevTools 手动冒烟由产品负责人执行，见第 12、17 节）。</w:t>
+        <w:t>结论：依据自动化验收门槛（owner-isolation、shared-runtime packaging、default-profile single-source-of-truth、best-effort request idempotency 必须全部通过），M1 + M1.1 关键验收达成。**代码与文档已就绪，可进入产品负责人的 DevTools / 真机手动验收（见第 12、17、18 节）**；当前自动化环境无法代跑手动/真机测试，故不宣称产品已验收通过。</w:t>
       </w:r>
     </w:p>
     <w:p>
@@ -1036,7 +1050,7 @@
           <w:i w:val="0"/>
           <w:sz w:val="24"/>
         </w:rPr>
-        <w:t>M1 共涉及 44 个文件（新增 29、修改 15）。按类别列示如下（★ 为 M1 新增）：</w:t>
+        <w:t>M1 最初影响 **47 个文件**（31 新增、16 修改）。M1.1 在此基础上追加修改了 **18 个文件**（全部为 M1 既有文件，即在相同代码/文档之上叠加的加固层）。本次最终 closeout（本报告交付）又修改了一组文档/报告文件（见 §3.6）。下方按类别列示实质性文件；逐文件完整清单以 `git diff --stat` 为准。</w:t>
       </w:r>
     </w:p>
     <w:p>
@@ -3347,6 +3361,1708 @@
                 <w:sz w:val="20"/>
               </w:rPr>
               <w:t>补充排除项</w:t>
+            </w:r>
+          </w:p>
+        </w:tc>
+      </w:tr>
+    </w:tbl>
+    <w:p/>
+    <w:p>
+      <w:pPr>
+        <w:spacing w:before="120" w:after="60"/>
+      </w:pPr>
+      <w:r>
+        <w:rPr>
+          <w:rFonts w:ascii="宋体" w:hAnsi="宋体" w:eastAsia="宋体"/>
+          <w:b/>
+          <w:i w:val="0"/>
+          <w:color w:val="2B5C8F"/>
+          <w:sz w:val="25"/>
+        </w:rPr>
+        <w:t>3.5 M1.1 修改文件（18 个，均叠加于 M1 既有文件）</w:t>
+      </w:r>
+    </w:p>
+    <w:tbl>
+      <w:tblPr>
+        <w:tblStyle w:val="TableGrid"/>
+        <w:tblW w:type="auto" w:w="0"/>
+        <w:jc w:val="center"/>
+        <w:tblLook w:firstColumn="1" w:firstRow="1" w:lastColumn="0" w:lastRow="0" w:noHBand="0" w:noVBand="1" w:val="04A0"/>
+      </w:tblPr>
+      <w:tblGrid>
+        <w:gridCol w:w="2880"/>
+        <w:gridCol w:w="2880"/>
+        <w:gridCol w:w="2880"/>
+      </w:tblGrid>
+      <w:tr>
+        <w:tc>
+          <w:tcPr>
+            <w:tcW w:type="dxa" w:w="3120"/>
+            <w:shd w:val="clear" w:color="auto" w:fill="2B5C8F"/>
+          </w:tcPr>
+          <w:p>
+            <w:r/>
+            <w:r>
+              <w:rPr>
+                <w:rFonts w:ascii="宋体" w:hAnsi="宋体" w:eastAsia="宋体"/>
+                <w:b/>
+                <w:i w:val="0"/>
+                <w:color w:val="FFFFFF"/>
+                <w:sz w:val="21"/>
+              </w:rPr>
+              <w:t>文件</w:t>
+            </w:r>
+          </w:p>
+        </w:tc>
+        <w:tc>
+          <w:tcPr>
+            <w:tcW w:type="dxa" w:w="3120"/>
+            <w:shd w:val="clear" w:color="auto" w:fill="2B5C8F"/>
+          </w:tcPr>
+          <w:p>
+            <w:r/>
+            <w:r>
+              <w:rPr>
+                <w:rFonts w:ascii="宋体" w:hAnsi="宋体" w:eastAsia="宋体"/>
+                <w:b/>
+                <w:i w:val="0"/>
+                <w:color w:val="FFFFFF"/>
+                <w:sz w:val="21"/>
+              </w:rPr>
+              <w:t>状态</w:t>
+            </w:r>
+          </w:p>
+        </w:tc>
+        <w:tc>
+          <w:tcPr>
+            <w:tcW w:type="dxa" w:w="3120"/>
+            <w:shd w:val="clear" w:color="auto" w:fill="2B5C8F"/>
+          </w:tcPr>
+          <w:p>
+            <w:r/>
+            <w:r>
+              <w:rPr>
+                <w:rFonts w:ascii="宋体" w:hAnsi="宋体" w:eastAsia="宋体"/>
+                <w:b/>
+                <w:i w:val="0"/>
+                <w:color w:val="FFFFFF"/>
+                <w:sz w:val="21"/>
+              </w:rPr>
+              <w:t>M1.1 变更</w:t>
+            </w:r>
+          </w:p>
+        </w:tc>
+      </w:tr>
+      <w:tr>
+        <w:tc>
+          <w:tcPr>
+            <w:tcW w:type="dxa" w:w="3120"/>
+          </w:tcPr>
+          <w:p>
+            <w:r/>
+            <w:r>
+              <w:rPr>
+                <w:rFonts w:ascii="宋体" w:hAnsi="宋体" w:eastAsia="宋体"/>
+                <w:b w:val="0"/>
+                <w:i w:val="0"/>
+                <w:sz w:val="20"/>
+              </w:rPr>
+              <w:t>shared/types.ts</w:t>
+            </w:r>
+          </w:p>
+        </w:tc>
+        <w:tc>
+          <w:tcPr>
+            <w:tcW w:type="dxa" w:w="3120"/>
+          </w:tcPr>
+          <w:p>
+            <w:r/>
+            <w:r>
+              <w:rPr>
+                <w:rFonts w:ascii="宋体" w:hAnsi="宋体" w:eastAsia="宋体"/>
+                <w:b w:val="0"/>
+                <w:i w:val="0"/>
+                <w:sz w:val="20"/>
+              </w:rPr>
+              <w:t>修改</w:t>
+            </w:r>
+          </w:p>
+        </w:tc>
+        <w:tc>
+          <w:tcPr>
+            <w:tcW w:type="dxa" w:w="3120"/>
+          </w:tcPr>
+          <w:p>
+            <w:r/>
+            <w:r>
+              <w:rPr>
+                <w:rFonts w:ascii="宋体" w:hAnsi="宋体" w:eastAsia="宋体"/>
+                <w:b w:val="0"/>
+                <w:i w:val="0"/>
+                <w:sz w:val="20"/>
+              </w:rPr>
+              <w:t>新增 IdempotencyKey 接口；注明 FamilyProfile 不存 isDefault</w:t>
+            </w:r>
+          </w:p>
+        </w:tc>
+      </w:tr>
+      <w:tr>
+        <w:tc>
+          <w:tcPr>
+            <w:tcW w:type="dxa" w:w="3120"/>
+            <w:shd w:val="clear" w:color="auto" w:fill="EAF1F8"/>
+          </w:tcPr>
+          <w:p>
+            <w:r/>
+            <w:r>
+              <w:rPr>
+                <w:rFonts w:ascii="宋体" w:hAnsi="宋体" w:eastAsia="宋体"/>
+                <w:b w:val="0"/>
+                <w:i w:val="0"/>
+                <w:sz w:val="20"/>
+              </w:rPr>
+              <w:t>shared/repository.ts</w:t>
+            </w:r>
+          </w:p>
+        </w:tc>
+        <w:tc>
+          <w:tcPr>
+            <w:tcW w:type="dxa" w:w="3120"/>
+            <w:shd w:val="clear" w:color="auto" w:fill="EAF1F8"/>
+          </w:tcPr>
+          <w:p>
+            <w:r/>
+            <w:r>
+              <w:rPr>
+                <w:rFonts w:ascii="宋体" w:hAnsi="宋体" w:eastAsia="宋体"/>
+                <w:b w:val="0"/>
+                <w:i w:val="0"/>
+                <w:sz w:val="20"/>
+              </w:rPr>
+              <w:t>修改</w:t>
+            </w:r>
+          </w:p>
+        </w:tc>
+        <w:tc>
+          <w:tcPr>
+            <w:tcW w:type="dxa" w:w="3120"/>
+            <w:shd w:val="clear" w:color="auto" w:fill="EAF1F8"/>
+          </w:tcPr>
+          <w:p>
+            <w:r/>
+            <w:r>
+              <w:rPr>
+                <w:rFonts w:ascii="宋体" w:hAnsi="宋体" w:eastAsia="宋体"/>
+                <w:b w:val="0"/>
+                <w:i w:val="0"/>
+                <w:sz w:val="20"/>
+              </w:rPr>
+              <w:t>Repository 增加 findIdempotencyKey / saveIdempotencyKey</w:t>
+            </w:r>
+          </w:p>
+        </w:tc>
+      </w:tr>
+      <w:tr>
+        <w:tc>
+          <w:tcPr>
+            <w:tcW w:type="dxa" w:w="3120"/>
+          </w:tcPr>
+          <w:p>
+            <w:r/>
+            <w:r>
+              <w:rPr>
+                <w:rFonts w:ascii="宋体" w:hAnsi="宋体" w:eastAsia="宋体"/>
+                <w:b w:val="0"/>
+                <w:i w:val="0"/>
+                <w:sz w:val="20"/>
+              </w:rPr>
+              <w:t>shared/repository-memory.ts</w:t>
+            </w:r>
+          </w:p>
+        </w:tc>
+        <w:tc>
+          <w:tcPr>
+            <w:tcW w:type="dxa" w:w="3120"/>
+          </w:tcPr>
+          <w:p>
+            <w:r/>
+            <w:r>
+              <w:rPr>
+                <w:rFonts w:ascii="宋体" w:hAnsi="宋体" w:eastAsia="宋体"/>
+                <w:b w:val="0"/>
+                <w:i w:val="0"/>
+                <w:sz w:val="20"/>
+              </w:rPr>
+              <w:t>修改</w:t>
+            </w:r>
+          </w:p>
+        </w:tc>
+        <w:tc>
+          <w:tcPr>
+            <w:tcW w:type="dxa" w:w="3120"/>
+          </w:tcPr>
+          <w:p>
+            <w:r/>
+            <w:r>
+              <w:rPr>
+                <w:rFonts w:ascii="宋体" w:hAnsi="宋体" w:eastAsia="宋体"/>
+                <w:b w:val="0"/>
+                <w:i w:val="0"/>
+                <w:sz w:val="20"/>
+              </w:rPr>
+              <w:t>内存实现幂等键存取</w:t>
+            </w:r>
+          </w:p>
+        </w:tc>
+      </w:tr>
+      <w:tr>
+        <w:tc>
+          <w:tcPr>
+            <w:tcW w:type="dxa" w:w="3120"/>
+            <w:shd w:val="clear" w:color="auto" w:fill="EAF1F8"/>
+          </w:tcPr>
+          <w:p>
+            <w:r/>
+            <w:r>
+              <w:rPr>
+                <w:rFonts w:ascii="宋体" w:hAnsi="宋体" w:eastAsia="宋体"/>
+                <w:b w:val="0"/>
+                <w:i w:val="0"/>
+                <w:sz w:val="20"/>
+              </w:rPr>
+              <w:t>shared/services/profile-service.ts</w:t>
+            </w:r>
+          </w:p>
+        </w:tc>
+        <w:tc>
+          <w:tcPr>
+            <w:tcW w:type="dxa" w:w="3120"/>
+            <w:shd w:val="clear" w:color="auto" w:fill="EAF1F8"/>
+          </w:tcPr>
+          <w:p>
+            <w:r/>
+            <w:r>
+              <w:rPr>
+                <w:rFonts w:ascii="宋体" w:hAnsi="宋体" w:eastAsia="宋体"/>
+                <w:b w:val="0"/>
+                <w:i w:val="0"/>
+                <w:sz w:val="20"/>
+              </w:rPr>
+              <w:t>修改</w:t>
+            </w:r>
+          </w:p>
+        </w:tc>
+        <w:tc>
+          <w:tcPr>
+            <w:tcW w:type="dxa" w:w="3120"/>
+            <w:shd w:val="clear" w:color="auto" w:fill="EAF1F8"/>
+          </w:tcPr>
+          <w:p>
+            <w:r/>
+            <w:r>
+              <w:rPr>
+                <w:rFonts w:ascii="宋体" w:hAnsi="宋体" w:eastAsia="宋体"/>
+                <w:b w:val="0"/>
+                <w:i w:val="0"/>
+                <w:sz w:val="20"/>
+              </w:rPr>
+              <w:t>移除姓名去重；createProfile 支持 requestId 幂等；DTO 计算 isDefault</w:t>
+            </w:r>
+          </w:p>
+        </w:tc>
+      </w:tr>
+      <w:tr>
+        <w:tc>
+          <w:tcPr>
+            <w:tcW w:type="dxa" w:w="3120"/>
+          </w:tcPr>
+          <w:p>
+            <w:r/>
+            <w:r>
+              <w:rPr>
+                <w:rFonts w:ascii="宋体" w:hAnsi="宋体" w:eastAsia="宋体"/>
+                <w:b w:val="0"/>
+                <w:i w:val="0"/>
+                <w:sz w:val="20"/>
+              </w:rPr>
+              <w:t>cloudfunctions/profileApi/cloudbase-repository.js</w:t>
+            </w:r>
+          </w:p>
+        </w:tc>
+        <w:tc>
+          <w:tcPr>
+            <w:tcW w:type="dxa" w:w="3120"/>
+          </w:tcPr>
+          <w:p>
+            <w:r/>
+            <w:r>
+              <w:rPr>
+                <w:rFonts w:ascii="宋体" w:hAnsi="宋体" w:eastAsia="宋体"/>
+                <w:b w:val="0"/>
+                <w:i w:val="0"/>
+                <w:sz w:val="20"/>
+              </w:rPr>
+              <w:t>修改</w:t>
+            </w:r>
+          </w:p>
+        </w:tc>
+        <w:tc>
+          <w:tcPr>
+            <w:tcW w:type="dxa" w:w="3120"/>
+          </w:tcPr>
+          <w:p>
+            <w:r/>
+            <w:r>
+              <w:rPr>
+                <w:rFonts w:ascii="宋体" w:hAnsi="宋体" w:eastAsia="宋体"/>
+                <w:b w:val="0"/>
+                <w:i w:val="0"/>
+                <w:sz w:val="20"/>
+              </w:rPr>
+              <w:t>idempotency_keys 集合的查/写实现</w:t>
+            </w:r>
+          </w:p>
+        </w:tc>
+      </w:tr>
+      <w:tr>
+        <w:tc>
+          <w:tcPr>
+            <w:tcW w:type="dxa" w:w="3120"/>
+            <w:shd w:val="clear" w:color="auto" w:fill="EAF1F8"/>
+          </w:tcPr>
+          <w:p>
+            <w:r/>
+            <w:r>
+              <w:rPr>
+                <w:rFonts w:ascii="宋体" w:hAnsi="宋体" w:eastAsia="宋体"/>
+                <w:b w:val="0"/>
+                <w:i w:val="0"/>
+                <w:sz w:val="20"/>
+              </w:rPr>
+              <w:t>cloudfunctions/profileApi/index.js</w:t>
+            </w:r>
+          </w:p>
+        </w:tc>
+        <w:tc>
+          <w:tcPr>
+            <w:tcW w:type="dxa" w:w="3120"/>
+            <w:shd w:val="clear" w:color="auto" w:fill="EAF1F8"/>
+          </w:tcPr>
+          <w:p>
+            <w:r/>
+            <w:r>
+              <w:rPr>
+                <w:rFonts w:ascii="宋体" w:hAnsi="宋体" w:eastAsia="宋体"/>
+                <w:b w:val="0"/>
+                <w:i w:val="0"/>
+                <w:sz w:val="20"/>
+              </w:rPr>
+              <w:t>修改</w:t>
+            </w:r>
+          </w:p>
+        </w:tc>
+        <w:tc>
+          <w:tcPr>
+            <w:tcW w:type="dxa" w:w="3120"/>
+            <w:shd w:val="clear" w:color="auto" w:fill="EAF1F8"/>
+          </w:tcPr>
+          <w:p>
+            <w:r/>
+            <w:r>
+              <w:rPr>
+                <w:rFonts w:ascii="宋体" w:hAnsi="宋体" w:eastAsia="宋体"/>
+                <w:b w:val="0"/>
+                <w:i w:val="0"/>
+                <w:sz w:val="20"/>
+              </w:rPr>
+              <w:t>currentDefaultId 助手；透传 requestId</w:t>
+            </w:r>
+          </w:p>
+        </w:tc>
+      </w:tr>
+      <w:tr>
+        <w:tc>
+          <w:tcPr>
+            <w:tcW w:type="dxa" w:w="3120"/>
+          </w:tcPr>
+          <w:p>
+            <w:r/>
+            <w:r>
+              <w:rPr>
+                <w:rFonts w:ascii="宋体" w:hAnsi="宋体" w:eastAsia="宋体"/>
+                <w:b w:val="0"/>
+                <w:i w:val="0"/>
+                <w:sz w:val="20"/>
+              </w:rPr>
+              <w:t>cloudfunctions/login/cloudbase-repository.js</w:t>
+            </w:r>
+          </w:p>
+        </w:tc>
+        <w:tc>
+          <w:tcPr>
+            <w:tcW w:type="dxa" w:w="3120"/>
+          </w:tcPr>
+          <w:p>
+            <w:r/>
+            <w:r>
+              <w:rPr>
+                <w:rFonts w:ascii="宋体" w:hAnsi="宋体" w:eastAsia="宋体"/>
+                <w:b w:val="0"/>
+                <w:i w:val="0"/>
+                <w:sz w:val="20"/>
+              </w:rPr>
+              <w:t>修改</w:t>
+            </w:r>
+          </w:p>
+        </w:tc>
+        <w:tc>
+          <w:tcPr>
+            <w:tcW w:type="dxa" w:w="3120"/>
+          </w:tcPr>
+          <w:p>
+            <w:r/>
+            <w:r>
+              <w:rPr>
+                <w:rFonts w:ascii="宋体" w:hAnsi="宋体" w:eastAsia="宋体"/>
+                <w:b w:val="0"/>
+                <w:i w:val="0"/>
+                <w:sz w:val="20"/>
+              </w:rPr>
+              <w:t>接口对齐补齐幂等键方法</w:t>
+            </w:r>
+          </w:p>
+        </w:tc>
+      </w:tr>
+      <w:tr>
+        <w:tc>
+          <w:tcPr>
+            <w:tcW w:type="dxa" w:w="3120"/>
+            <w:shd w:val="clear" w:color="auto" w:fill="EAF1F8"/>
+          </w:tcPr>
+          <w:p>
+            <w:r/>
+            <w:r>
+              <w:rPr>
+                <w:rFonts w:ascii="宋体" w:hAnsi="宋体" w:eastAsia="宋体"/>
+                <w:b w:val="0"/>
+                <w:i w:val="0"/>
+                <w:sz w:val="20"/>
+              </w:rPr>
+              <w:t>typings/index.d.ts</w:t>
+            </w:r>
+          </w:p>
+        </w:tc>
+        <w:tc>
+          <w:tcPr>
+            <w:tcW w:type="dxa" w:w="3120"/>
+            <w:shd w:val="clear" w:color="auto" w:fill="EAF1F8"/>
+          </w:tcPr>
+          <w:p>
+            <w:r/>
+            <w:r>
+              <w:rPr>
+                <w:rFonts w:ascii="宋体" w:hAnsi="宋体" w:eastAsia="宋体"/>
+                <w:b w:val="0"/>
+                <w:i w:val="0"/>
+                <w:sz w:val="20"/>
+              </w:rPr>
+              <w:t>修改</w:t>
+            </w:r>
+          </w:p>
+        </w:tc>
+        <w:tc>
+          <w:tcPr>
+            <w:tcW w:type="dxa" w:w="3120"/>
+            <w:shd w:val="clear" w:color="auto" w:fill="EAF1F8"/>
+          </w:tcPr>
+          <w:p>
+            <w:r/>
+            <w:r>
+              <w:rPr>
+                <w:rFonts w:ascii="宋体" w:hAnsi="宋体" w:eastAsia="宋体"/>
+                <w:b w:val="0"/>
+                <w:i w:val="0"/>
+                <w:sz w:val="20"/>
+              </w:rPr>
+              <w:t>ClientFamilyProfile 增 isDefault（服务端计算）</w:t>
+            </w:r>
+          </w:p>
+        </w:tc>
+      </w:tr>
+      <w:tr>
+        <w:tc>
+          <w:tcPr>
+            <w:tcW w:type="dxa" w:w="3120"/>
+          </w:tcPr>
+          <w:p>
+            <w:r/>
+            <w:r>
+              <w:rPr>
+                <w:rFonts w:ascii="宋体" w:hAnsi="宋体" w:eastAsia="宋体"/>
+                <w:b w:val="0"/>
+                <w:i w:val="0"/>
+                <w:sz w:val="20"/>
+              </w:rPr>
+              <w:t>miniprogram/services/profile.ts</w:t>
+            </w:r>
+          </w:p>
+        </w:tc>
+        <w:tc>
+          <w:tcPr>
+            <w:tcW w:type="dxa" w:w="3120"/>
+          </w:tcPr>
+          <w:p>
+            <w:r/>
+            <w:r>
+              <w:rPr>
+                <w:rFonts w:ascii="宋体" w:hAnsi="宋体" w:eastAsia="宋体"/>
+                <w:b w:val="0"/>
+                <w:i w:val="0"/>
+                <w:sz w:val="20"/>
+              </w:rPr>
+              <w:t>修改</w:t>
+            </w:r>
+          </w:p>
+        </w:tc>
+        <w:tc>
+          <w:tcPr>
+            <w:tcW w:type="dxa" w:w="3120"/>
+          </w:tcPr>
+          <w:p>
+            <w:r/>
+            <w:r>
+              <w:rPr>
+                <w:rFonts w:ascii="宋体" w:hAnsi="宋体" w:eastAsia="宋体"/>
+                <w:b w:val="0"/>
+                <w:i w:val="0"/>
+                <w:sz w:val="20"/>
+              </w:rPr>
+              <w:t>newRequestId()；createProfile 传 requestId</w:t>
+            </w:r>
+          </w:p>
+        </w:tc>
+      </w:tr>
+      <w:tr>
+        <w:tc>
+          <w:tcPr>
+            <w:tcW w:type="dxa" w:w="3120"/>
+            <w:shd w:val="clear" w:color="auto" w:fill="EAF1F8"/>
+          </w:tcPr>
+          <w:p>
+            <w:r/>
+            <w:r>
+              <w:rPr>
+                <w:rFonts w:ascii="宋体" w:hAnsi="宋体" w:eastAsia="宋体"/>
+                <w:b w:val="0"/>
+                <w:i w:val="0"/>
+                <w:sz w:val="20"/>
+              </w:rPr>
+              <w:t>miniprogram/pages/profile-edit/profile-edit.ts</w:t>
+            </w:r>
+          </w:p>
+        </w:tc>
+        <w:tc>
+          <w:tcPr>
+            <w:tcW w:type="dxa" w:w="3120"/>
+            <w:shd w:val="clear" w:color="auto" w:fill="EAF1F8"/>
+          </w:tcPr>
+          <w:p>
+            <w:r/>
+            <w:r>
+              <w:rPr>
+                <w:rFonts w:ascii="宋体" w:hAnsi="宋体" w:eastAsia="宋体"/>
+                <w:b w:val="0"/>
+                <w:i w:val="0"/>
+                <w:sz w:val="20"/>
+              </w:rPr>
+              <w:t>修改</w:t>
+            </w:r>
+          </w:p>
+        </w:tc>
+        <w:tc>
+          <w:tcPr>
+            <w:tcW w:type="dxa" w:w="3120"/>
+            <w:shd w:val="clear" w:color="auto" w:fill="EAF1F8"/>
+          </w:tcPr>
+          <w:p>
+            <w:r/>
+            <w:r>
+              <w:rPr>
+                <w:rFonts w:ascii="宋体" w:hAnsi="宋体" w:eastAsia="宋体"/>
+                <w:b w:val="0"/>
+                <w:i w:val="0"/>
+                <w:sz w:val="20"/>
+              </w:rPr>
+              <w:t>onLoad 生成 createRequestId；onSubmit 透传</w:t>
+            </w:r>
+          </w:p>
+        </w:tc>
+      </w:tr>
+      <w:tr>
+        <w:tc>
+          <w:tcPr>
+            <w:tcW w:type="dxa" w:w="3120"/>
+          </w:tcPr>
+          <w:p>
+            <w:r/>
+            <w:r>
+              <w:rPr>
+                <w:rFonts w:ascii="宋体" w:hAnsi="宋体" w:eastAsia="宋体"/>
+                <w:b w:val="0"/>
+                <w:i w:val="0"/>
+                <w:sz w:val="20"/>
+              </w:rPr>
+              <w:t>scripts/validate.mjs</w:t>
+            </w:r>
+          </w:p>
+        </w:tc>
+        <w:tc>
+          <w:tcPr>
+            <w:tcW w:type="dxa" w:w="3120"/>
+          </w:tcPr>
+          <w:p>
+            <w:r/>
+            <w:r>
+              <w:rPr>
+                <w:rFonts w:ascii="宋体" w:hAnsi="宋体" w:eastAsia="宋体"/>
+                <w:b w:val="0"/>
+                <w:i w:val="0"/>
+                <w:sz w:val="20"/>
+              </w:rPr>
+              <w:t>修改</w:t>
+            </w:r>
+          </w:p>
+        </w:tc>
+        <w:tc>
+          <w:tcPr>
+            <w:tcW w:type="dxa" w:w="3120"/>
+          </w:tcPr>
+          <w:p>
+            <w:r/>
+            <w:r>
+              <w:rPr>
+                <w:rFonts w:ascii="宋体" w:hAnsi="宋体" w:eastAsia="宋体"/>
+                <w:b w:val="0"/>
+                <w:i w:val="0"/>
+                <w:sz w:val="20"/>
+              </w:rPr>
+              <w:t>14a/14b/14c + 15a–15f 替换姓名去重测试；打包/卫生重编号</w:t>
+            </w:r>
+          </w:p>
+        </w:tc>
+      </w:tr>
+      <w:tr>
+        <w:tc>
+          <w:tcPr>
+            <w:tcW w:type="dxa" w:w="3120"/>
+            <w:shd w:val="clear" w:color="auto" w:fill="EAF1F8"/>
+          </w:tcPr>
+          <w:p>
+            <w:r/>
+            <w:r>
+              <w:rPr>
+                <w:rFonts w:ascii="宋体" w:hAnsi="宋体" w:eastAsia="宋体"/>
+                <w:b w:val="0"/>
+                <w:i w:val="0"/>
+                <w:sz w:val="20"/>
+              </w:rPr>
+              <w:t>docs/DATA_MODEL.md</w:t>
+            </w:r>
+          </w:p>
+        </w:tc>
+        <w:tc>
+          <w:tcPr>
+            <w:tcW w:type="dxa" w:w="3120"/>
+            <w:shd w:val="clear" w:color="auto" w:fill="EAF1F8"/>
+          </w:tcPr>
+          <w:p>
+            <w:r/>
+            <w:r>
+              <w:rPr>
+                <w:rFonts w:ascii="宋体" w:hAnsi="宋体" w:eastAsia="宋体"/>
+                <w:b w:val="0"/>
+                <w:i w:val="0"/>
+                <w:sz w:val="20"/>
+              </w:rPr>
+              <w:t>修改</w:t>
+            </w:r>
+          </w:p>
+        </w:tc>
+        <w:tc>
+          <w:tcPr>
+            <w:tcW w:type="dxa" w:w="3120"/>
+            <w:shd w:val="clear" w:color="auto" w:fill="EAF1F8"/>
+          </w:tcPr>
+          <w:p>
+            <w:r/>
+            <w:r>
+              <w:rPr>
+                <w:rFonts w:ascii="宋体" w:hAnsi="宋体" w:eastAsia="宋体"/>
+                <w:b w:val="0"/>
+                <w:i w:val="0"/>
+                <w:sz w:val="20"/>
+              </w:rPr>
+              <w:t>idempotency_keys、默认 SSoT、移除姓名去重</w:t>
+            </w:r>
+          </w:p>
+        </w:tc>
+      </w:tr>
+      <w:tr>
+        <w:tc>
+          <w:tcPr>
+            <w:tcW w:type="dxa" w:w="3120"/>
+          </w:tcPr>
+          <w:p>
+            <w:r/>
+            <w:r>
+              <w:rPr>
+                <w:rFonts w:ascii="宋体" w:hAnsi="宋体" w:eastAsia="宋体"/>
+                <w:b w:val="0"/>
+                <w:i w:val="0"/>
+                <w:sz w:val="20"/>
+              </w:rPr>
+              <w:t>docs/ARCHITECTURE.md</w:t>
+            </w:r>
+          </w:p>
+        </w:tc>
+        <w:tc>
+          <w:tcPr>
+            <w:tcW w:type="dxa" w:w="3120"/>
+          </w:tcPr>
+          <w:p>
+            <w:r/>
+            <w:r>
+              <w:rPr>
+                <w:rFonts w:ascii="宋体" w:hAnsi="宋体" w:eastAsia="宋体"/>
+                <w:b w:val="0"/>
+                <w:i w:val="0"/>
+                <w:sz w:val="20"/>
+              </w:rPr>
+              <w:t>修改</w:t>
+            </w:r>
+          </w:p>
+        </w:tc>
+        <w:tc>
+          <w:tcPr>
+            <w:tcW w:type="dxa" w:w="3120"/>
+          </w:tcPr>
+          <w:p>
+            <w:r/>
+            <w:r>
+              <w:rPr>
+                <w:rFonts w:ascii="宋体" w:hAnsi="宋体" w:eastAsia="宋体"/>
+                <w:b w:val="0"/>
+                <w:i w:val="0"/>
+                <w:sz w:val="20"/>
+              </w:rPr>
+              <w:t>§5b 幂等与默认 SSoT、§12 M1.1 决策、集合/索引</w:t>
+            </w:r>
+          </w:p>
+        </w:tc>
+      </w:tr>
+      <w:tr>
+        <w:tc>
+          <w:tcPr>
+            <w:tcW w:type="dxa" w:w="3120"/>
+            <w:shd w:val="clear" w:color="auto" w:fill="EAF1F8"/>
+          </w:tcPr>
+          <w:p>
+            <w:r/>
+            <w:r>
+              <w:rPr>
+                <w:rFonts w:ascii="宋体" w:hAnsi="宋体" w:eastAsia="宋体"/>
+                <w:b w:val="0"/>
+                <w:i w:val="0"/>
+                <w:sz w:val="20"/>
+              </w:rPr>
+              <w:t>docs/USER_FLOWS.md</w:t>
+            </w:r>
+          </w:p>
+        </w:tc>
+        <w:tc>
+          <w:tcPr>
+            <w:tcW w:type="dxa" w:w="3120"/>
+            <w:shd w:val="clear" w:color="auto" w:fill="EAF1F8"/>
+          </w:tcPr>
+          <w:p>
+            <w:r/>
+            <w:r>
+              <w:rPr>
+                <w:rFonts w:ascii="宋体" w:hAnsi="宋体" w:eastAsia="宋体"/>
+                <w:b w:val="0"/>
+                <w:i w:val="0"/>
+                <w:sz w:val="20"/>
+              </w:rPr>
+              <w:t>修改</w:t>
+            </w:r>
+          </w:p>
+        </w:tc>
+        <w:tc>
+          <w:tcPr>
+            <w:tcW w:type="dxa" w:w="3120"/>
+            <w:shd w:val="clear" w:color="auto" w:fill="EAF1F8"/>
+          </w:tcPr>
+          <w:p>
+            <w:r/>
+            <w:r>
+              <w:rPr>
+                <w:rFonts w:ascii="宋体" w:hAnsi="宋体" w:eastAsia="宋体"/>
+                <w:b w:val="0"/>
+                <w:i w:val="0"/>
+                <w:sz w:val="20"/>
+              </w:rPr>
+              <w:t>创建流程 requestId、允许重名、默认计算与回退</w:t>
+            </w:r>
+          </w:p>
+        </w:tc>
+      </w:tr>
+      <w:tr>
+        <w:tc>
+          <w:tcPr>
+            <w:tcW w:type="dxa" w:w="3120"/>
+          </w:tcPr>
+          <w:p>
+            <w:r/>
+            <w:r>
+              <w:rPr>
+                <w:rFonts w:ascii="宋体" w:hAnsi="宋体" w:eastAsia="宋体"/>
+                <w:b w:val="0"/>
+                <w:i w:val="0"/>
+                <w:sz w:val="20"/>
+              </w:rPr>
+              <w:t>docs/SECURITY.md</w:t>
+            </w:r>
+          </w:p>
+        </w:tc>
+        <w:tc>
+          <w:tcPr>
+            <w:tcW w:type="dxa" w:w="3120"/>
+          </w:tcPr>
+          <w:p>
+            <w:r/>
+            <w:r>
+              <w:rPr>
+                <w:rFonts w:ascii="宋体" w:hAnsi="宋体" w:eastAsia="宋体"/>
+                <w:b w:val="0"/>
+                <w:i w:val="0"/>
+                <w:sz w:val="20"/>
+              </w:rPr>
+              <w:t>修改</w:t>
+            </w:r>
+          </w:p>
+        </w:tc>
+        <w:tc>
+          <w:tcPr>
+            <w:tcW w:type="dxa" w:w="3120"/>
+          </w:tcPr>
+          <w:p>
+            <w:r/>
+            <w:r>
+              <w:rPr>
+                <w:rFonts w:ascii="宋体" w:hAnsi="宋体" w:eastAsia="宋体"/>
+                <w:b w:val="0"/>
+                <w:i w:val="0"/>
+                <w:sz w:val="20"/>
+              </w:rPr>
+              <w:t>集合/索引、创建幂等与默认 SSoT 说明</w:t>
+            </w:r>
+          </w:p>
+        </w:tc>
+      </w:tr>
+      <w:tr>
+        <w:tc>
+          <w:tcPr>
+            <w:tcW w:type="dxa" w:w="3120"/>
+            <w:shd w:val="clear" w:color="auto" w:fill="EAF1F8"/>
+          </w:tcPr>
+          <w:p>
+            <w:r/>
+            <w:r>
+              <w:rPr>
+                <w:rFonts w:ascii="宋体" w:hAnsi="宋体" w:eastAsia="宋体"/>
+                <w:b w:val="0"/>
+                <w:i w:val="0"/>
+                <w:sz w:val="20"/>
+              </w:rPr>
+              <w:t>build_m1_report.py</w:t>
+            </w:r>
+          </w:p>
+        </w:tc>
+        <w:tc>
+          <w:tcPr>
+            <w:tcW w:type="dxa" w:w="3120"/>
+            <w:shd w:val="clear" w:color="auto" w:fill="EAF1F8"/>
+          </w:tcPr>
+          <w:p>
+            <w:r/>
+            <w:r>
+              <w:rPr>
+                <w:rFonts w:ascii="宋体" w:hAnsi="宋体" w:eastAsia="宋体"/>
+                <w:b w:val="0"/>
+                <w:i w:val="0"/>
+                <w:sz w:val="20"/>
+              </w:rPr>
+              <w:t>修改</w:t>
+            </w:r>
+          </w:p>
+        </w:tc>
+        <w:tc>
+          <w:tcPr>
+            <w:tcW w:type="dxa" w:w="3120"/>
+            <w:shd w:val="clear" w:color="auto" w:fill="EAF1F8"/>
+          </w:tcPr>
+          <w:p>
+            <w:r/>
+            <w:r>
+              <w:rPr>
+                <w:rFonts w:ascii="宋体" w:hAnsi="宋体" w:eastAsia="宋体"/>
+                <w:b w:val="0"/>
+                <w:i w:val="0"/>
+                <w:sz w:val="20"/>
+              </w:rPr>
+              <w:t>并入 M1.1 修正、测试状态与 git 复核</w:t>
+            </w:r>
+          </w:p>
+        </w:tc>
+      </w:tr>
+      <w:tr>
+        <w:tc>
+          <w:tcPr>
+            <w:tcW w:type="dxa" w:w="3120"/>
+          </w:tcPr>
+          <w:p>
+            <w:r/>
+            <w:r>
+              <w:rPr>
+                <w:rFonts w:ascii="宋体" w:hAnsi="宋体" w:eastAsia="宋体"/>
+                <w:b w:val="0"/>
+                <w:i w:val="0"/>
+                <w:sz w:val="20"/>
+              </w:rPr>
+              <w:t>docs/M1-FINAL-REPORT.md</w:t>
+            </w:r>
+          </w:p>
+        </w:tc>
+        <w:tc>
+          <w:tcPr>
+            <w:tcW w:type="dxa" w:w="3120"/>
+          </w:tcPr>
+          <w:p>
+            <w:r/>
+            <w:r>
+              <w:rPr>
+                <w:rFonts w:ascii="宋体" w:hAnsi="宋体" w:eastAsia="宋体"/>
+                <w:b w:val="0"/>
+                <w:i w:val="0"/>
+                <w:sz w:val="20"/>
+              </w:rPr>
+              <w:t>修改</w:t>
+            </w:r>
+          </w:p>
+        </w:tc>
+        <w:tc>
+          <w:tcPr>
+            <w:tcW w:type="dxa" w:w="3120"/>
+          </w:tcPr>
+          <w:p>
+            <w:r/>
+            <w:r>
+              <w:rPr>
+                <w:rFonts w:ascii="宋体" w:hAnsi="宋体" w:eastAsia="宋体"/>
+                <w:b w:val="0"/>
+                <w:i w:val="0"/>
+                <w:sz w:val="20"/>
+              </w:rPr>
+              <w:t>重新生成（Markdown 草稿）</w:t>
+            </w:r>
+          </w:p>
+        </w:tc>
+      </w:tr>
+      <w:tr>
+        <w:tc>
+          <w:tcPr>
+            <w:tcW w:type="dxa" w:w="3120"/>
+            <w:shd w:val="clear" w:color="auto" w:fill="EAF1F8"/>
+          </w:tcPr>
+          <w:p>
+            <w:r/>
+            <w:r>
+              <w:rPr>
+                <w:rFonts w:ascii="宋体" w:hAnsi="宋体" w:eastAsia="宋体"/>
+                <w:b w:val="0"/>
+                <w:i w:val="0"/>
+                <w:sz w:val="20"/>
+              </w:rPr>
+              <w:t>M1-FINAL-REPORT.docx</w:t>
+            </w:r>
+          </w:p>
+        </w:tc>
+        <w:tc>
+          <w:tcPr>
+            <w:tcW w:type="dxa" w:w="3120"/>
+            <w:shd w:val="clear" w:color="auto" w:fill="EAF1F8"/>
+          </w:tcPr>
+          <w:p>
+            <w:r/>
+            <w:r>
+              <w:rPr>
+                <w:rFonts w:ascii="宋体" w:hAnsi="宋体" w:eastAsia="宋体"/>
+                <w:b w:val="0"/>
+                <w:i w:val="0"/>
+                <w:sz w:val="20"/>
+              </w:rPr>
+              <w:t>修改</w:t>
+            </w:r>
+          </w:p>
+        </w:tc>
+        <w:tc>
+          <w:tcPr>
+            <w:tcW w:type="dxa" w:w="3120"/>
+            <w:shd w:val="clear" w:color="auto" w:fill="EAF1F8"/>
+          </w:tcPr>
+          <w:p>
+            <w:r/>
+            <w:r>
+              <w:rPr>
+                <w:rFonts w:ascii="宋体" w:hAnsi="宋体" w:eastAsia="宋体"/>
+                <w:b w:val="0"/>
+                <w:i w:val="0"/>
+                <w:sz w:val="20"/>
+              </w:rPr>
+              <w:t>重新生成（Word，蓝色主题）</w:t>
+            </w:r>
+          </w:p>
+        </w:tc>
+      </w:tr>
+    </w:tbl>
+    <w:p/>
+    <w:p>
+      <w:pPr>
+        <w:spacing w:before="120" w:after="60"/>
+      </w:pPr>
+      <w:r>
+        <w:rPr>
+          <w:rFonts w:ascii="宋体" w:hAnsi="宋体" w:eastAsia="宋体"/>
+          <w:b/>
+          <w:i w:val="0"/>
+          <w:color w:val="2B5C8F"/>
+          <w:sz w:val="25"/>
+        </w:rPr>
+        <w:t>3.6 最终 closeout 修改文件（本报告交付，M1 final closeout）</w:t>
+      </w:r>
+    </w:p>
+    <w:tbl>
+      <w:tblPr>
+        <w:tblStyle w:val="TableGrid"/>
+        <w:tblW w:type="auto" w:w="0"/>
+        <w:jc w:val="center"/>
+        <w:tblLook w:firstColumn="1" w:firstRow="1" w:lastColumn="0" w:lastRow="0" w:noHBand="0" w:noVBand="1" w:val="04A0"/>
+      </w:tblPr>
+      <w:tblGrid>
+        <w:gridCol w:w="2880"/>
+        <w:gridCol w:w="2880"/>
+        <w:gridCol w:w="2880"/>
+      </w:tblGrid>
+      <w:tr>
+        <w:tc>
+          <w:tcPr>
+            <w:tcW w:type="dxa" w:w="3120"/>
+            <w:shd w:val="clear" w:color="auto" w:fill="2B5C8F"/>
+          </w:tcPr>
+          <w:p>
+            <w:r/>
+            <w:r>
+              <w:rPr>
+                <w:rFonts w:ascii="宋体" w:hAnsi="宋体" w:eastAsia="宋体"/>
+                <w:b/>
+                <w:i w:val="0"/>
+                <w:color w:val="FFFFFF"/>
+                <w:sz w:val="21"/>
+              </w:rPr>
+              <w:t>文件</w:t>
+            </w:r>
+          </w:p>
+        </w:tc>
+        <w:tc>
+          <w:tcPr>
+            <w:tcW w:type="dxa" w:w="3120"/>
+            <w:shd w:val="clear" w:color="auto" w:fill="2B5C8F"/>
+          </w:tcPr>
+          <w:p>
+            <w:r/>
+            <w:r>
+              <w:rPr>
+                <w:rFonts w:ascii="宋体" w:hAnsi="宋体" w:eastAsia="宋体"/>
+                <w:b/>
+                <w:i w:val="0"/>
+                <w:color w:val="FFFFFF"/>
+                <w:sz w:val="21"/>
+              </w:rPr>
+              <w:t>状态</w:t>
+            </w:r>
+          </w:p>
+        </w:tc>
+        <w:tc>
+          <w:tcPr>
+            <w:tcW w:type="dxa" w:w="3120"/>
+            <w:shd w:val="clear" w:color="auto" w:fill="2B5C8F"/>
+          </w:tcPr>
+          <w:p>
+            <w:r/>
+            <w:r>
+              <w:rPr>
+                <w:rFonts w:ascii="宋体" w:hAnsi="宋体" w:eastAsia="宋体"/>
+                <w:b/>
+                <w:i w:val="0"/>
+                <w:color w:val="FFFFFF"/>
+                <w:sz w:val="21"/>
+              </w:rPr>
+              <w:t>closeout 变更</w:t>
+            </w:r>
+          </w:p>
+        </w:tc>
+      </w:tr>
+      <w:tr>
+        <w:tc>
+          <w:tcPr>
+            <w:tcW w:type="dxa" w:w="3120"/>
+          </w:tcPr>
+          <w:p>
+            <w:r/>
+            <w:r>
+              <w:rPr>
+                <w:rFonts w:ascii="宋体" w:hAnsi="宋体" w:eastAsia="宋体"/>
+                <w:b w:val="0"/>
+                <w:i w:val="0"/>
+                <w:sz w:val="20"/>
+              </w:rPr>
+              <w:t>docs/DATA_MODEL.md</w:t>
+            </w:r>
+          </w:p>
+        </w:tc>
+        <w:tc>
+          <w:tcPr>
+            <w:tcW w:type="dxa" w:w="3120"/>
+          </w:tcPr>
+          <w:p>
+            <w:r/>
+            <w:r>
+              <w:rPr>
+                <w:rFonts w:ascii="宋体" w:hAnsi="宋体" w:eastAsia="宋体"/>
+                <w:b w:val="0"/>
+                <w:i w:val="0"/>
+                <w:sz w:val="20"/>
+              </w:rPr>
+              <w:t>修改</w:t>
+            </w:r>
+          </w:p>
+        </w:tc>
+        <w:tc>
+          <w:tcPr>
+            <w:tcW w:type="dxa" w:w="3120"/>
+          </w:tcPr>
+          <w:p>
+            <w:r/>
+            <w:r>
+              <w:rPr>
+                <w:rFonts w:ascii="宋体" w:hAnsi="宋体" w:eastAsia="宋体"/>
+                <w:b w:val="0"/>
+                <w:i w:val="0"/>
+                <w:sz w:val="20"/>
+              </w:rPr>
+              <w:t>幂等表述改为 best-effort（尽力式请求幂等）；索引改 composite 非唯一</w:t>
+            </w:r>
+          </w:p>
+        </w:tc>
+      </w:tr>
+      <w:tr>
+        <w:tc>
+          <w:tcPr>
+            <w:tcW w:type="dxa" w:w="3120"/>
+            <w:shd w:val="clear" w:color="auto" w:fill="EAF1F8"/>
+          </w:tcPr>
+          <w:p>
+            <w:r/>
+            <w:r>
+              <w:rPr>
+                <w:rFonts w:ascii="宋体" w:hAnsi="宋体" w:eastAsia="宋体"/>
+                <w:b w:val="0"/>
+                <w:i w:val="0"/>
+                <w:sz w:val="20"/>
+              </w:rPr>
+              <w:t>docs/ARCHITECTURE.md</w:t>
+            </w:r>
+          </w:p>
+        </w:tc>
+        <w:tc>
+          <w:tcPr>
+            <w:tcW w:type="dxa" w:w="3120"/>
+            <w:shd w:val="clear" w:color="auto" w:fill="EAF1F8"/>
+          </w:tcPr>
+          <w:p>
+            <w:r/>
+            <w:r>
+              <w:rPr>
+                <w:rFonts w:ascii="宋体" w:hAnsi="宋体" w:eastAsia="宋体"/>
+                <w:b w:val="0"/>
+                <w:i w:val="0"/>
+                <w:sz w:val="20"/>
+              </w:rPr>
+              <w:t>修改</w:t>
+            </w:r>
+          </w:p>
+        </w:tc>
+        <w:tc>
+          <w:tcPr>
+            <w:tcW w:type="dxa" w:w="3120"/>
+            <w:shd w:val="clear" w:color="auto" w:fill="EAF1F8"/>
+          </w:tcPr>
+          <w:p>
+            <w:r/>
+            <w:r>
+              <w:rPr>
+                <w:rFonts w:ascii="宋体" w:hAnsi="宋体" w:eastAsia="宋体"/>
+                <w:b w:val="0"/>
+                <w:i w:val="0"/>
+                <w:sz w:val="20"/>
+              </w:rPr>
+              <w:t>§5b 增加 best-effort 术语；索引标注 currently non-unique</w:t>
+            </w:r>
+          </w:p>
+        </w:tc>
+      </w:tr>
+      <w:tr>
+        <w:tc>
+          <w:tcPr>
+            <w:tcW w:type="dxa" w:w="3120"/>
+          </w:tcPr>
+          <w:p>
+            <w:r/>
+            <w:r>
+              <w:rPr>
+                <w:rFonts w:ascii="宋体" w:hAnsi="宋体" w:eastAsia="宋体"/>
+                <w:b w:val="0"/>
+                <w:i w:val="0"/>
+                <w:sz w:val="20"/>
+              </w:rPr>
+              <w:t>docs/SECURITY.md</w:t>
+            </w:r>
+          </w:p>
+        </w:tc>
+        <w:tc>
+          <w:tcPr>
+            <w:tcW w:type="dxa" w:w="3120"/>
+          </w:tcPr>
+          <w:p>
+            <w:r/>
+            <w:r>
+              <w:rPr>
+                <w:rFonts w:ascii="宋体" w:hAnsi="宋体" w:eastAsia="宋体"/>
+                <w:b w:val="0"/>
+                <w:i w:val="0"/>
+                <w:sz w:val="20"/>
+              </w:rPr>
+              <w:t>修改</w:t>
+            </w:r>
+          </w:p>
+        </w:tc>
+        <w:tc>
+          <w:tcPr>
+            <w:tcW w:type="dxa" w:w="3120"/>
+          </w:tcPr>
+          <w:p>
+            <w:r/>
+            <w:r>
+              <w:rPr>
+                <w:rFonts w:ascii="宋体" w:hAnsi="宋体" w:eastAsia="宋体"/>
+                <w:b w:val="0"/>
+                <w:i w:val="0"/>
+                <w:sz w:val="20"/>
+              </w:rPr>
+              <w:t>§3 明确 best-effort 请求幂等（非原子）</w:t>
+            </w:r>
+          </w:p>
+        </w:tc>
+      </w:tr>
+      <w:tr>
+        <w:tc>
+          <w:tcPr>
+            <w:tcW w:type="dxa" w:w="3120"/>
+            <w:shd w:val="clear" w:color="auto" w:fill="EAF1F8"/>
+          </w:tcPr>
+          <w:p>
+            <w:r/>
+            <w:r>
+              <w:rPr>
+                <w:rFonts w:ascii="宋体" w:hAnsi="宋体" w:eastAsia="宋体"/>
+                <w:b w:val="0"/>
+                <w:i w:val="0"/>
+                <w:sz w:val="20"/>
+              </w:rPr>
+              <w:t>docs/USER_FLOWS.md</w:t>
+            </w:r>
+          </w:p>
+        </w:tc>
+        <w:tc>
+          <w:tcPr>
+            <w:tcW w:type="dxa" w:w="3120"/>
+            <w:shd w:val="clear" w:color="auto" w:fill="EAF1F8"/>
+          </w:tcPr>
+          <w:p>
+            <w:r/>
+            <w:r>
+              <w:rPr>
+                <w:rFonts w:ascii="宋体" w:hAnsi="宋体" w:eastAsia="宋体"/>
+                <w:b w:val="0"/>
+                <w:i w:val="0"/>
+                <w:sz w:val="20"/>
+              </w:rPr>
+              <w:t>修改</w:t>
+            </w:r>
+          </w:p>
+        </w:tc>
+        <w:tc>
+          <w:tcPr>
+            <w:tcW w:type="dxa" w:w="3120"/>
+            <w:shd w:val="clear" w:color="auto" w:fill="EAF1F8"/>
+          </w:tcPr>
+          <w:p>
+            <w:r/>
+            <w:r>
+              <w:rPr>
+                <w:rFonts w:ascii="宋体" w:hAnsi="宋体" w:eastAsia="宋体"/>
+                <w:b w:val="0"/>
+                <w:i w:val="0"/>
+                <w:sz w:val="20"/>
+              </w:rPr>
+              <w:t>创建流程增加 best-effort 术语</w:t>
+            </w:r>
+          </w:p>
+        </w:tc>
+      </w:tr>
+      <w:tr>
+        <w:tc>
+          <w:tcPr>
+            <w:tcW w:type="dxa" w:w="3120"/>
+          </w:tcPr>
+          <w:p>
+            <w:r/>
+            <w:r>
+              <w:rPr>
+                <w:rFonts w:ascii="宋体" w:hAnsi="宋体" w:eastAsia="宋体"/>
+                <w:b w:val="0"/>
+                <w:i w:val="0"/>
+                <w:sz w:val="20"/>
+              </w:rPr>
+              <w:t>docs/DEVELOPMENT_PLAN.md</w:t>
+            </w:r>
+          </w:p>
+        </w:tc>
+        <w:tc>
+          <w:tcPr>
+            <w:tcW w:type="dxa" w:w="3120"/>
+          </w:tcPr>
+          <w:p>
+            <w:r/>
+            <w:r>
+              <w:rPr>
+                <w:rFonts w:ascii="宋体" w:hAnsi="宋体" w:eastAsia="宋体"/>
+                <w:b w:val="0"/>
+                <w:i w:val="0"/>
+                <w:sz w:val="20"/>
+              </w:rPr>
+              <w:t>修改</w:t>
+            </w:r>
+          </w:p>
+        </w:tc>
+        <w:tc>
+          <w:tcPr>
+            <w:tcW w:type="dxa" w:w="3120"/>
+          </w:tcPr>
+          <w:p>
+            <w:r/>
+            <w:r>
+              <w:rPr>
+                <w:rFonts w:ascii="宋体" w:hAnsi="宋体" w:eastAsia="宋体"/>
+                <w:b w:val="0"/>
+                <w:i w:val="0"/>
+                <w:sz w:val="20"/>
+              </w:rPr>
+              <w:t>M2 范围对齐「食物目录与份量单位」+ 排除项；M1 验收措辞</w:t>
+            </w:r>
+          </w:p>
+        </w:tc>
+      </w:tr>
+      <w:tr>
+        <w:tc>
+          <w:tcPr>
+            <w:tcW w:type="dxa" w:w="3120"/>
+            <w:shd w:val="clear" w:color="auto" w:fill="EAF1F8"/>
+          </w:tcPr>
+          <w:p>
+            <w:r/>
+            <w:r>
+              <w:rPr>
+                <w:rFonts w:ascii="宋体" w:hAnsi="宋体" w:eastAsia="宋体"/>
+                <w:b w:val="0"/>
+                <w:i w:val="0"/>
+                <w:sz w:val="20"/>
+              </w:rPr>
+              <w:t>README.md</w:t>
+            </w:r>
+          </w:p>
+        </w:tc>
+        <w:tc>
+          <w:tcPr>
+            <w:tcW w:type="dxa" w:w="3120"/>
+            <w:shd w:val="clear" w:color="auto" w:fill="EAF1F8"/>
+          </w:tcPr>
+          <w:p>
+            <w:r/>
+            <w:r>
+              <w:rPr>
+                <w:rFonts w:ascii="宋体" w:hAnsi="宋体" w:eastAsia="宋体"/>
+                <w:b w:val="0"/>
+                <w:i w:val="0"/>
+                <w:sz w:val="20"/>
+              </w:rPr>
+              <w:t>修改</w:t>
+            </w:r>
+          </w:p>
+        </w:tc>
+        <w:tc>
+          <w:tcPr>
+            <w:tcW w:type="dxa" w:w="3120"/>
+            <w:shd w:val="clear" w:color="auto" w:fill="EAF1F8"/>
+          </w:tcPr>
+          <w:p>
+            <w:r/>
+            <w:r>
+              <w:rPr>
+                <w:rFonts w:ascii="宋体" w:hAnsi="宋体" w:eastAsia="宋体"/>
+                <w:b w:val="0"/>
+                <w:i w:val="0"/>
+                <w:sz w:val="20"/>
+              </w:rPr>
+              <w:t>里程碑表 M2/M3 措辞 + M2 排除说明</w:t>
+            </w:r>
+          </w:p>
+        </w:tc>
+      </w:tr>
+      <w:tr>
+        <w:tc>
+          <w:tcPr>
+            <w:tcW w:type="dxa" w:w="3120"/>
+          </w:tcPr>
+          <w:p>
+            <w:r/>
+            <w:r>
+              <w:rPr>
+                <w:rFonts w:ascii="宋体" w:hAnsi="宋体" w:eastAsia="宋体"/>
+                <w:b w:val="0"/>
+                <w:i w:val="0"/>
+                <w:sz w:val="20"/>
+              </w:rPr>
+              <w:t>docs/MANUAL_TEST_RESULTS.md</w:t>
+            </w:r>
+          </w:p>
+        </w:tc>
+        <w:tc>
+          <w:tcPr>
+            <w:tcW w:type="dxa" w:w="3120"/>
+          </w:tcPr>
+          <w:p>
+            <w:r/>
+            <w:r>
+              <w:rPr>
+                <w:rFonts w:ascii="宋体" w:hAnsi="宋体" w:eastAsia="宋体"/>
+                <w:b w:val="0"/>
+                <w:i w:val="0"/>
+                <w:sz w:val="20"/>
+              </w:rPr>
+              <w:t>新增</w:t>
+            </w:r>
+          </w:p>
+        </w:tc>
+        <w:tc>
+          <w:tcPr>
+            <w:tcW w:type="dxa" w:w="3120"/>
+          </w:tcPr>
+          <w:p>
+            <w:r/>
+            <w:r>
+              <w:rPr>
+                <w:rFonts w:ascii="宋体" w:hAnsi="宋体" w:eastAsia="宋体"/>
+                <w:b w:val="0"/>
+                <w:i w:val="0"/>
+                <w:sz w:val="20"/>
+              </w:rPr>
+              <w:t>手动测试结果表（14 项全 Pending）</w:t>
+            </w:r>
+          </w:p>
+        </w:tc>
+      </w:tr>
+      <w:tr>
+        <w:tc>
+          <w:tcPr>
+            <w:tcW w:type="dxa" w:w="3120"/>
+            <w:shd w:val="clear" w:color="auto" w:fill="EAF1F8"/>
+          </w:tcPr>
+          <w:p>
+            <w:r/>
+            <w:r>
+              <w:rPr>
+                <w:rFonts w:ascii="宋体" w:hAnsi="宋体" w:eastAsia="宋体"/>
+                <w:b w:val="0"/>
+                <w:i w:val="0"/>
+                <w:sz w:val="20"/>
+              </w:rPr>
+              <w:t>build_m1_report.py</w:t>
+            </w:r>
+          </w:p>
+        </w:tc>
+        <w:tc>
+          <w:tcPr>
+            <w:tcW w:type="dxa" w:w="3120"/>
+            <w:shd w:val="clear" w:color="auto" w:fill="EAF1F8"/>
+          </w:tcPr>
+          <w:p>
+            <w:r/>
+            <w:r>
+              <w:rPr>
+                <w:rFonts w:ascii="宋体" w:hAnsi="宋体" w:eastAsia="宋体"/>
+                <w:b w:val="0"/>
+                <w:i w:val="0"/>
+                <w:sz w:val="20"/>
+              </w:rPr>
+              <w:t>修改</w:t>
+            </w:r>
+          </w:p>
+        </w:tc>
+        <w:tc>
+          <w:tcPr>
+            <w:tcW w:type="dxa" w:w="3120"/>
+            <w:shd w:val="clear" w:color="auto" w:fill="EAF1F8"/>
+          </w:tcPr>
+          <w:p>
+            <w:r/>
+            <w:r>
+              <w:rPr>
+                <w:rFonts w:ascii="宋体" w:hAnsi="宋体" w:eastAsia="宋体"/>
+                <w:b w:val="0"/>
+                <w:i w:val="0"/>
+                <w:sz w:val="20"/>
+              </w:rPr>
+              <w:t>报告源：幂等表述/路线图/Git 复核/文件计数</w:t>
+            </w:r>
+          </w:p>
+        </w:tc>
+      </w:tr>
+      <w:tr>
+        <w:tc>
+          <w:tcPr>
+            <w:tcW w:type="dxa" w:w="3120"/>
+          </w:tcPr>
+          <w:p>
+            <w:r/>
+            <w:r>
+              <w:rPr>
+                <w:rFonts w:ascii="宋体" w:hAnsi="宋体" w:eastAsia="宋体"/>
+                <w:b w:val="0"/>
+                <w:i w:val="0"/>
+                <w:sz w:val="20"/>
+              </w:rPr>
+              <w:t>docs/M1-FINAL-REPORT.md</w:t>
+            </w:r>
+          </w:p>
+        </w:tc>
+        <w:tc>
+          <w:tcPr>
+            <w:tcW w:type="dxa" w:w="3120"/>
+          </w:tcPr>
+          <w:p>
+            <w:r/>
+            <w:r>
+              <w:rPr>
+                <w:rFonts w:ascii="宋体" w:hAnsi="宋体" w:eastAsia="宋体"/>
+                <w:b w:val="0"/>
+                <w:i w:val="0"/>
+                <w:sz w:val="20"/>
+              </w:rPr>
+              <w:t>重新生成</w:t>
+            </w:r>
+          </w:p>
+        </w:tc>
+        <w:tc>
+          <w:tcPr>
+            <w:tcW w:type="dxa" w:w="3120"/>
+          </w:tcPr>
+          <w:p>
+            <w:r/>
+            <w:r>
+              <w:rPr>
+                <w:rFonts w:ascii="宋体" w:hAnsi="宋体" w:eastAsia="宋体"/>
+                <w:b w:val="0"/>
+                <w:i w:val="0"/>
+                <w:sz w:val="20"/>
+              </w:rPr>
+              <w:t>本报告 Markdown 草稿</w:t>
+            </w:r>
+          </w:p>
+        </w:tc>
+      </w:tr>
+      <w:tr>
+        <w:tc>
+          <w:tcPr>
+            <w:tcW w:type="dxa" w:w="3120"/>
+            <w:shd w:val="clear" w:color="auto" w:fill="EAF1F8"/>
+          </w:tcPr>
+          <w:p>
+            <w:r/>
+            <w:r>
+              <w:rPr>
+                <w:rFonts w:ascii="宋体" w:hAnsi="宋体" w:eastAsia="宋体"/>
+                <w:b w:val="0"/>
+                <w:i w:val="0"/>
+                <w:sz w:val="20"/>
+              </w:rPr>
+              <w:t>M1-FINAL-REPORT.docx</w:t>
+            </w:r>
+          </w:p>
+        </w:tc>
+        <w:tc>
+          <w:tcPr>
+            <w:tcW w:type="dxa" w:w="3120"/>
+            <w:shd w:val="clear" w:color="auto" w:fill="EAF1F8"/>
+          </w:tcPr>
+          <w:p>
+            <w:r/>
+            <w:r>
+              <w:rPr>
+                <w:rFonts w:ascii="宋体" w:hAnsi="宋体" w:eastAsia="宋体"/>
+                <w:b w:val="0"/>
+                <w:i w:val="0"/>
+                <w:sz w:val="20"/>
+              </w:rPr>
+              <w:t>重新生成</w:t>
+            </w:r>
+          </w:p>
+        </w:tc>
+        <w:tc>
+          <w:tcPr>
+            <w:tcW w:type="dxa" w:w="3120"/>
+            <w:shd w:val="clear" w:color="auto" w:fill="EAF1F8"/>
+          </w:tcPr>
+          <w:p>
+            <w:r/>
+            <w:r>
+              <w:rPr>
+                <w:rFonts w:ascii="宋体" w:hAnsi="宋体" w:eastAsia="宋体"/>
+                <w:b w:val="0"/>
+                <w:i w:val="0"/>
+                <w:sz w:val="20"/>
+              </w:rPr>
+              <w:t>本报告 Word（蓝色主题）</w:t>
             </w:r>
           </w:p>
         </w:tc>
@@ -4554,7 +6270,7 @@
           <w:i w:val="0"/>
           <w:sz w:val="24"/>
         </w:rPr>
-        <w:t>以三元组 (ownerOpenid, operation, requestId) 唯一标识一次逻辑意图：相同 requestId 的重复请求返回原档案（resultId），不新建；不同 requestId 视为新意图（即便姓名/关系相同）。requestId 以可信 ownerOpenid 作用域隔离，不同用户复用同一字符串不冲突。</w:t>
+        <w:t>以三元组 (ownerOpenid, operation, requestId) 标识一次逻辑意图：相同 requestId 的重复请求通常返回原档案（resultId），不新建；不同 requestId 视为新意图（即便姓名/关系相同）。requestId 以可信 ownerOpenid 作用域隔离，不同用户复用同一字符串不冲突。这是 **best-effort 请求幂等（尽力式请求幂等）**——客户端 in-flight 防护 + 服务端请求重放处理——**不是**严格/原子保证：read→create→write-key 非原子，存在残留并发竞态（详见第 16 节与 docs）。</w:t>
       </w:r>
     </w:p>
     <w:p>
@@ -4869,7 +6585,7 @@
                 <w:i w:val="0"/>
                 <w:sz w:val="20"/>
               </w:rPr>
-              <w:t>复合（M3 建议改唯一）</w:t>
+              <w:t>复合（当前非唯一；M3 升级为唯一索引作原子闸）</w:t>
             </w:r>
           </w:p>
         </w:tc>
@@ -4886,7 +6602,7 @@
                 <w:i w:val="0"/>
                 <w:sz w:val="20"/>
               </w:rPr>
-              <w:t>创建操作的请求级幂等</w:t>
+              <w:t>创建操作的 best-effort 请求幂等</w:t>
             </w:r>
           </w:p>
         </w:tc>
@@ -5194,7 +6910,7 @@
                 <w:i w:val="0"/>
                 <w:sz w:val="20"/>
               </w:rPr>
-              <w:t>规范化输入；服务端写 ownerOpenid；首个档案自动默认；按 requestId 请求级幂等；不按姓名去重</w:t>
+              <w:t>规范化输入；服务端写 ownerOpenid；首个档案自动默认；按 requestId 的 best-effort 请求幂等（尽力式请求幂等）；不按姓名去重</w:t>
             </w:r>
           </w:p>
         </w:tc>
@@ -5338,7 +7054,7 @@
           <w:i w:val="0"/>
           <w:sz w:val="24"/>
         </w:rPr>
-        <w:t>【M1.1】create 携带 event.requestId，服务端以 (ownerOpenid, 'create', requestId) 查 idempotency_keys：命中则返回原档案，未命中则创建并记录键；不再进行基于姓名的去重。isDefault 一律由 DTO 计算（profile.id === user.defaultFamilyProfileId），服务端不持久化该字段。</w:t>
+        <w:t>【M1.1】create 携带 event.requestId，服务端以 (ownerOpenid, 'create', requestId) 查 idempotency_keys：命中则返回原档案，未命中则创建并记录键；不再进行基于姓名的去重。这是 **best-effort 请求幂等**：read→create→write-key 非原子，理论上并发同 requestId 可能各建一条，但 UI in-flight 防护 + 单用户点击并发已将其缓解（残留竞态见第 16 节、docs）。isDefault 一律由 DTO 计算（profile.id === user.defaultFamilyProfileId），服务端不持久化该字段。</w:t>
       </w:r>
     </w:p>
     <w:p>
@@ -6046,7 +7762,7 @@
                 <w:i w:val="0"/>
                 <w:sz w:val="20"/>
               </w:rPr>
-              <w:t>客户端按钮防重（in-flight 标记）；服务端按 requestId 请求级幂等（不按姓名去重），保证同一意图不重复创建</w:t>
+              <w:t>客户端按钮防重（in-flight 标记）；服务端按 requestId 的 best-effort 请求幂等（尽力式请求幂等，非原子保证），正常保证同一意图不重复创建；残留并发竞态由 UI 防抖缓解</w:t>
             </w:r>
           </w:p>
         </w:tc>
@@ -8159,7 +9875,7 @@
           <w:i w:val="0"/>
           <w:sz w:val="24"/>
         </w:rPr>
-        <w:t>分支：feature/m1-identity-family-profiles，自干净的 M0 基线（cc698c2）切出。以下为 git log --oneline cc698c2..HEAD 的实际记录（与仓库一致，未编造/未 squash）：</w:t>
+        <w:t>分支：feature/m1-identity-family-profiles，自干净的 M0 基线（cc698c2）切出。以下为 `git log --oneline cc698c2..HEAD` 在本报告重新生成前（即提交本 closeout 报告之前）的真实记录，全部为真实 hash，未编造、未 squash：</w:t>
       </w:r>
     </w:p>
     <w:p>
@@ -8589,7 +10305,7 @@
           <w:color w:val="2B5C8F"/>
           <w:sz w:val="25"/>
         </w:rPr>
-        <w:t>14.2 M1.1 加固提交（3 个 + 本报告提交）</w:t>
+        <w:t>14.2 M1.1 加固提交（4 个，真实 hash）</w:t>
       </w:r>
     </w:p>
     <w:tbl>
@@ -8858,7 +10574,7 @@
                 <w:i w:val="0"/>
                 <w:sz w:val="20"/>
               </w:rPr>
-              <w:t>(本次)</w:t>
+              <w:t>f95054d</w:t>
             </w:r>
           </w:p>
         </w:tc>
@@ -8894,7 +10610,7 @@
           <w:i w:val="0"/>
           <w:sz w:val="24"/>
         </w:rPr>
-        <w:t>说明：第 10 条为本报告自身的提交，在本文件生成时其 hash 尚未产生，故以「(本次)」标注；提交后即为分支 HEAD。合计自 M0 以来 M1 6 个 + M1.1 4 个。</w:t>
+        <w:t>说明：上方共 10 个提交，hash 均真实存在，与仓库 `git log --oneline cc698c2..HEAD`（本报告生成前）完全一致。**本报告（本 closeout 重新生成的版本）所在的提交未列入该日志**——因为报告在生成提交之前已写好，其 hash 彼时尚未产生。即：*The commit containing this regenerated report is not included in the log above because the report was generated before that commit was created.* 合并计数：M1 6 个 + M1.1 4 个 = 10 个（本 closeout 的额外提交另计，不计入上方日志）。</w:t>
       </w:r>
     </w:p>
     <w:p>
@@ -8923,7 +10639,7 @@
           <w:color w:val="1A3A6B"/>
           <w:sz w:val="30"/>
         </w:rPr>
-        <w:t>15. M2 建议（不实现）</w:t>
+        <w:t>15. 里程碑路线图（仅规划，不实现）</w:t>
       </w:r>
     </w:p>
     <w:p>
@@ -8937,84 +10653,462 @@
           <w:i w:val="0"/>
           <w:sz w:val="24"/>
         </w:rPr>
-        <w:t>建议 M2 聚焦「用餐记录与营养」：</w:t>
+        <w:t>经 PM 复核，M2 不再建议「用餐记录与营养（含 mealApi CRUD）」。约定序列如下，M2 仅聚焦食物目录与份量单位：</w:t>
       </w:r>
     </w:p>
-    <w:p>
-      <w:pPr>
-        <w:pStyle w:val="ListBullet"/>
-        <w:spacing w:after="60"/>
-      </w:pPr>
-      <w:r>
-        <w:rPr>
-          <w:rFonts w:ascii="宋体" w:hAnsi="宋体" w:eastAsia="宋体"/>
-          <w:b w:val="0"/>
-          <w:i w:val="0"/>
-          <w:sz w:val="24"/>
-        </w:rPr>
-        <w:t>扩展 mealApi：meal 的 create/list/get/update，使用活动档案 ID（activeFamilyProfileId）+ 本地日分区（YYYY-MM-DD）。</w:t>
-      </w:r>
-    </w:p>
-    <w:p>
-      <w:pPr>
-        <w:pStyle w:val="ListBullet"/>
-        <w:spacing w:after="60"/>
-      </w:pPr>
-      <w:r>
-        <w:rPr>
-          <w:rFonts w:ascii="宋体" w:hAnsi="宋体" w:eastAsia="宋体"/>
-          <w:b w:val="0"/>
-          <w:i w:val="0"/>
-          <w:sz w:val="24"/>
-        </w:rPr>
-        <w:t>复用 M0 已有的营养工具（validateMeal / sumNutrition / caloriesFromMacros 已在共享运行时与校验中验证），定义 food item 模型与营养汇总。</w:t>
-      </w:r>
-    </w:p>
-    <w:p>
-      <w:pPr>
-        <w:pStyle w:val="ListBullet"/>
-        <w:spacing w:after="60"/>
-      </w:pPr>
-      <w:r>
-        <w:rPr>
-          <w:rFonts w:ascii="宋体" w:hAnsi="宋体" w:eastAsia="宋体"/>
-          <w:b w:val="0"/>
-          <w:i w:val="0"/>
-          <w:sz w:val="24"/>
-        </w:rPr>
-        <w:t>客户端新增记餐列表与「记餐」表单（首页占位已预留），按活动档案归属与本地日筛选。</w:t>
-      </w:r>
-    </w:p>
-    <w:p>
-      <w:pPr>
-        <w:pStyle w:val="ListBullet"/>
-        <w:spacing w:after="60"/>
-      </w:pPr>
-      <w:r>
-        <w:rPr>
-          <w:rFonts w:ascii="宋体" w:hAnsi="宋体" w:eastAsia="宋体"/>
-          <w:b w:val="0"/>
-          <w:i w:val="0"/>
-          <w:sz w:val="24"/>
-        </w:rPr>
-        <w:t>所有权范围沿用 profileApi 的服务端 OPENID 校验，meal 查询以 ownerOpenid + activeFamilyProfileId 隔离。</w:t>
-      </w:r>
-    </w:p>
-    <w:p>
-      <w:pPr>
-        <w:pStyle w:val="ListBullet"/>
-        <w:spacing w:after="60"/>
-      </w:pPr>
-      <w:r>
-        <w:rPr>
-          <w:rFonts w:ascii="宋体" w:hAnsi="宋体" w:eastAsia="宋体"/>
-          <w:b w:val="0"/>
-          <w:i w:val="0"/>
-          <w:sz w:val="24"/>
-        </w:rPr>
-        <w:t>照片/AI 分析延后：provider-neutral 适配层桩已就位，M2 不接真实 AI。</w:t>
-      </w:r>
-    </w:p>
+    <w:tbl>
+      <w:tblPr>
+        <w:tblStyle w:val="TableGrid"/>
+        <w:tblW w:type="auto" w:w="0"/>
+        <w:jc w:val="center"/>
+        <w:tblLook w:firstColumn="1" w:firstRow="1" w:lastColumn="0" w:lastRow="0" w:noHBand="0" w:noVBand="1" w:val="04A0"/>
+      </w:tblPr>
+      <w:tblGrid>
+        <w:gridCol w:w="2880"/>
+        <w:gridCol w:w="2880"/>
+        <w:gridCol w:w="2880"/>
+      </w:tblGrid>
+      <w:tr>
+        <w:tc>
+          <w:tcPr>
+            <w:tcW w:type="dxa" w:w="3120"/>
+            <w:shd w:val="clear" w:color="auto" w:fill="2B5C8F"/>
+          </w:tcPr>
+          <w:p>
+            <w:r/>
+            <w:r>
+              <w:rPr>
+                <w:rFonts w:ascii="宋体" w:hAnsi="宋体" w:eastAsia="宋体"/>
+                <w:b/>
+                <w:i w:val="0"/>
+                <w:color w:val="FFFFFF"/>
+                <w:sz w:val="21"/>
+              </w:rPr>
+              <w:t>里程碑</w:t>
+            </w:r>
+          </w:p>
+        </w:tc>
+        <w:tc>
+          <w:tcPr>
+            <w:tcW w:type="dxa" w:w="3120"/>
+            <w:shd w:val="clear" w:color="auto" w:fill="2B5C8F"/>
+          </w:tcPr>
+          <w:p>
+            <w:r/>
+            <w:r>
+              <w:rPr>
+                <w:rFonts w:ascii="宋体" w:hAnsi="宋体" w:eastAsia="宋体"/>
+                <w:b/>
+                <w:i w:val="0"/>
+                <w:color w:val="FFFFFF"/>
+                <w:sz w:val="21"/>
+              </w:rPr>
+              <w:t>范围</w:t>
+            </w:r>
+          </w:p>
+        </w:tc>
+        <w:tc>
+          <w:tcPr>
+            <w:tcW w:type="dxa" w:w="3120"/>
+            <w:shd w:val="clear" w:color="auto" w:fill="2B5C8F"/>
+          </w:tcPr>
+          <w:p>
+            <w:r/>
+            <w:r>
+              <w:rPr>
+                <w:rFonts w:ascii="宋体" w:hAnsi="宋体" w:eastAsia="宋体"/>
+                <w:b/>
+                <w:i w:val="0"/>
+                <w:color w:val="FFFFFF"/>
+                <w:sz w:val="21"/>
+              </w:rPr>
+              <w:t>明确排除</w:t>
+            </w:r>
+          </w:p>
+        </w:tc>
+      </w:tr>
+      <w:tr>
+        <w:tc>
+          <w:tcPr>
+            <w:tcW w:type="dxa" w:w="3120"/>
+          </w:tcPr>
+          <w:p>
+            <w:r/>
+            <w:r>
+              <w:rPr>
+                <w:rFonts w:ascii="宋体" w:hAnsi="宋体" w:eastAsia="宋体"/>
+                <w:b w:val="0"/>
+                <w:i w:val="0"/>
+                <w:sz w:val="20"/>
+              </w:rPr>
+              <w:t>M2 — Food Catalog &amp; Portion Units</w:t>
+            </w:r>
+          </w:p>
+        </w:tc>
+        <w:tc>
+          <w:tcPr>
+            <w:tcW w:type="dxa" w:w="3120"/>
+          </w:tcPr>
+          <w:p>
+            <w:r/>
+            <w:r>
+              <w:rPr>
+                <w:rFonts w:ascii="宋体" w:hAnsi="宋体" w:eastAsia="宋体"/>
+                <w:b w:val="0"/>
+                <w:i w:val="0"/>
+                <w:sz w:val="20"/>
+              </w:rPr>
+              <w:t>小型精选系统食物种子数据集；食物搜索与选择；用户自定义临时食物；通用份量单位 + 食物专属份量单位；份量→克换算；单食物实时营养预览；营养记录的来源与版本元数据</w:t>
+            </w:r>
+          </w:p>
+        </w:tc>
+        <w:tc>
+          <w:tcPr>
+            <w:tcW w:type="dxa" w:w="3120"/>
+          </w:tcPr>
+          <w:p>
+            <w:r/>
+            <w:r>
+              <w:rPr>
+                <w:rFonts w:ascii="宋体" w:hAnsi="宋体" w:eastAsia="宋体"/>
+                <w:b w:val="0"/>
+                <w:i w:val="0"/>
+                <w:sz w:val="20"/>
+              </w:rPr>
+              <w:t>保存餐食；mealApi 增删改查；每日餐史；食谱；照片上传；AI 识别</w:t>
+            </w:r>
+          </w:p>
+        </w:tc>
+      </w:tr>
+      <w:tr>
+        <w:tc>
+          <w:tcPr>
+            <w:tcW w:type="dxa" w:w="3120"/>
+            <w:shd w:val="clear" w:color="auto" w:fill="EAF1F8"/>
+          </w:tcPr>
+          <w:p>
+            <w:r/>
+            <w:r>
+              <w:rPr>
+                <w:rFonts w:ascii="宋体" w:hAnsi="宋体" w:eastAsia="宋体"/>
+                <w:b w:val="0"/>
+                <w:i w:val="0"/>
+                <w:sz w:val="20"/>
+              </w:rPr>
+              <w:t>M3 — Manual Meal Logging</w:t>
+            </w:r>
+          </w:p>
+        </w:tc>
+        <w:tc>
+          <w:tcPr>
+            <w:tcW w:type="dxa" w:w="3120"/>
+            <w:shd w:val="clear" w:color="auto" w:fill="EAF1F8"/>
+          </w:tcPr>
+          <w:p>
+            <w:r/>
+            <w:r>
+              <w:rPr>
+                <w:rFonts w:ascii="宋体" w:hAnsi="宋体" w:eastAsia="宋体"/>
+                <w:b w:val="0"/>
+                <w:i w:val="0"/>
+                <w:sz w:val="20"/>
+              </w:rPr>
+              <w:t>多食物组合成一餐；餐型与日期；服务端校验与重算；保存并重新加载餐食</w:t>
+            </w:r>
+          </w:p>
+        </w:tc>
+        <w:tc>
+          <w:tcPr>
+            <w:tcW w:type="dxa" w:w="3120"/>
+            <w:shd w:val="clear" w:color="auto" w:fill="EAF1F8"/>
+          </w:tcPr>
+          <w:p>
+            <w:r/>
+            <w:r>
+              <w:rPr>
+                <w:rFonts w:ascii="宋体" w:hAnsi="宋体" w:eastAsia="宋体"/>
+                <w:b w:val="0"/>
+                <w:i w:val="0"/>
+                <w:sz w:val="20"/>
+              </w:rPr>
+              <w:t>继承 M2 排除项；不含编辑/删除（见 M4）</w:t>
+            </w:r>
+          </w:p>
+        </w:tc>
+      </w:tr>
+      <w:tr>
+        <w:tc>
+          <w:tcPr>
+            <w:tcW w:type="dxa" w:w="3120"/>
+          </w:tcPr>
+          <w:p>
+            <w:r/>
+            <w:r>
+              <w:rPr>
+                <w:rFonts w:ascii="宋体" w:hAnsi="宋体" w:eastAsia="宋体"/>
+                <w:b w:val="0"/>
+                <w:i w:val="0"/>
+                <w:sz w:val="20"/>
+              </w:rPr>
+              <w:t>M4 — History, Edit &amp; Delete</w:t>
+            </w:r>
+          </w:p>
+        </w:tc>
+        <w:tc>
+          <w:tcPr>
+            <w:tcW w:type="dxa" w:w="3120"/>
+          </w:tcPr>
+          <w:p>
+            <w:r/>
+            <w:r>
+              <w:rPr>
+                <w:rFonts w:ascii="宋体" w:hAnsi="宋体" w:eastAsia="宋体"/>
+                <w:b w:val="0"/>
+                <w:i w:val="0"/>
+                <w:sz w:val="20"/>
+              </w:rPr>
+              <w:t>每日餐史浏览；编辑与删除餐食</w:t>
+            </w:r>
+          </w:p>
+        </w:tc>
+        <w:tc>
+          <w:tcPr>
+            <w:tcW w:type="dxa" w:w="3120"/>
+          </w:tcPr>
+          <w:p>
+            <w:r/>
+            <w:r>
+              <w:rPr>
+                <w:rFonts w:ascii="宋体" w:hAnsi="宋体" w:eastAsia="宋体"/>
+                <w:b w:val="0"/>
+                <w:i w:val="0"/>
+                <w:sz w:val="20"/>
+              </w:rPr>
+              <w:t>—</w:t>
+            </w:r>
+          </w:p>
+        </w:tc>
+      </w:tr>
+      <w:tr>
+        <w:tc>
+          <w:tcPr>
+            <w:tcW w:type="dxa" w:w="3120"/>
+            <w:shd w:val="clear" w:color="auto" w:fill="EAF1F8"/>
+          </w:tcPr>
+          <w:p>
+            <w:r/>
+            <w:r>
+              <w:rPr>
+                <w:rFonts w:ascii="宋体" w:hAnsi="宋体" w:eastAsia="宋体"/>
+                <w:b w:val="0"/>
+                <w:i w:val="0"/>
+                <w:sz w:val="20"/>
+              </w:rPr>
+              <w:t>M5 — Saved Foods &amp; Recipes</w:t>
+            </w:r>
+          </w:p>
+        </w:tc>
+        <w:tc>
+          <w:tcPr>
+            <w:tcW w:type="dxa" w:w="3120"/>
+            <w:shd w:val="clear" w:color="auto" w:fill="EAF1F8"/>
+          </w:tcPr>
+          <w:p>
+            <w:r/>
+            <w:r>
+              <w:rPr>
+                <w:rFonts w:ascii="宋体" w:hAnsi="宋体" w:eastAsia="宋体"/>
+                <w:b w:val="0"/>
+                <w:i w:val="0"/>
+                <w:sz w:val="20"/>
+              </w:rPr>
+              <w:t>收藏食物；简单家庭食谱</w:t>
+            </w:r>
+          </w:p>
+        </w:tc>
+        <w:tc>
+          <w:tcPr>
+            <w:tcW w:type="dxa" w:w="3120"/>
+            <w:shd w:val="clear" w:color="auto" w:fill="EAF1F8"/>
+          </w:tcPr>
+          <w:p>
+            <w:r/>
+            <w:r>
+              <w:rPr>
+                <w:rFonts w:ascii="宋体" w:hAnsi="宋体" w:eastAsia="宋体"/>
+                <w:b w:val="0"/>
+                <w:i w:val="0"/>
+                <w:sz w:val="20"/>
+              </w:rPr>
+              <w:t>—</w:t>
+            </w:r>
+          </w:p>
+        </w:tc>
+      </w:tr>
+      <w:tr>
+        <w:tc>
+          <w:tcPr>
+            <w:tcW w:type="dxa" w:w="3120"/>
+          </w:tcPr>
+          <w:p>
+            <w:r/>
+            <w:r>
+              <w:rPr>
+                <w:rFonts w:ascii="宋体" w:hAnsi="宋体" w:eastAsia="宋体"/>
+                <w:b w:val="0"/>
+                <w:i w:val="0"/>
+                <w:sz w:val="20"/>
+              </w:rPr>
+              <w:t>M6 — Photo Upload</w:t>
+            </w:r>
+          </w:p>
+        </w:tc>
+        <w:tc>
+          <w:tcPr>
+            <w:tcW w:type="dxa" w:w="3120"/>
+          </w:tcPr>
+          <w:p>
+            <w:r/>
+            <w:r>
+              <w:rPr>
+                <w:rFonts w:ascii="宋体" w:hAnsi="宋体" w:eastAsia="宋体"/>
+                <w:b w:val="0"/>
+                <w:i w:val="0"/>
+                <w:sz w:val="20"/>
+              </w:rPr>
+              <w:t>餐食照片上传至 CloudBase Storage</w:t>
+            </w:r>
+          </w:p>
+        </w:tc>
+        <w:tc>
+          <w:tcPr>
+            <w:tcW w:type="dxa" w:w="3120"/>
+          </w:tcPr>
+          <w:p>
+            <w:r/>
+            <w:r>
+              <w:rPr>
+                <w:rFonts w:ascii="宋体" w:hAnsi="宋体" w:eastAsia="宋体"/>
+                <w:b w:val="0"/>
+                <w:i w:val="0"/>
+                <w:sz w:val="20"/>
+              </w:rPr>
+              <w:t>—</w:t>
+            </w:r>
+          </w:p>
+        </w:tc>
+      </w:tr>
+      <w:tr>
+        <w:tc>
+          <w:tcPr>
+            <w:tcW w:type="dxa" w:w="3120"/>
+            <w:shd w:val="clear" w:color="auto" w:fill="EAF1F8"/>
+          </w:tcPr>
+          <w:p>
+            <w:r/>
+            <w:r>
+              <w:rPr>
+                <w:rFonts w:ascii="宋体" w:hAnsi="宋体" w:eastAsia="宋体"/>
+                <w:b w:val="0"/>
+                <w:i w:val="0"/>
+                <w:sz w:val="20"/>
+              </w:rPr>
+              <w:t>M7 — Mock AI Suggestions</w:t>
+            </w:r>
+          </w:p>
+        </w:tc>
+        <w:tc>
+          <w:tcPr>
+            <w:tcW w:type="dxa" w:w="3120"/>
+            <w:shd w:val="clear" w:color="auto" w:fill="EAF1F8"/>
+          </w:tcPr>
+          <w:p>
+            <w:r/>
+            <w:r>
+              <w:rPr>
+                <w:rFonts w:ascii="宋体" w:hAnsi="宋体" w:eastAsia="宋体"/>
+                <w:b w:val="0"/>
+                <w:i w:val="0"/>
+                <w:sz w:val="20"/>
+              </w:rPr>
+              <w:t>provider-neutral 适配层 + mock 供应商 + 确认/修正 UX</w:t>
+            </w:r>
+          </w:p>
+        </w:tc>
+        <w:tc>
+          <w:tcPr>
+            <w:tcW w:type="dxa" w:w="3120"/>
+            <w:shd w:val="clear" w:color="auto" w:fill="EAF1F8"/>
+          </w:tcPr>
+          <w:p>
+            <w:r/>
+            <w:r>
+              <w:rPr>
+                <w:rFonts w:ascii="宋体" w:hAnsi="宋体" w:eastAsia="宋体"/>
+                <w:b w:val="0"/>
+                <w:i w:val="0"/>
+                <w:sz w:val="20"/>
+              </w:rPr>
+              <w:t>真实 AI</w:t>
+            </w:r>
+          </w:p>
+        </w:tc>
+      </w:tr>
+      <w:tr>
+        <w:tc>
+          <w:tcPr>
+            <w:tcW w:type="dxa" w:w="3120"/>
+          </w:tcPr>
+          <w:p>
+            <w:r/>
+            <w:r>
+              <w:rPr>
+                <w:rFonts w:ascii="宋体" w:hAnsi="宋体" w:eastAsia="宋体"/>
+                <w:b w:val="0"/>
+                <w:i w:val="0"/>
+                <w:sz w:val="20"/>
+              </w:rPr>
+              <w:t>M8 — Real AI Provider</w:t>
+            </w:r>
+          </w:p>
+        </w:tc>
+        <w:tc>
+          <w:tcPr>
+            <w:tcW w:type="dxa" w:w="3120"/>
+          </w:tcPr>
+          <w:p>
+            <w:r/>
+            <w:r>
+              <w:rPr>
+                <w:rFonts w:ascii="宋体" w:hAnsi="宋体" w:eastAsia="宋体"/>
+                <w:b w:val="0"/>
+                <w:i w:val="0"/>
+                <w:sz w:val="20"/>
+              </w:rPr>
+              <w:t>同一接口后接入真实供应商；密钥仅存 CloudBase 函数环境变量</w:t>
+            </w:r>
+          </w:p>
+        </w:tc>
+        <w:tc>
+          <w:tcPr>
+            <w:tcW w:type="dxa" w:w="3120"/>
+          </w:tcPr>
+          <w:p>
+            <w:r/>
+            <w:r>
+              <w:rPr>
+                <w:rFonts w:ascii="宋体" w:hAnsi="宋体" w:eastAsia="宋体"/>
+                <w:b w:val="0"/>
+                <w:i w:val="0"/>
+                <w:sz w:val="20"/>
+              </w:rPr>
+              <w:t>—</w:t>
+            </w:r>
+          </w:p>
+        </w:tc>
+      </w:tr>
+    </w:tbl>
+    <w:p/>
     <w:p>
       <w:pPr>
         <w:spacing w:after="120"/>
@@ -9026,7 +11120,7 @@
           <w:i w:val="0"/>
           <w:sz w:val="24"/>
         </w:rPr>
-        <w:t>注意：M2 仍保持单一所有者模型，不引入多人共享；openid 继续仅服务端可见。</w:t>
+        <w:t>M2 详细验收见 docs/DEVELOPMENT_PLAN.md（已标注 M2 仅食物目录与份量单位，不含任何 meal 持久化）。全部里程碑保持单一所有者模型，openid 仅服务端可见。本 closeout 未实现任何 M2+ 代码。</w:t>
       </w:r>
     </w:p>
     <w:p>
@@ -9070,7 +11164,7 @@
           <w:color w:val="2B5C8F"/>
           <w:sz w:val="25"/>
         </w:rPr>
-        <w:t>16.1 修正一：移除基于姓名的档案去重</w:t>
+        <w:t>16.1 修正一：移除基于姓名的档案去重（best-effort 请求幂等）</w:t>
       </w:r>
     </w:p>
     <w:p>
@@ -9100,7 +11194,7 @@
           <w:i w:val="0"/>
           <w:sz w:val="24"/>
         </w:rPr>
-        <w:t>修正：createProfile 不再按姓名去重；姓名不作唯一键。防止误重复改由两层实现——(a) 客户端提交 in-flight 防抖；(b) 客户端生成 requestId 的请求级幂等，作用域为 (ownerOpenid, operation, requestId)。</w:t>
+        <w:t>修正：createProfile 不再按姓名去重；姓名不作唯一键。防止误重复改由两层实现——(a) 客户端提交 in-flight 防抖；(b) 客户端生成 requestId 的 **best-effort 请求幂等（尽力式请求幂等）**：客户端 in-flight 防护 + 服务端请求重放处理，作用域为 (ownerOpenid, operation, requestId)。</w:t>
       </w:r>
     </w:p>
     <w:p>
@@ -9131,6 +11225,21 @@
           <w:sz w:val="24"/>
         </w:rPr>
         <w:t>落地：新增 idempotency_keys 集合与 IdempotencyKey 类型；Repository 增加 findIdempotencyKey / saveIdempotencyKey；内存实现与 CloudBase 实现均补齐；profileApi.index.js 透传 event.requestId。</w:t>
+      </w:r>
+    </w:p>
+    <w:p>
+      <w:pPr>
+        <w:pStyle w:val="ListBullet"/>
+        <w:spacing w:after="60"/>
+      </w:pPr>
+      <w:r>
+        <w:rPr>
+          <w:rFonts w:ascii="宋体" w:hAnsi="宋体" w:eastAsia="宋体"/>
+          <w:b w:val="0"/>
+          <w:i w:val="0"/>
+          <w:sz w:val="24"/>
+        </w:rPr>
+        <w:t>文档化事实（不宣称严格/原子幂等）：(1) 相同 requestId 通常返回原结果；(2) 不同 requestId 允许重名档案；(3) read→create→write-key 非原子，存在残留并发竞态；(4) UI in-flight 防护降低家庭 MVP 的实际风险；(5) 未来通用原子方案应在实体创建前用唯一约束/原子幂等键申领（唯一复合索引，重复键即视为已处理并返回 resultId）；(6) 该更强实现应在此之前或 M3（餐食创建同样需要幂等）引入。</w:t>
       </w:r>
     </w:p>
     <w:p>
@@ -10209,7 +12318,7 @@
           <w:i w:val="0"/>
           <w:sz w:val="24"/>
         </w:rPr>
-        <w:t>两处设计修正均已完成并通过自动化验收（91/91）。分支 feature/m1-identity-family-profiles 具备合入 main 的条件；唯一待办为产品负责人在 DevTools / 真机环境执行手动冒烟（见第 17 节，含精确步骤）——该项无法在当前自动化环境代为执行，故以「待执行」明确标注，不影响代码层面的合并就绪判定。</w:t>
+        <w:t>两处设计修正均已完成并通过自动化验收（91/91）。分支 feature/m1-identity-family-profiles 的**代码与文档已就绪，可进入产品负责人的 DevTools / 真机手动验收**（见第 17、18 节）。未宣称产品已验收通过——手动/真机冒烟（无法在当前自动化环境代跑）完成前，不应判定为 fully product-accepted。</w:t>
       </w:r>
     </w:p>
     <w:p>
@@ -10682,7 +12791,155 @@
           <w:i w:val="0"/>
           <w:sz w:val="24"/>
         </w:rPr>
-        <w:t>以上步骤执行后，请将结果回填至 docs/MANUAL_TEST_CHECKLIST.md 并在本节标注实际状态。</w:t>
+        <w:t>以上步骤执行后，请将结果回填至 docs/MANUAL_TEST_RESULTS.md（手动测试结果表，14 项全 Pending）并在本节标注实际状态。</w:t>
+      </w:r>
+    </w:p>
+    <w:p>
+      <w:pPr>
+        <w:spacing w:before="200" w:after="120"/>
+      </w:pPr>
+      <w:r>
+        <w:rPr>
+          <w:rFonts w:ascii="宋体" w:hAnsi="宋体" w:eastAsia="宋体"/>
+          <w:b/>
+          <w:i w:val="0"/>
+          <w:color w:val="1A3A6B"/>
+          <w:sz w:val="30"/>
+        </w:rPr>
+        <w:t>18. M1 最终 closeout（本交付修正）</w:t>
+      </w:r>
+    </w:p>
+    <w:p>
+      <w:pPr>
+        <w:spacing w:after="120"/>
+      </w:pPr>
+      <w:r>
+        <w:rPr>
+          <w:rFonts w:ascii="宋体" w:hAnsi="宋体" w:eastAsia="宋体"/>
+          <w:b w:val="0"/>
+          <w:i w:val="0"/>
+          <w:sz w:val="24"/>
+        </w:rPr>
+        <w:t>本 closeout 是合入 main 前的最后一次窄范围修正，仅处理 PM 复核发现的报告与文档问题，不改变 M1/M1.1 的实现代码（实现已通过 91/91 自动化验收）。</w:t>
+      </w:r>
+    </w:p>
+    <w:p>
+      <w:pPr>
+        <w:spacing w:before="120" w:after="60"/>
+      </w:pPr>
+      <w:r>
+        <w:rPr>
+          <w:rFonts w:ascii="宋体" w:hAnsi="宋体" w:eastAsia="宋体"/>
+          <w:b/>
+          <w:i w:val="0"/>
+          <w:color w:val="2B5C8F"/>
+          <w:sz w:val="25"/>
+        </w:rPr>
+        <w:t>18.1 本轮修正内容</w:t>
+      </w:r>
+    </w:p>
+    <w:p>
+      <w:pPr>
+        <w:pStyle w:val="ListBullet"/>
+        <w:spacing w:after="60"/>
+      </w:pPr>
+      <w:r>
+        <w:rPr>
+          <w:rFonts w:ascii="宋体" w:hAnsi="宋体" w:eastAsia="宋体"/>
+          <w:b w:val="0"/>
+          <w:i w:val="0"/>
+          <w:sz w:val="24"/>
+        </w:rPr>
+        <w:t>幂等表述：将「请求级幂等」统一改为 best-effort 请求幂等（尽力式请求幂等）/ 客户端 in-flight 防护 + 服务端请求重放处理；明确不宣称严格/原子幂等；在 DATA_MODEL / ARCHITECTURE / SECURITY / USER_FLOWS 与本报告记录残留并发竞态与 M3 通用原子方案。</w:t>
+      </w:r>
+    </w:p>
+    <w:p>
+      <w:pPr>
+        <w:pStyle w:val="ListBullet"/>
+        <w:spacing w:after="60"/>
+      </w:pPr>
+      <w:r>
+        <w:rPr>
+          <w:rFonts w:ascii="宋体" w:hAnsi="宋体" w:eastAsia="宋体"/>
+          <w:b w:val="0"/>
+          <w:i w:val="0"/>
+          <w:sz w:val="24"/>
+        </w:rPr>
+        <w:t>Git 日志复核：第 14 节改为只列真实 hash 的 10 个提交，移除「(本次)」占位；补注本报告自身提交未计入日志（因其 hash 在生成前尚不存在）。</w:t>
+      </w:r>
+    </w:p>
+    <w:p>
+      <w:pPr>
+        <w:pStyle w:val="ListBullet"/>
+        <w:spacing w:after="60"/>
+      </w:pPr>
+      <w:r>
+        <w:rPr>
+          <w:rFonts w:ascii="宋体" w:hAnsi="宋体" w:eastAsia="宋体"/>
+          <w:b w:val="0"/>
+          <w:i w:val="0"/>
+          <w:sz w:val="24"/>
+        </w:rPr>
+        <w:t>里程碑路线图：第 15 节改为约定序列 M2 食物目录与份量单位 → M3 手动记餐 → M4 历史/编辑/删除 → M5 收藏与食谱 → M6 照片 → M7 mock AI → M8 真实 AI；M2 明确排除 mealApi/餐史/食谱/照片/AI。同步更新 README 与 DEVELOPMENT_PLAN。</w:t>
+      </w:r>
+    </w:p>
+    <w:p>
+      <w:pPr>
+        <w:pStyle w:val="ListBullet"/>
+        <w:spacing w:after="60"/>
+      </w:pPr>
+      <w:r>
+        <w:rPr>
+          <w:rFonts w:ascii="宋体" w:hAnsi="宋体" w:eastAsia="宋体"/>
+          <w:b w:val="0"/>
+          <w:i w:val="0"/>
+          <w:sz w:val="24"/>
+        </w:rPr>
+        <w:t>文件计数一致性：第 3 节改为「M1 最初影响 47 个文件（31 新增/16 修改）；M1.1 追加修改 18 个；本 closeout 修改一组文档/报告文件」，并分 §3.5 / §3.6 区分三类文件。</w:t>
+      </w:r>
+    </w:p>
+    <w:p>
+      <w:pPr>
+        <w:pStyle w:val="ListBullet"/>
+        <w:spacing w:after="60"/>
+      </w:pPr>
+      <w:r>
+        <w:rPr>
+          <w:rFonts w:ascii="宋体" w:hAnsi="宋体" w:eastAsia="宋体"/>
+          <w:b w:val="0"/>
+          <w:i w:val="0"/>
+          <w:sz w:val="24"/>
+        </w:rPr>
+        <w:t>手动测试真实状态：新增 docs/MANUAL_TEST_RESULTS.md（14 项全 Pending）；第 17 节维持 DevTools / 真机为「待执行」。</w:t>
+      </w:r>
+    </w:p>
+    <w:p>
+      <w:pPr>
+        <w:spacing w:before="120" w:after="60"/>
+      </w:pPr>
+      <w:r>
+        <w:rPr>
+          <w:rFonts w:ascii="宋体" w:hAnsi="宋体" w:eastAsia="宋体"/>
+          <w:b/>
+          <w:i w:val="0"/>
+          <w:color w:val="2B5C8F"/>
+          <w:sz w:val="25"/>
+        </w:rPr>
+        <w:t>18.2 是否可合入 main</w:t>
+      </w:r>
+    </w:p>
+    <w:p>
+      <w:pPr>
+        <w:spacing w:after="120"/>
+      </w:pPr>
+      <w:r>
+        <w:rPr>
+          <w:rFonts w:ascii="宋体" w:hAnsi="宋体" w:eastAsia="宋体"/>
+          <w:b w:val="0"/>
+          <w:i w:val="0"/>
+          <w:sz w:val="24"/>
+        </w:rPr>
+        <w:t>**代码与文档已就绪，可进入产品负责人的 DevTools / 真机手动验收。** 两处设计修正（移除姓名去重、默认档案单一事实来源）均已完成并通过自动化验收（91/91），含幂等与默认 SSoT 的关键项。唯一前置为产品负责人按 docs/MANUAL_TEST_RESULTS.md 执行手动/真机冒烟——该项受环境所限无法由自动化代跑，明确标注为 Pending，不构成代码合并阻塞，但在完成前不应判定为 fully product-accepted。本任务**未将分支合入 main**，也未创建 M2 分支。</w:t>
       </w:r>
     </w:p>
     <w:sectPr>

</xml_diff>

<commit_message>
M1 closeout: doc-only cleanup (best-effort idempotency wording, real-device test table)
</commit_message>
<xml_diff>
--- a/M1-FINAL-REPORT.docx
+++ b/M1-FINAL-REPORT.docx
@@ -7762,7 +7762,7 @@
                 <w:i w:val="0"/>
                 <w:sz w:val="20"/>
               </w:rPr>
-              <w:t>客户端按钮防重（in-flight 标记）；服务端按 requestId 的 best-effort 请求幂等（尽力式请求幂等，非原子保证），正常保证同一意图不重复创建；残留并发竞态由 UI 防抖缓解</w:t>
+              <w:t>客户端按钮防重（in-flight 标记）；服务端按 requestId 的 best-effort 请求幂等（尽力式请求幂等，非原子保证），在通常的单用户操作和网络重试场景下避免重复创建；极端并发情况下仍存在残留竞态。</w:t>
             </w:r>
           </w:p>
         </w:tc>
@@ -8055,7 +8055,7 @@
           <w:i w:val="0"/>
           <w:sz w:val="24"/>
         </w:rPr>
-        <w:t>npm run validate 串联 typecheck 与 91 项检查：M0 基线 67 + M1/M1.1 共 24，0 失败。已执行（本次 M1.1 提交前）实测通过。分组如下（14a–15f 为 M1.1 新增/调整）：</w:t>
+        <w:t>npm run validate 串联 typecheck 与 91 项检查：M0 基线 67 + M1/M1.1 共 24，0 失败。已在最终 closeout 提交前重新执行并通过。分组如下（14a–15f 为 M1.1 新增/调整）：</w:t>
       </w:r>
     </w:p>
     <w:tbl>
@@ -9503,7 +9503,7 @@
           <w:i w:val="0"/>
           <w:sz w:val="24"/>
         </w:rPr>
-        <w:t>结论：跨用户隔离（9–11）、请求级幂等（14a–c）、默认档案单一事实来源（15a–f）、共享运行时打包（16a–d）全部通过，M1 + M1.1 关键验收达成。</w:t>
+        <w:t>结论：跨用户隔离（9–11）、best-effort 请求重放处理（14a–c，即尽力式请求幂等测试）、默认档案单一事实来源（15a–f）、共享运行时打包（16a–d）全部通过，M1 + M1.1 关键验收达成。</w:t>
       </w:r>
     </w:p>
     <w:p>

</xml_diff>